<commit_message>
Livro: autor, tríade inveja-vaidade-mentira e novo capítulo de abertura
Insere o nome do autor na capa e nos créditos. Substitui o par
inveja/insegurança pela tríade inveja, vaidade e mentira no Prólogo, na
Introdução e nos capítulos 2, 7, 8, 24 e 28, acrescenta o capítulo
'As três energias da sombra' antes da Introdução e novas perguntas no
roteiro de reflexão. Versão com 201 páginas.

Co-Authored-By: Claude Opus 5.5 <noreply@anthropic.com>
Claude-Session: https://claude.ai/code/session_01CFin6QWt9hsEkk2nMnJagX
</commit_message>
<xml_diff>
--- a/docs/livro/O_PLENO_EXISTENCIAL.docx
+++ b/docs/livro/O_PLENO_EXISTENCIAL.docx
@@ -58,7 +58,7 @@
           <w:sz w:val="28"/>
           <w:szCs w:val="28"/>
         </w:rPr>
-        <w:t xml:space="preserve">[Nome do Autor]</w:t>
+        <w:t xml:space="preserve">ROGÉRIO APARECIDO DA SILVA TORRES</w:t>
       </w:r>
     </w:p>
     <w:p>
@@ -129,7 +129,7 @@
           <w:sz w:val="18"/>
           <w:szCs w:val="18"/>
         </w:rPr>
-        <w:t xml:space="preserve">© 2026 [Nome do Autor]. Todos os direitos reservados.</w:t>
+        <w:t xml:space="preserve">© 2026 Rogério Aparecido da Silva Torres. Todos os direitos reservados.</w:t>
       </w:r>
     </w:p>
     <w:p>
@@ -276,7 +276,7 @@
           <w:sz w:val="20"/>
           <w:szCs w:val="20"/>
         </w:rPr>
-        <w:t xml:space="preserve">Introdução</w:t>
+        <w:t xml:space="preserve">As três energias da sombra: inveja, vaidade e mentira</w:t>
       </w:r>
       <w:r>
         <w:rPr>
@@ -286,6 +286,33 @@
         </w:rPr>
         <w:tab/>
         <w:t xml:space="preserve">6</w:t>
+      </w:r>
+    </w:p>
+    <w:p>
+      <w:pPr>
+        <w:keepNext w:val="false"/>
+        <w:tabs>
+          <w:tab w:val="right" w:pos="5670" w:leader="dot"/>
+        </w:tabs>
+        <w:spacing w:after="40" w:before="40"/>
+        <w:ind w:left="510" w:hanging="284"/>
+      </w:pPr>
+      <w:r>
+        <w:rPr>
+          <w:rFonts w:ascii="Times New Roman" w:cs="Times New Roman" w:eastAsia="Times New Roman" w:hAnsi="Times New Roman"/>
+          <w:sz w:val="20"/>
+          <w:szCs w:val="20"/>
+        </w:rPr>
+        <w:t xml:space="preserve">Introdução</w:t>
+      </w:r>
+      <w:r>
+        <w:rPr>
+          <w:rFonts w:ascii="Times New Roman" w:cs="Times New Roman" w:eastAsia="Times New Roman" w:hAnsi="Times New Roman"/>
+          <w:sz w:val="20"/>
+          <w:szCs w:val="20"/>
+        </w:rPr>
+        <w:tab/>
+        <w:t xml:space="preserve">13</w:t>
       </w:r>
     </w:p>
     <w:p>
@@ -332,7 +359,7 @@
           <w:szCs w:val="20"/>
         </w:rPr>
         <w:tab/>
-        <w:t xml:space="preserve">14</w:t>
+        <w:t xml:space="preserve">21</w:t>
       </w:r>
     </w:p>
     <w:p>
@@ -359,7 +386,7 @@
           <w:szCs w:val="20"/>
         </w:rPr>
         <w:tab/>
-        <w:t xml:space="preserve">21</w:t>
+        <w:t xml:space="preserve">28</w:t>
       </w:r>
     </w:p>
     <w:p>
@@ -386,7 +413,7 @@
           <w:szCs w:val="20"/>
         </w:rPr>
         <w:tab/>
-        <w:t xml:space="preserve">30</w:t>
+        <w:t xml:space="preserve">37</w:t>
       </w:r>
     </w:p>
     <w:p>
@@ -433,7 +460,7 @@
           <w:szCs w:val="20"/>
         </w:rPr>
         <w:tab/>
-        <w:t xml:space="preserve">40</w:t>
+        <w:t xml:space="preserve">47</w:t>
       </w:r>
     </w:p>
     <w:p>
@@ -460,7 +487,7 @@
           <w:szCs w:val="20"/>
         </w:rPr>
         <w:tab/>
-        <w:t xml:space="preserve">46</w:t>
+        <w:t xml:space="preserve">53</w:t>
       </w:r>
     </w:p>
     <w:p>
@@ -487,7 +514,7 @@
           <w:szCs w:val="20"/>
         </w:rPr>
         <w:tab/>
-        <w:t xml:space="preserve">52</w:t>
+        <w:t xml:space="preserve">59</w:t>
       </w:r>
     </w:p>
     <w:p>
@@ -514,7 +541,7 @@
           <w:szCs w:val="20"/>
         </w:rPr>
         <w:tab/>
-        <w:t xml:space="preserve">60</w:t>
+        <w:t xml:space="preserve">67</w:t>
       </w:r>
     </w:p>
     <w:p>
@@ -561,7 +588,7 @@
           <w:szCs w:val="20"/>
         </w:rPr>
         <w:tab/>
-        <w:t xml:space="preserve">68</w:t>
+        <w:t xml:space="preserve">75</w:t>
       </w:r>
     </w:p>
     <w:p>
@@ -588,7 +615,7 @@
           <w:szCs w:val="20"/>
         </w:rPr>
         <w:tab/>
-        <w:t xml:space="preserve">75</w:t>
+        <w:t xml:space="preserve">83</w:t>
       </w:r>
     </w:p>
     <w:p>
@@ -615,7 +642,7 @@
           <w:szCs w:val="20"/>
         </w:rPr>
         <w:tab/>
-        <w:t xml:space="preserve">81</w:t>
+        <w:t xml:space="preserve">89</w:t>
       </w:r>
     </w:p>
     <w:p>
@@ -642,7 +669,7 @@
           <w:szCs w:val="20"/>
         </w:rPr>
         <w:tab/>
-        <w:t xml:space="preserve">86</w:t>
+        <w:t xml:space="preserve">94</w:t>
       </w:r>
     </w:p>
     <w:p>
@@ -689,7 +716,7 @@
           <w:szCs w:val="20"/>
         </w:rPr>
         <w:tab/>
-        <w:t xml:space="preserve">92</w:t>
+        <w:t xml:space="preserve">100</w:t>
       </w:r>
     </w:p>
     <w:p>
@@ -716,7 +743,7 @@
           <w:szCs w:val="20"/>
         </w:rPr>
         <w:tab/>
-        <w:t xml:space="preserve">97</w:t>
+        <w:t xml:space="preserve">105</w:t>
       </w:r>
     </w:p>
     <w:p>
@@ -743,7 +770,7 @@
           <w:szCs w:val="20"/>
         </w:rPr>
         <w:tab/>
-        <w:t xml:space="preserve">103</w:t>
+        <w:t xml:space="preserve">111</w:t>
       </w:r>
     </w:p>
     <w:p>
@@ -770,7 +797,7 @@
           <w:szCs w:val="20"/>
         </w:rPr>
         <w:tab/>
-        <w:t xml:space="preserve">109</w:t>
+        <w:t xml:space="preserve">117</w:t>
       </w:r>
     </w:p>
     <w:p>
@@ -797,7 +824,7 @@
           <w:szCs w:val="20"/>
         </w:rPr>
         <w:tab/>
-        <w:t xml:space="preserve">114</w:t>
+        <w:t xml:space="preserve">122</w:t>
       </w:r>
     </w:p>
     <w:p>
@@ -824,7 +851,7 @@
           <w:szCs w:val="20"/>
         </w:rPr>
         <w:tab/>
-        <w:t xml:space="preserve">119</w:t>
+        <w:t xml:space="preserve">127</w:t>
       </w:r>
     </w:p>
     <w:p>
@@ -871,7 +898,7 @@
           <w:szCs w:val="20"/>
         </w:rPr>
         <w:tab/>
-        <w:t xml:space="preserve">124</w:t>
+        <w:t xml:space="preserve">132</w:t>
       </w:r>
     </w:p>
     <w:p>
@@ -898,7 +925,7 @@
           <w:szCs w:val="20"/>
         </w:rPr>
         <w:tab/>
-        <w:t xml:space="preserve">130</w:t>
+        <w:t xml:space="preserve">138</w:t>
       </w:r>
     </w:p>
     <w:p>
@@ -925,7 +952,7 @@
           <w:szCs w:val="20"/>
         </w:rPr>
         <w:tab/>
-        <w:t xml:space="preserve">134</w:t>
+        <w:t xml:space="preserve">142</w:t>
       </w:r>
     </w:p>
     <w:p>
@@ -952,7 +979,7 @@
           <w:szCs w:val="20"/>
         </w:rPr>
         <w:tab/>
-        <w:t xml:space="preserve">138</w:t>
+        <w:t xml:space="preserve">146</w:t>
       </w:r>
     </w:p>
     <w:p>
@@ -979,7 +1006,7 @@
           <w:szCs w:val="20"/>
         </w:rPr>
         <w:tab/>
-        <w:t xml:space="preserve">142</w:t>
+        <w:t xml:space="preserve">150</w:t>
       </w:r>
     </w:p>
     <w:p>
@@ -1006,7 +1033,7 @@
           <w:szCs w:val="20"/>
         </w:rPr>
         <w:tab/>
-        <w:t xml:space="preserve">146</w:t>
+        <w:t xml:space="preserve">154</w:t>
       </w:r>
     </w:p>
     <w:p>
@@ -1053,7 +1080,7 @@
           <w:szCs w:val="20"/>
         </w:rPr>
         <w:tab/>
-        <w:t xml:space="preserve">150</w:t>
+        <w:t xml:space="preserve">158</w:t>
       </w:r>
     </w:p>
     <w:p>
@@ -1080,7 +1107,7 @@
           <w:szCs w:val="20"/>
         </w:rPr>
         <w:tab/>
-        <w:t xml:space="preserve">155</w:t>
+        <w:t xml:space="preserve">163</w:t>
       </w:r>
     </w:p>
     <w:p>
@@ -1107,7 +1134,7 @@
           <w:szCs w:val="20"/>
         </w:rPr>
         <w:tab/>
-        <w:t xml:space="preserve">161</w:t>
+        <w:t xml:space="preserve">169</w:t>
       </w:r>
     </w:p>
     <w:p>
@@ -1134,7 +1161,7 @@
           <w:szCs w:val="20"/>
         </w:rPr>
         <w:tab/>
-        <w:t xml:space="preserve">164</w:t>
+        <w:t xml:space="preserve">172</w:t>
       </w:r>
     </w:p>
     <w:p>
@@ -1161,7 +1188,7 @@
           <w:szCs w:val="20"/>
         </w:rPr>
         <w:tab/>
-        <w:t xml:space="preserve">167</w:t>
+        <w:t xml:space="preserve">175</w:t>
       </w:r>
     </w:p>
     <w:p>
@@ -1188,7 +1215,7 @@
           <w:szCs w:val="20"/>
         </w:rPr>
         <w:tab/>
-        <w:t xml:space="preserve">177</w:t>
+        <w:t xml:space="preserve">187</w:t>
       </w:r>
     </w:p>
     <w:p>
@@ -1215,7 +1242,7 @@
           <w:szCs w:val="20"/>
         </w:rPr>
         <w:tab/>
-        <w:t xml:space="preserve">180</w:t>
+        <w:t xml:space="preserve">190</w:t>
       </w:r>
     </w:p>
     <w:p>
@@ -1242,7 +1269,7 @@
           <w:szCs w:val="20"/>
         </w:rPr>
         <w:tab/>
-        <w:t xml:space="preserve">182</w:t>
+        <w:t xml:space="preserve">192</w:t>
       </w:r>
     </w:p>
     <w:p>
@@ -1339,23 +1366,23 @@
           <w:sz w:val="24"/>
           <w:szCs w:val="24"/>
         </w:rPr>
-        <w:t xml:space="preserve">O ser humano sofre quando percebe que o desejo de ser especial é universal, mas a condição de ser reconhecido não é garantida. Todos querem brilhar, mas nem todos aprendem a acender a própria luz. E quando essa luz ainda não foi encontrada, surgem duas sombras perigosas: a inveja e a insegurança. Elas entram pela porta da alma como um cavalo de Tróia, fingindo proteção, mas carregando por dentro a semente do fracasso.</w:t>
-      </w:r>
-    </w:p>
-    <w:p>
-      <w:pPr>
-        <w:widowControl/>
-        <w:spacing w:after="0" w:line="330" w:lineRule="exact"/>
-        <w:ind w:firstLine="340"/>
-        <w:jc w:val="both"/>
-      </w:pPr>
-      <w:r>
-        <w:rPr>
-          <w:rFonts w:ascii="Times New Roman" w:cs="Times New Roman" w:eastAsia="Times New Roman" w:hAnsi="Times New Roman"/>
-          <w:sz w:val="24"/>
-          <w:szCs w:val="24"/>
-        </w:rPr>
-        <w:t xml:space="preserve">A inveja nos faz olhar para fora e sofrer com a grandeza do outro. A insegurança nos faz olhar para dentro e duvidar da própria capacidade. Uma corrói a admiração; a outra enfraquece a coragem. Juntas, elas roubam do ser humano a possibilidade de amadurecer pelo próprio caminho. E assim, aquilo que poderia ser força se converte em prisão.</w:t>
+        <w:t xml:space="preserve">O ser humano sofre quando percebe que o desejo de ser especial é universal, mas a condição de ser reconhecido não é garantida. Todos querem brilhar, mas nem todos aprendem a acender a própria luz. E quando essa luz ainda não foi encontrada, surgem três sombras perigosas: a inveja, a vaidade e a mentira. Elas entram pela porta da alma como um cavalo de Tróia, fingindo proteção, mas carregando por dentro a semente do fracasso.</w:t>
+      </w:r>
+    </w:p>
+    <w:p>
+      <w:pPr>
+        <w:widowControl/>
+        <w:spacing w:after="0" w:line="330" w:lineRule="exact"/>
+        <w:ind w:firstLine="340"/>
+        <w:jc w:val="both"/>
+      </w:pPr>
+      <w:r>
+        <w:rPr>
+          <w:rFonts w:ascii="Times New Roman" w:cs="Times New Roman" w:eastAsia="Times New Roman" w:hAnsi="Times New Roman"/>
+          <w:sz w:val="24"/>
+          <w:szCs w:val="24"/>
+        </w:rPr>
+        <w:t xml:space="preserve">A inveja nos faz olhar para fora e sofrer com a grandeza do outro. A vaidade nos prende diante do espelho, dependentes do brilho que o mundo nos devolve. A mentira nos ensina a esconder de todos — e, por fim, de nós mesmos — aquilo que realmente somos. Uma corrói a admiração; a outra infla a imagem; a terceira falsifica a verdade. Juntas, elas roubam do ser humano a possibilidade de amadurecer pelo próprio caminho. E assim, aquilo que poderia ser força se converte em prisão.</w:t>
       </w:r>
     </w:p>
     <w:p>
@@ -1522,6 +1549,601 @@
           <w:sz w:val="34"/>
           <w:szCs w:val="34"/>
         </w:rPr>
+        <w:t xml:space="preserve">As três energias da sombra: inveja, vaidade e mentira</w:t>
+      </w:r>
+    </w:p>
+    <w:p>
+      <w:pPr>
+        <w:widowControl/>
+        <w:spacing w:after="0" w:line="330" w:lineRule="exact"/>
+        <w:ind w:firstLine="0"/>
+        <w:jc w:val="both"/>
+      </w:pPr>
+      <w:r>
+        <w:rPr>
+          <w:rFonts w:ascii="Times New Roman" w:cs="Times New Roman" w:eastAsia="Times New Roman" w:hAnsi="Times New Roman"/>
+          <w:sz w:val="24"/>
+          <w:szCs w:val="24"/>
+        </w:rPr>
+        <w:t xml:space="preserve">Antes de iniciar a travessia proposta por este livro, é preciso apresentar três forças que acompanharão o leitor em quase todas as páginas. Elas aparecerão no bebê que tenta ser “fofinho” para garantir o colo, na criança que aprende a esconder o que deseja, no adolescente que veste um personagem no pátio da escola, no adulto que vive para ser visto e no idoso que descobre, tarde demais, que passou a vida sustentando uma imagem. São três energias que encobrem o Pleno Existencial como camadas de terra sobre um tesouro: a </w:t>
+      </w:r>
+      <w:r>
+        <w:rPr>
+          <w:rFonts w:ascii="Times New Roman" w:cs="Times New Roman" w:eastAsia="Times New Roman" w:hAnsi="Times New Roman"/>
+          <w:b/>
+          <w:bCs/>
+          <w:sz w:val="24"/>
+          <w:szCs w:val="24"/>
+        </w:rPr>
+        <w:t xml:space="preserve">inveja</w:t>
+      </w:r>
+      <w:r>
+        <w:rPr>
+          <w:rFonts w:ascii="Times New Roman" w:cs="Times New Roman" w:eastAsia="Times New Roman" w:hAnsi="Times New Roman"/>
+          <w:sz w:val="24"/>
+          <w:szCs w:val="24"/>
+        </w:rPr>
+        <w:t xml:space="preserve">, a </w:t>
+      </w:r>
+      <w:r>
+        <w:rPr>
+          <w:rFonts w:ascii="Times New Roman" w:cs="Times New Roman" w:eastAsia="Times New Roman" w:hAnsi="Times New Roman"/>
+          <w:b/>
+          <w:bCs/>
+          <w:sz w:val="24"/>
+          <w:szCs w:val="24"/>
+        </w:rPr>
+        <w:t xml:space="preserve">vaidade</w:t>
+      </w:r>
+      <w:r>
+        <w:rPr>
+          <w:rFonts w:ascii="Times New Roman" w:cs="Times New Roman" w:eastAsia="Times New Roman" w:hAnsi="Times New Roman"/>
+          <w:sz w:val="24"/>
+          <w:szCs w:val="24"/>
+        </w:rPr>
+        <w:t xml:space="preserve"> e a </w:t>
+      </w:r>
+      <w:r>
+        <w:rPr>
+          <w:rFonts w:ascii="Times New Roman" w:cs="Times New Roman" w:eastAsia="Times New Roman" w:hAnsi="Times New Roman"/>
+          <w:b/>
+          <w:bCs/>
+          <w:sz w:val="24"/>
+          <w:szCs w:val="24"/>
+        </w:rPr>
+        <w:t xml:space="preserve">mentira</w:t>
+      </w:r>
+      <w:r>
+        <w:rPr>
+          <w:rFonts w:ascii="Times New Roman" w:cs="Times New Roman" w:eastAsia="Times New Roman" w:hAnsi="Times New Roman"/>
+          <w:sz w:val="24"/>
+          <w:szCs w:val="24"/>
+        </w:rPr>
+        <w:t xml:space="preserve">.</w:t>
+      </w:r>
+    </w:p>
+    <w:p>
+      <w:pPr>
+        <w:widowControl/>
+        <w:spacing w:after="0" w:line="330" w:lineRule="exact"/>
+        <w:ind w:firstLine="340"/>
+        <w:jc w:val="both"/>
+      </w:pPr>
+      <w:r>
+        <w:rPr>
+          <w:rFonts w:ascii="Times New Roman" w:cs="Times New Roman" w:eastAsia="Times New Roman" w:hAnsi="Times New Roman"/>
+          <w:sz w:val="24"/>
+          <w:szCs w:val="24"/>
+        </w:rPr>
+        <w:t xml:space="preserve">A ordem em que aparecem não é casual. Ela expressa uma hierarquia. Primeiro vem a inveja, porque é ela que inaugura o desvio: o olhar que sai de si e se fixa, com dor, naquilo que o outro é ou possui. Depois vem a vaidade, que tenta compensar essa dor produzindo destaque, como se, brilhando mais, o sujeito pudesse calar a falta que a inveja revelou. Por fim vem a mentira, que surge para sustentar todo esse edifício, porque nem a inveja nem a vaidade suportam ser vistas como são. A inveja abre a ferida, a vaidade a disfarça e a mentira impede que ela seja tratada.</w:t>
+      </w:r>
+    </w:p>
+    <w:p>
+      <w:pPr>
+        <w:keepNext/>
+        <w:keepLines/>
+        <w:spacing w:after="160" w:before="400"/>
+      </w:pPr>
+      <w:r>
+        <w:rPr>
+          <w:rFonts w:ascii="Times New Roman" w:cs="Times New Roman" w:eastAsia="Times New Roman" w:hAnsi="Times New Roman"/>
+          <w:b/>
+          <w:bCs/>
+          <w:smallCaps/>
+          <w:sz w:val="24"/>
+          <w:szCs w:val="24"/>
+        </w:rPr>
+        <w:t xml:space="preserve">A inveja e suas duas faces</w:t>
+      </w:r>
+    </w:p>
+    <w:p>
+      <w:pPr>
+        <w:widowControl/>
+        <w:spacing w:after="0" w:line="330" w:lineRule="exact"/>
+        <w:ind w:firstLine="0"/>
+        <w:jc w:val="both"/>
+      </w:pPr>
+      <w:r>
+        <w:rPr>
+          <w:rFonts w:ascii="Times New Roman" w:cs="Times New Roman" w:eastAsia="Times New Roman" w:hAnsi="Times New Roman"/>
+          <w:sz w:val="24"/>
+          <w:szCs w:val="24"/>
+        </w:rPr>
+        <w:t xml:space="preserve">A inveja não é um sentimento único. Ela tem, pelo menos, duas faces, e é preciso conhecê-las para não se enganar com nenhuma delas.</w:t>
+      </w:r>
+    </w:p>
+    <w:p>
+      <w:pPr>
+        <w:widowControl/>
+        <w:spacing w:after="0" w:line="330" w:lineRule="exact"/>
+        <w:ind w:firstLine="340"/>
+        <w:jc w:val="both"/>
+      </w:pPr>
+      <w:r>
+        <w:rPr>
+          <w:rFonts w:ascii="Times New Roman" w:cs="Times New Roman" w:eastAsia="Times New Roman" w:hAnsi="Times New Roman"/>
+          <w:sz w:val="24"/>
+          <w:szCs w:val="24"/>
+        </w:rPr>
+        <w:t xml:space="preserve">A primeira é a inveja má, que tem um nome mais exato: </w:t>
+      </w:r>
+      <w:r>
+        <w:rPr>
+          <w:rFonts w:ascii="Times New Roman" w:cs="Times New Roman" w:eastAsia="Times New Roman" w:hAnsi="Times New Roman"/>
+          <w:b/>
+          <w:bCs/>
+          <w:sz w:val="24"/>
+          <w:szCs w:val="24"/>
+        </w:rPr>
+        <w:t xml:space="preserve">cobiça</w:t>
+      </w:r>
+      <w:r>
+        <w:rPr>
+          <w:rFonts w:ascii="Times New Roman" w:cs="Times New Roman" w:eastAsia="Times New Roman" w:hAnsi="Times New Roman"/>
+          <w:sz w:val="24"/>
+          <w:szCs w:val="24"/>
+        </w:rPr>
+        <w:t xml:space="preserve">. A cobiça é um sentimento destrutivo, porque não quer algo igual ou semelhante ao que o outro tem. Ela quer ser o outro, ou ter tudo aquilo que é do outro: o lugar, a história, as conquistas, os afetos, o reconhecimento. Não lhe basta conquistar algo parecido; ela precisa tomar. E, como raramente consegue tomar, muitas vezes desliza para o desejo de destruir. É por isso que a cobiça leva, com frequência, à aniquilação do próprio objeto de desejo. Se não pode ser meu, que não seja de ninguém. A cobiça prefere a terra arrasada a conviver com a luz que não lhe pertence.</w:t>
+      </w:r>
+    </w:p>
+    <w:p>
+      <w:pPr>
+        <w:widowControl/>
+        <w:spacing w:after="0" w:line="330" w:lineRule="exact"/>
+        <w:ind w:firstLine="340"/>
+        <w:jc w:val="both"/>
+      </w:pPr>
+      <w:r>
+        <w:rPr>
+          <w:rFonts w:ascii="Times New Roman" w:cs="Times New Roman" w:eastAsia="Times New Roman" w:hAnsi="Times New Roman"/>
+          <w:sz w:val="24"/>
+          <w:szCs w:val="24"/>
+        </w:rPr>
+        <w:t xml:space="preserve">A segunda face é a inveja chamada de “boa”, e as aspas são necessárias. Ela se disfarça de </w:t>
+      </w:r>
+      <w:r>
+        <w:rPr>
+          <w:rFonts w:ascii="Times New Roman" w:cs="Times New Roman" w:eastAsia="Times New Roman" w:hAnsi="Times New Roman"/>
+          <w:b/>
+          <w:bCs/>
+          <w:sz w:val="24"/>
+          <w:szCs w:val="24"/>
+        </w:rPr>
+        <w:t xml:space="preserve">admiração</w:t>
+      </w:r>
+      <w:r>
+        <w:rPr>
+          <w:rFonts w:ascii="Times New Roman" w:cs="Times New Roman" w:eastAsia="Times New Roman" w:hAnsi="Times New Roman"/>
+          <w:sz w:val="24"/>
+          <w:szCs w:val="24"/>
+        </w:rPr>
+        <w:t xml:space="preserve">. O sujeito não quer destruir o outro; quer estar perto dele, observá-lo, segui-lo. Mas, aos poucos, a admiração revela o seu verdadeiro movimento: copiar, imitar, reproduzir o que o ser desejado faz, como se, ao vestir os gestos do outro, fosse possível adquirir também a sua essência. É a inveja do fã que se cola ao ídolo, do discípulo que já não pensa por si, do amigo que passa a falar, vestir e desejar exatamente como aquele que admira.</w:t>
+      </w:r>
+    </w:p>
+    <w:p>
+      <w:pPr>
+        <w:widowControl/>
+        <w:spacing w:after="0" w:line="330" w:lineRule="exact"/>
+        <w:ind w:firstLine="340"/>
+        <w:jc w:val="both"/>
+      </w:pPr>
+      <w:r>
+        <w:rPr>
+          <w:rFonts w:ascii="Times New Roman" w:cs="Times New Roman" w:eastAsia="Times New Roman" w:hAnsi="Times New Roman"/>
+          <w:sz w:val="24"/>
+          <w:szCs w:val="24"/>
+        </w:rPr>
+        <w:t xml:space="preserve">Essa inveja parece inofensiva, mas no seu pior estado pode se transformar em </w:t>
+      </w:r>
+      <w:r>
+        <w:rPr>
+          <w:rFonts w:ascii="Times New Roman" w:cs="Times New Roman" w:eastAsia="Times New Roman" w:hAnsi="Times New Roman"/>
+          <w:b/>
+          <w:bCs/>
+          <w:sz w:val="24"/>
+          <w:szCs w:val="24"/>
+        </w:rPr>
+        <w:t xml:space="preserve">posse</w:t>
+      </w:r>
+      <w:r>
+        <w:rPr>
+          <w:rFonts w:ascii="Times New Roman" w:cs="Times New Roman" w:eastAsia="Times New Roman" w:hAnsi="Times New Roman"/>
+          <w:sz w:val="24"/>
+          <w:szCs w:val="24"/>
+        </w:rPr>
+        <w:t xml:space="preserve">. A proximidade, que antes bastava, passa a ser vigiada. Nasce um elevado grau de ciúme: o sujeito não suporta que o ser admirado tenha outros vínculos, outros interesses, outros admiradores. Quer exclusividade. Quer controle. E então aquilo que começou como encantamento termina como aprisionamento. A inveja “boa” e a inveja má, que pareciam opostas, encontram-se no mesmo ponto: ambas acabam tentando apropriar-se do outro.</w:t>
+      </w:r>
+    </w:p>
+    <w:p>
+      <w:pPr>
+        <w:widowControl/>
+        <w:spacing w:after="0" w:line="330" w:lineRule="exact"/>
+        <w:ind w:firstLine="340"/>
+        <w:jc w:val="both"/>
+      </w:pPr>
+      <w:r>
+        <w:rPr>
+          <w:rFonts w:ascii="Times New Roman" w:cs="Times New Roman" w:eastAsia="Times New Roman" w:hAnsi="Times New Roman"/>
+          <w:sz w:val="24"/>
+          <w:szCs w:val="24"/>
+        </w:rPr>
+        <w:t xml:space="preserve">Isso não significa que toda admiração seja inveja. A admiração verdadeira inspira, mas não imita; reconhece a luz do outro e, a partir dela, volta-se para acender a própria. A inveja disfarçada de admiração faz o caminho contrário: em vez de devolver o sujeito a si mesmo, afasta-o cada vez mais de si, até que ele já não saiba distinguir o que deseja do que apenas copiou.</w:t>
+      </w:r>
+    </w:p>
+    <w:p>
+      <w:pPr>
+        <w:keepNext/>
+        <w:keepLines/>
+        <w:spacing w:after="160" w:before="400"/>
+      </w:pPr>
+      <w:r>
+        <w:rPr>
+          <w:rFonts w:ascii="Times New Roman" w:cs="Times New Roman" w:eastAsia="Times New Roman" w:hAnsi="Times New Roman"/>
+          <w:b/>
+          <w:bCs/>
+          <w:smallCaps/>
+          <w:sz w:val="24"/>
+          <w:szCs w:val="24"/>
+        </w:rPr>
+        <w:t xml:space="preserve">A vaidade</w:t>
+      </w:r>
+    </w:p>
+    <w:p>
+      <w:pPr>
+        <w:widowControl/>
+        <w:spacing w:after="0" w:line="330" w:lineRule="exact"/>
+        <w:ind w:firstLine="0"/>
+        <w:jc w:val="both"/>
+      </w:pPr>
+      <w:r>
+        <w:rPr>
+          <w:rFonts w:ascii="Times New Roman" w:cs="Times New Roman" w:eastAsia="Times New Roman" w:hAnsi="Times New Roman"/>
+          <w:sz w:val="24"/>
+          <w:szCs w:val="24"/>
+        </w:rPr>
+        <w:t xml:space="preserve">Se a inveja nasce da falta diante do outro, a vaidade nasce da tentativa de nunca mais sentir essa falta. A vaidade é o investimento quase inesgotável em um sentimento que alimenta todo um conjunto de </w:t>
+      </w:r>
+      <w:r>
+        <w:rPr>
+          <w:rFonts w:ascii="Times New Roman" w:cs="Times New Roman" w:eastAsia="Times New Roman" w:hAnsi="Times New Roman"/>
+          <w:b/>
+          <w:bCs/>
+          <w:sz w:val="24"/>
+          <w:szCs w:val="24"/>
+        </w:rPr>
+        <w:t xml:space="preserve">autoexposição e poder</w:t>
+      </w:r>
+      <w:r>
+        <w:rPr>
+          <w:rFonts w:ascii="Times New Roman" w:cs="Times New Roman" w:eastAsia="Times New Roman" w:hAnsi="Times New Roman"/>
+          <w:sz w:val="24"/>
+          <w:szCs w:val="24"/>
+        </w:rPr>
+        <w:t xml:space="preserve">. Ela não se contenta com ser vista; precisa ser cada vez mais vista. Não se satisfaz com algum reconhecimento; exige reconhecimento crescente.</w:t>
+      </w:r>
+    </w:p>
+    <w:p>
+      <w:pPr>
+        <w:widowControl/>
+        <w:spacing w:after="0" w:line="330" w:lineRule="exact"/>
+        <w:ind w:firstLine="340"/>
+        <w:jc w:val="both"/>
+      </w:pPr>
+      <w:r>
+        <w:rPr>
+          <w:rFonts w:ascii="Times New Roman" w:cs="Times New Roman" w:eastAsia="Times New Roman" w:hAnsi="Times New Roman"/>
+          <w:sz w:val="24"/>
+          <w:szCs w:val="24"/>
+        </w:rPr>
+        <w:t xml:space="preserve">O seu mecanismo é um círculo vicioso: quanto mais me destaco, mais chamo atenção; e, ao chamar atenção, mais me destaco. Esse movimento se repete em um looping frenético e desnecessário, que consome uma quantidade enorme de energia psíquica. O vaidoso vive em estado de vitrine. Precisa ajustar a imagem, medir a repercussão, comparar o próprio brilho com o dos outros, garantir que não será esquecido. E, como nenhuma quantidade de atenção é suficiente para curar a ferida que a originou, a vaidade nunca descansa.</w:t>
+      </w:r>
+    </w:p>
+    <w:p>
+      <w:pPr>
+        <w:widowControl/>
+        <w:spacing w:after="0" w:line="330" w:lineRule="exact"/>
+        <w:ind w:firstLine="340"/>
+        <w:jc w:val="both"/>
+      </w:pPr>
+      <w:r>
+        <w:rPr>
+          <w:rFonts w:ascii="Times New Roman" w:cs="Times New Roman" w:eastAsia="Times New Roman" w:hAnsi="Times New Roman"/>
+          <w:sz w:val="24"/>
+          <w:szCs w:val="24"/>
+        </w:rPr>
+        <w:t xml:space="preserve">Hoje, esse looping encontrou um terreno ainda mais fértil nas telas e nas redes, onde cada exposição gera números e cada número pede uma nova exposição. Mas a vaidade é muito mais antiga do que qualquer tecnologia. Ela está no gesto de quem ocupa sempre o centro da conversa, de quem não suporta ser contrariado, de quem precisa vencer todas as discussões, de quem transforma até a caridade e a fé em palco.</w:t>
+      </w:r>
+    </w:p>
+    <w:p>
+      <w:pPr>
+        <w:widowControl/>
+        <w:spacing w:after="0" w:line="330" w:lineRule="exact"/>
+        <w:ind w:firstLine="340"/>
+        <w:jc w:val="both"/>
+      </w:pPr>
+      <w:r>
+        <w:rPr>
+          <w:rFonts w:ascii="Times New Roman" w:cs="Times New Roman" w:eastAsia="Times New Roman" w:hAnsi="Times New Roman"/>
+          <w:sz w:val="24"/>
+          <w:szCs w:val="24"/>
+        </w:rPr>
+        <w:t xml:space="preserve">É preciso distinguir a vaidade da autoestima saudável. A autoestima repousa em um valor interior que não depende de plateia. A vaidade, ao contrário, depende inteiramente dela. A autoestima permite que a pessoa se alegre com o próprio trabalho mesmo quando ninguém aplaude. A vaidade transforma o aplauso no próprio trabalho. Por isso, a vaidade é uma forma de cheio: um excesso de imagem que sufoca o ser.</w:t>
+      </w:r>
+    </w:p>
+    <w:p>
+      <w:pPr>
+        <w:keepNext/>
+        <w:keepLines/>
+        <w:spacing w:after="160" w:before="400"/>
+      </w:pPr>
+      <w:r>
+        <w:rPr>
+          <w:rFonts w:ascii="Times New Roman" w:cs="Times New Roman" w:eastAsia="Times New Roman" w:hAnsi="Times New Roman"/>
+          <w:b/>
+          <w:bCs/>
+          <w:smallCaps/>
+          <w:sz w:val="24"/>
+          <w:szCs w:val="24"/>
+        </w:rPr>
+        <w:t xml:space="preserve">A mentira</w:t>
+      </w:r>
+    </w:p>
+    <w:p>
+      <w:pPr>
+        <w:widowControl/>
+        <w:spacing w:after="0" w:line="330" w:lineRule="exact"/>
+        <w:ind w:firstLine="0"/>
+        <w:jc w:val="both"/>
+      </w:pPr>
+      <w:r>
+        <w:rPr>
+          <w:rFonts w:ascii="Times New Roman" w:cs="Times New Roman" w:eastAsia="Times New Roman" w:hAnsi="Times New Roman"/>
+          <w:sz w:val="24"/>
+          <w:szCs w:val="24"/>
+        </w:rPr>
+        <w:t xml:space="preserve">A terceira energia é a mais silenciosa e, talvez por isso, a mais persistente. A mentira é a energia que precisa ser </w:t>
+      </w:r>
+      <w:r>
+        <w:rPr>
+          <w:rFonts w:ascii="Times New Roman" w:cs="Times New Roman" w:eastAsia="Times New Roman" w:hAnsi="Times New Roman"/>
+          <w:b/>
+          <w:bCs/>
+          <w:sz w:val="24"/>
+          <w:szCs w:val="24"/>
+        </w:rPr>
+        <w:t xml:space="preserve">constantemente confirmada e validada</w:t>
+      </w:r>
+      <w:r>
+        <w:rPr>
+          <w:rFonts w:ascii="Times New Roman" w:cs="Times New Roman" w:eastAsia="Times New Roman" w:hAnsi="Times New Roman"/>
+          <w:sz w:val="24"/>
+          <w:szCs w:val="24"/>
+        </w:rPr>
+        <w:t xml:space="preserve"> para garantir que a verdade demore a vir à tona. Ela não se sustenta sozinha. Toda mentira exige manutenção: precisa ser lembrada, repetida, defendida, protegida por outras mentiras. Quem mente passa a viver em estado de vigilância, porque sabe que a verdade, mais cedo ou mais tarde, tende a aparecer.</w:t>
+      </w:r>
+    </w:p>
+    <w:p>
+      <w:pPr>
+        <w:widowControl/>
+        <w:spacing w:after="0" w:line="330" w:lineRule="exact"/>
+        <w:ind w:firstLine="340"/>
+        <w:jc w:val="both"/>
+      </w:pPr>
+      <w:r>
+        <w:rPr>
+          <w:rFonts w:ascii="Times New Roman" w:cs="Times New Roman" w:eastAsia="Times New Roman" w:hAnsi="Times New Roman"/>
+          <w:sz w:val="24"/>
+          <w:szCs w:val="24"/>
+        </w:rPr>
+        <w:t xml:space="preserve">Há mentiras contadas aos outros e há mentiras contadas a si mesmo. As primeiras constroem personagens diante do mundo: a pessoa que finge estar bem, finge saber, finge ter, finge sentir. As segundas são ainda mais profundas, porque constroem personagens diante da própria consciência: o sujeito que chama de amor aquilo que é medo de abandono, que chama de cuidado aquilo que é controle, que chama de admiração aquilo que é inveja, que chama de mérito aquilo que é vaidade. A mentira interior é a mais perigosa, porque impede até mesmo o primeiro passo da cura: nomear o que realmente se passa dentro de si.</w:t>
+      </w:r>
+    </w:p>
+    <w:p>
+      <w:pPr>
+        <w:widowControl/>
+        <w:spacing w:after="0" w:line="330" w:lineRule="exact"/>
+        <w:ind w:firstLine="340"/>
+        <w:jc w:val="both"/>
+      </w:pPr>
+      <w:r>
+        <w:rPr>
+          <w:rFonts w:ascii="Times New Roman" w:cs="Times New Roman" w:eastAsia="Times New Roman" w:hAnsi="Times New Roman"/>
+          <w:sz w:val="24"/>
+          <w:szCs w:val="24"/>
+        </w:rPr>
+        <w:t xml:space="preserve">A mentira não elimina a verdade; apenas a adia. E esse adiamento tem um preço. Quanto mais tempo a verdade é contida, mais energia é gasta para contê-la e maior costuma ser o desmoronamento quando ela finalmente emerge. Por isso, a mentira é uma forma de vazio disfarçado: por fora, uma estrutura bem montada; por dentro, a ausência daquilo que se pretende mostrar.</w:t>
+      </w:r>
+    </w:p>
+    <w:p>
+      <w:pPr>
+        <w:keepNext/>
+        <w:keepLines/>
+        <w:spacing w:after="160" w:before="400"/>
+      </w:pPr>
+      <w:r>
+        <w:rPr>
+          <w:rFonts w:ascii="Times New Roman" w:cs="Times New Roman" w:eastAsia="Times New Roman" w:hAnsi="Times New Roman"/>
+          <w:b/>
+          <w:bCs/>
+          <w:smallCaps/>
+          <w:sz w:val="24"/>
+          <w:szCs w:val="24"/>
+        </w:rPr>
+        <w:t xml:space="preserve">Três energias que se misturam</w:t>
+      </w:r>
+    </w:p>
+    <w:p>
+      <w:pPr>
+        <w:widowControl/>
+        <w:spacing w:after="0" w:line="330" w:lineRule="exact"/>
+        <w:ind w:firstLine="0"/>
+        <w:jc w:val="both"/>
+      </w:pPr>
+      <w:r>
+        <w:rPr>
+          <w:rFonts w:ascii="Times New Roman" w:cs="Times New Roman" w:eastAsia="Times New Roman" w:hAnsi="Times New Roman"/>
+          <w:sz w:val="24"/>
+          <w:szCs w:val="24"/>
+        </w:rPr>
+        <w:t xml:space="preserve">Inveja, vaidade e mentira quase sempre caminham juntas e se mesclam. A inveja sofre com o brilho do outro e, para não sentir essa dor, aciona a vaidade, que tenta brilhar mais. A vaidade, para manter a imagem de superioridade, precisa da mentira, que esconde as falhas e exagera as conquistas. E a mentira, por sua vez, protege a inveja, porque impede o sujeito de admitir que inveja. Forma-se, assim, um circuito fechado, em que cada energia alimenta as outras duas.</w:t>
+      </w:r>
+    </w:p>
+    <w:p>
+      <w:pPr>
+        <w:widowControl/>
+        <w:spacing w:after="0" w:line="330" w:lineRule="exact"/>
+        <w:ind w:firstLine="340"/>
+        <w:jc w:val="both"/>
+      </w:pPr>
+      <w:r>
+        <w:rPr>
+          <w:rFonts w:ascii="Times New Roman" w:cs="Times New Roman" w:eastAsia="Times New Roman" w:hAnsi="Times New Roman"/>
+          <w:sz w:val="24"/>
+          <w:szCs w:val="24"/>
+        </w:rPr>
+        <w:t xml:space="preserve">Todas as pessoas carregam algum traço dessas três energias. Ninguém está inteiramente livre de ter sentido inveja, de ter desejado ser admirado ou de ter escondido alguma verdade. O que diferencia uma pessoa da outra não é a presença ou a ausência dessas forças, mas a sua </w:t>
+      </w:r>
+      <w:r>
+        <w:rPr>
+          <w:rFonts w:ascii="Times New Roman" w:cs="Times New Roman" w:eastAsia="Times New Roman" w:hAnsi="Times New Roman"/>
+          <w:b/>
+          <w:bCs/>
+          <w:sz w:val="24"/>
+          <w:szCs w:val="24"/>
+        </w:rPr>
+        <w:t xml:space="preserve">proporção</w:t>
+      </w:r>
+      <w:r>
+        <w:rPr>
+          <w:rFonts w:ascii="Times New Roman" w:cs="Times New Roman" w:eastAsia="Times New Roman" w:hAnsi="Times New Roman"/>
+          <w:sz w:val="24"/>
+          <w:szCs w:val="24"/>
+        </w:rPr>
+        <w:t xml:space="preserve">. O grau de porcentagem que uma delas tem a mais do que as outras é o que vai determinar o grau de comprometimento psíquico que o indivíduo apresenta.</w:t>
+      </w:r>
+    </w:p>
+    <w:p>
+      <w:pPr>
+        <w:widowControl/>
+        <w:spacing w:after="0" w:line="330" w:lineRule="exact"/>
+        <w:ind w:firstLine="340"/>
+        <w:jc w:val="both"/>
+      </w:pPr>
+      <w:r>
+        <w:rPr>
+          <w:rFonts w:ascii="Times New Roman" w:cs="Times New Roman" w:eastAsia="Times New Roman" w:hAnsi="Times New Roman"/>
+          <w:sz w:val="24"/>
+          <w:szCs w:val="24"/>
+        </w:rPr>
+        <w:t xml:space="preserve">Quando a inveja predomina, a vida se organiza em torno da comparação: o sujeito mede-se o tempo todo pelos outros, ressente-se das conquistas alheias e, em seu estado mais grave, deseja a queda de quem admira. Quando a vaidade predomina, a vida se organiza em torno da exposição: o sujeito vive para a imagem, esgota-se para manter-se em evidência e desmorona quando o olhar do mundo se desvia. Quando a mentira predomina, a vida se organiza em torno do encobrimento: o sujeito torna-se duplo, vive com medo de ser descoberto e já não sabe onde termina o personagem e onde começa a pessoa.</w:t>
+      </w:r>
+    </w:p>
+    <w:p>
+      <w:pPr>
+        <w:widowControl/>
+        <w:spacing w:after="0" w:line="330" w:lineRule="exact"/>
+        <w:ind w:firstLine="340"/>
+        <w:jc w:val="both"/>
+      </w:pPr>
+      <w:r>
+        <w:rPr>
+          <w:rFonts w:ascii="Times New Roman" w:cs="Times New Roman" w:eastAsia="Times New Roman" w:hAnsi="Times New Roman"/>
+          <w:sz w:val="24"/>
+          <w:szCs w:val="24"/>
+        </w:rPr>
+        <w:t xml:space="preserve">Quando as três se elevam ao mesmo tempo, o comprometimento é ainda maior. A pessoa já não vive a partir do próprio centro, mas a partir de um sistema de defesa que consome quase toda a sua energia vital. É como se o Pleno Existencial continuasse ali, intacto em sua possibilidade, mas soterrado por três camadas espessas: a do olhar cobiçoso, a da imagem inflada e a da verdade escondida.</w:t>
+      </w:r>
+    </w:p>
+    <w:p>
+      <w:pPr>
+        <w:keepNext/>
+        <w:keepLines/>
+        <w:spacing w:after="160" w:before="400"/>
+      </w:pPr>
+      <w:r>
+        <w:rPr>
+          <w:rFonts w:ascii="Times New Roman" w:cs="Times New Roman" w:eastAsia="Times New Roman" w:hAnsi="Times New Roman"/>
+          <w:b/>
+          <w:bCs/>
+          <w:smallCaps/>
+          <w:sz w:val="24"/>
+          <w:szCs w:val="24"/>
+        </w:rPr>
+        <w:t xml:space="preserve">O caminho de volta</w:t>
+      </w:r>
+    </w:p>
+    <w:p>
+      <w:pPr>
+        <w:widowControl/>
+        <w:spacing w:after="0" w:line="330" w:lineRule="exact"/>
+        <w:ind w:firstLine="0"/>
+        <w:jc w:val="both"/>
+      </w:pPr>
+      <w:r>
+        <w:rPr>
+          <w:rFonts w:ascii="Times New Roman" w:cs="Times New Roman" w:eastAsia="Times New Roman" w:hAnsi="Times New Roman"/>
+          <w:sz w:val="24"/>
+          <w:szCs w:val="24"/>
+        </w:rPr>
+        <w:t xml:space="preserve">Se essas três energias encobrem o pleno, cada uma delas também aponta, pelo avesso, o caminho de volta. A inveja, quando reconhecida, pode ser transformada em admiração verdadeira e em gratidão pelo que é próprio: o brilho do outro deixa de ser ameaça e passa a ser sinal de que a luz é possível. A vaidade, quando reconhecida, pode ser transformada em dignidade sem plateia: a capacidade de fazer o bem e de ser quem se é mesmo quando ninguém está olhando. A mentira, quando reconhecida, pode ser transformada em verdade: não a verdade usada como arma contra os outros, mas a verdade como coerência entre o que se é, o que se sente e o que se mostra.</w:t>
+      </w:r>
+    </w:p>
+    <w:p>
+      <w:pPr>
+        <w:widowControl/>
+        <w:spacing w:after="0" w:line="330" w:lineRule="exact"/>
+        <w:ind w:firstLine="340"/>
+        <w:jc w:val="both"/>
+      </w:pPr>
+      <w:r>
+        <w:rPr>
+          <w:rFonts w:ascii="Times New Roman" w:cs="Times New Roman" w:eastAsia="Times New Roman" w:hAnsi="Times New Roman"/>
+          <w:sz w:val="24"/>
+          <w:szCs w:val="24"/>
+        </w:rPr>
+        <w:t xml:space="preserve">Nenhuma dessas transformações acontece de uma vez, e nenhuma começa sem honestidade. Por isso, a primeira tarefa de quem deseja reencontrar o Pleno Existencial é perguntar a si mesmo, com coragem: qual dessas três energias ocupa hoje o maior espaço em mim? E como ela se mistura com as outras duas? A resposta talvez doa. Mas é dela que começa a travessia que as próximas páginas pretendem acompanhar.</w:t>
+      </w:r>
+    </w:p>
+    <w:p>
+      <w:pPr>
+        <w:pageBreakBefore/>
+        <w:spacing w:after="1134"/>
+      </w:pPr>
+    </w:p>
+    <w:p>
+      <w:pPr>
+        <w:keepNext/>
+        <w:spacing w:after="720"/>
+        <w:jc w:val="center"/>
+      </w:pPr>
+      <w:r>
+        <w:rPr>
+          <w:rFonts w:ascii="Times New Roman" w:cs="Times New Roman" w:eastAsia="Times New Roman" w:hAnsi="Times New Roman"/>
+          <w:b/>
+          <w:bCs/>
+          <w:sz w:val="34"/>
+          <w:szCs w:val="34"/>
+        </w:rPr>
         <w:t xml:space="preserve">Introdução</w:t>
       </w:r>
     </w:p>
@@ -1714,23 +2336,23 @@
           <w:sz w:val="24"/>
           <w:szCs w:val="24"/>
         </w:rPr>
-        <w:t xml:space="preserve">É nesse conflito que a inveja e a insegurança aparecem como formas destrutivas de administração da falta. A inveja faz o sujeito sofrer diante da potência do outro. A insegurança faz o sujeito duvidar da própria potência. Uma o desorganiza no olhar para fora; a outra o paralisa no olhar para dentro. Ambas funcionam como cavalo de Tróia: parecem oferecer proteção ao ego, mas introduzem no interior da pessoa forças que sabotam sua maturidade.</w:t>
-      </w:r>
-    </w:p>
-    <w:p>
-      <w:pPr>
-        <w:widowControl/>
-        <w:spacing w:after="0" w:line="330" w:lineRule="exact"/>
-        <w:ind w:firstLine="340"/>
-        <w:jc w:val="both"/>
-      </w:pPr>
-      <w:r>
-        <w:rPr>
-          <w:rFonts w:ascii="Times New Roman" w:cs="Times New Roman" w:eastAsia="Times New Roman" w:hAnsi="Times New Roman"/>
-          <w:sz w:val="24"/>
-          <w:szCs w:val="24"/>
-        </w:rPr>
-        <w:t xml:space="preserve">A inveja é perigosa porque converte admiração em ressentimento. O outro, ao invés de ser sinal de possibilidade, torna-se lembrança dolorosa daquilo que o sujeito acredita não possuir. Já a insegurança corrói a confiança básica necessária para a travessia existencial. Ela faz com que a pessoa recue de si mesma, tema sua própria grandeza, hesite diante do chamado interior e se acostume a uma forma estreita de viver.</w:t>
+        <w:t xml:space="preserve">É nesse conflito que a inveja, a vaidade e a mentira aparecem como formas destrutivas de administração da falta. A inveja faz o sujeito sofrer diante da potência do outro. A vaidade o obriga a exibir uma potência que nem sempre possui. A mentira o leva a esconder a própria verdade para sustentar a imagem construída. Uma o desorganiza no olhar para fora; a outra o aprisiona diante do espelho; a terceira o divide por dentro. As três funcionam como cavalo de Tróia: parecem oferecer proteção ao ego, mas introduzem no interior da pessoa forças que sabotam sua maturidade.</w:t>
+      </w:r>
+    </w:p>
+    <w:p>
+      <w:pPr>
+        <w:widowControl/>
+        <w:spacing w:after="0" w:line="330" w:lineRule="exact"/>
+        <w:ind w:firstLine="340"/>
+        <w:jc w:val="both"/>
+      </w:pPr>
+      <w:r>
+        <w:rPr>
+          <w:rFonts w:ascii="Times New Roman" w:cs="Times New Roman" w:eastAsia="Times New Roman" w:hAnsi="Times New Roman"/>
+          <w:sz w:val="24"/>
+          <w:szCs w:val="24"/>
+        </w:rPr>
+        <w:t xml:space="preserve">A inveja é perigosa porque converte admiração em ressentimento. O outro, ao invés de ser sinal de possibilidade, torna-se lembrança dolorosa daquilo que o sujeito acredita não possuir. A vaidade é perigosa porque transforma a vida em vitrine e consome, em um ciclo que nunca se satisfaz, a energia que poderia ser usada para crescer. E a mentira é perigosa porque afasta a pessoa da única matéria a partir da qual a transformação é possível: a verdade sobre si mesma. Quando as três se combinam, o sujeito recua de si, teme a própria grandeza, hesita diante do chamado interior e se acostuma a uma forma estreita de viver.</w:t>
       </w:r>
     </w:p>
     <w:p>
@@ -2475,6 +3097,22 @@
     </w:p>
     <w:p>
       <w:pPr>
+        <w:widowControl/>
+        <w:spacing w:after="0" w:line="330" w:lineRule="exact"/>
+        <w:ind w:firstLine="340"/>
+        <w:jc w:val="both"/>
+      </w:pPr>
+      <w:r>
+        <w:rPr>
+          <w:rFonts w:ascii="Times New Roman" w:cs="Times New Roman" w:eastAsia="Times New Roman" w:hAnsi="Times New Roman"/>
+          <w:sz w:val="24"/>
+          <w:szCs w:val="24"/>
+        </w:rPr>
+        <w:t xml:space="preserve">Vale lembrar o que foi dito no início deste livro: a inveja que se disfarça de admiração, em seu pior estado, pode se transformar em posse. O fã que antes apenas imitava começa a vigiar; o ciúme se eleva, a proximidade vira exigência de exclusividade, e o encantamento se converte em aprisionamento. Assim, as duas faces da inveja, que pareciam tão distintas, acabam se tocando: uma quer destruir o outro, a outra quer possuí-lo. Em nenhuma delas o outro é visto em sua liberdade.</w:t>
+      </w:r>
+    </w:p>
+    <w:p>
+      <w:pPr>
         <w:spacing w:after="280" w:before="280" w:line="330" w:lineRule="exact"/>
         <w:ind w:left="454" w:right="454"/>
         <w:jc w:val="center"/>
@@ -2620,6 +3258,22 @@
           <w:szCs w:val="24"/>
         </w:rPr>
         <w:t xml:space="preserve">Há, portanto, uma relação íntima entre vaidade, inveja e o enfraquecimento da pulsação vital. A vaidade deseja destaque. A inveja sofre com o destaque alheio. A cobiça quer roubar o lugar do outro. Todas essas forças, quando não reconhecidas, desviam a energia que poderia ser vida para se transformar em comparação, ressentimento e autoaniquilação. Eros, que deveria reunir, acaba sequestrado pela imagem. Tânatos, que deveria ser apenas limite e passagem, torna-se fixação na própria falta.</w:t>
+      </w:r>
+    </w:p>
+    <w:p>
+      <w:pPr>
+        <w:widowControl/>
+        <w:spacing w:after="0" w:line="330" w:lineRule="exact"/>
+        <w:ind w:firstLine="340"/>
+        <w:jc w:val="both"/>
+      </w:pPr>
+      <w:r>
+        <w:rPr>
+          <w:rFonts w:ascii="Times New Roman" w:cs="Times New Roman" w:eastAsia="Times New Roman" w:hAnsi="Times New Roman"/>
+          <w:sz w:val="24"/>
+          <w:szCs w:val="24"/>
+        </w:rPr>
+        <w:t xml:space="preserve">E onde a inveja e a vaidade se instalam, a mentira logo aparece para protegê-las. Ninguém gosta de admitir que inveja, nem de reconhecer que vive para ser visto. Então o sujeito passa a contar a si mesmo histórias mais confortáveis: chama a inveja de senso de justiça, a vaidade de autoconfiança, a cobiça de ambição legítima. E, para os outros, constrói uma imagem coerente com essas histórias. Essa mentira precisa ser confirmada todos os dias, e cada confirmação consome uma parte da energia vital que poderia estar servindo a Eros. É assim que a tríade da sombra — inveja, vaidade e mentira — se fecha em um circuito que drena a pulsação da vida.</w:t>
       </w:r>
     </w:p>
     <w:p>
@@ -4869,7 +5523,7 @@
           <w:sz w:val="24"/>
           <w:szCs w:val="24"/>
         </w:rPr>
-        <w:t xml:space="preserve">Quando esse gerenciamento falha, surgem as sombras que bloqueiam o Pleno Existencial: a insegurança de quem se anula e a inveja de quem não tolera o limite. Ambas são formas de não aceitar a realidade da própria finitude. O grande segredo do desenvolvimento é compreender que o "NÃO" que recebemos no passado não precisa ser a sentença que limita o nosso potencial presente. O adulto que somos hoje pode, finalmente, dar a si mesmo o "SIM" que faltou, transformando o "NÃO" em um horizonte, e não em um muro.</w:t>
+        <w:t xml:space="preserve">Quando esse gerenciamento falha, surgem as sombras que bloqueiam o Pleno Existencial: a anulação de quem se submete e a inveja de quem não tolera o limite — e, logo em seguida, a vaidade que tenta compensar a frustração com destaque e a mentira que esconde aquilo que não se conseguiu ser. Todas são formas de não aceitar a realidade da própria finitude. O grande segredo do desenvolvimento é compreender que o "NÃO" que recebemos no passado não precisa ser a sentença que limita o nosso potencial presente. O adulto que somos hoje pode, finalmente, dar a si mesmo o "SIM" que faltou, transformando o "NÃO" em um horizonte, e não em um muro.</w:t>
       </w:r>
     </w:p>
     <w:p>
@@ -5154,6 +5808,22 @@
           <w:sz w:val="24"/>
           <w:szCs w:val="24"/>
         </w:rPr>
+        <w:t xml:space="preserve">É também na arena escolar que a tríade da sombra ganha corpo pela primeira vez de forma social. A inveja aparece diante do colega popular, do mais bonito, do mais inteligente, daquele que parece ter um lugar garantido no grupo. A vaidade aparece na necessidade de ser notado, de ter a melhor resposta, a roupa certa, a piada mais engraçada. E a mentira aparece como o cimento do personagem: inventam-se histórias, escondem-se as dificuldades de casa, finge-se não se importar com aquilo que dói. O personagem escolar é, em grande medida, a primeira mentira bem-sucedida da vida — e, justamente por dar certo, tende a ser repetida por muitos anos.</w:t>
+      </w:r>
+    </w:p>
+    <w:p>
+      <w:pPr>
+        <w:widowControl/>
+        <w:spacing w:after="0" w:line="330" w:lineRule="exact"/>
+        <w:ind w:firstLine="340"/>
+        <w:jc w:val="both"/>
+      </w:pPr>
+      <w:r>
+        <w:rPr>
+          <w:rFonts w:ascii="Times New Roman" w:cs="Times New Roman" w:eastAsia="Times New Roman" w:hAnsi="Times New Roman"/>
+          <w:sz w:val="24"/>
+          <w:szCs w:val="24"/>
+        </w:rPr>
         <w:t xml:space="preserve">A frustração, então, não é apenas uma emoção passageira. Ela vira molde da personalidade quando se repete em ambientes onde o sujeito sente que precisa provar valor para existir. O medo de rejeição faz a criança abandonar espontaneidade e explorar menos o próprio potencial. Ela começa a viver em função da reação dos outros, e não da verdade interna que ainda está tentando nascer.</w:t>
       </w:r>
     </w:p>
@@ -10262,7 +10932,7 @@
           <w:sz w:val="24"/>
           <w:szCs w:val="24"/>
         </w:rPr>
-        <w:t xml:space="preserve">Há também um amor cheio, que sufoca pelo excesso. É o amor que controla, vigia, invade, decide pelo outro, não suporta a distância nem a diferença. Ele se apresenta como intensidade, mas é, muitas vezes, uma forma de posse. O ciúme desmedido, a fusão que apaga as individualidades e a superproteção que impede o outro de crescer são expressões desse amor que transborda até afogar.</w:t>
+        <w:t xml:space="preserve">Há também um amor cheio, que sufoca pelo excesso. É o amor que controla, vigia, invade, decide pelo outro, não suporta a distância nem a diferença. Ele se apresenta como intensidade, mas é, muitas vezes, uma forma de posse. O ciúme desmedido, a fusão que apaga as individualidades e a superproteção que impede o outro de crescer são expressões desse amor que transborda até afogar. Não raro, esse amor nasce daquela inveja que se disfarçou de admiração: começa como encantamento pelo brilho do outro, passa à imitação e termina na tentativa de possuí-lo. E, para se manter, recorre à vaidade, que exige ser o centro da vida do outro, e à mentira, que esconde o controle sob o nome de cuidado.</w:t>
       </w:r>
     </w:p>
     <w:p>
@@ -11352,7 +12022,7 @@
           <w:sz w:val="24"/>
           <w:szCs w:val="24"/>
         </w:rPr>
-        <w:t xml:space="preserve">Entre os principais agentes corrosivos estão: a falta de reconhecimento nos primeiros vínculos, que faz o sujeito viver em estado de prova; a carência do apego, que transforma a fome de amor em poço sem fundo; o “NÃO” oferecido como muro, que ensina a submissão ou a guerra contra todo limite; a rejeição nos grupos, que inaugura a máscara; os valores emprestados, que produzem uma existência que não nasceu da própria consciência; a comparação, que abre a porta para a inveja e a insegurança, esses dois cavalos de Tróia da alma; e a anulação de si, que muitas vezes se disfarça de cuidado e de virtude.</w:t>
+        <w:t xml:space="preserve">Entre os principais agentes corrosivos estão: a falta de reconhecimento nos primeiros vínculos, que faz o sujeito viver em estado de prova; a carência do apego, que transforma a fome de amor em poço sem fundo; o “NÃO” oferecido como muro, que ensina a submissão ou a guerra contra todo limite; a rejeição nos grupos, que inaugura a máscara; os valores emprestados, que produzem uma existência que não nasceu da própria consciência; a comparação, que abre a porta para a tríade da sombra — a inveja, a vaidade e a mentira —, esses cavalos de Tróia da alma; e a anulação de si, que muitas vezes se disfarça de cuidado e de virtude.</w:t>
       </w:r>
     </w:p>
     <w:p>
@@ -11386,7 +12056,7 @@
           <w:sz w:val="24"/>
           <w:szCs w:val="24"/>
         </w:rPr>
-        <w:t xml:space="preserve">Os agentes de preenchimento</w:t>
+        <w:t xml:space="preserve">A tríade da sombra</w:t>
       </w:r>
     </w:p>
     <w:p>
@@ -11402,185 +12072,77 @@
           <w:sz w:val="24"/>
           <w:szCs w:val="24"/>
         </w:rPr>
-        <w:t xml:space="preserve">Se há agentes que corroem, há também agentes que preenchem. O primeiro deles é o </w:t>
-      </w:r>
-      <w:r>
-        <w:rPr>
-          <w:rFonts w:ascii="Times New Roman" w:cs="Times New Roman" w:eastAsia="Times New Roman" w:hAnsi="Times New Roman"/>
-          <w:b/>
-          <w:bCs/>
-          <w:sz w:val="24"/>
-          <w:szCs w:val="24"/>
-        </w:rPr>
-        <w:t xml:space="preserve">vínculo</w:t>
-      </w:r>
-      <w:r>
-        <w:rPr>
-          <w:rFonts w:ascii="Times New Roman" w:cs="Times New Roman" w:eastAsia="Times New Roman" w:hAnsi="Times New Roman"/>
-          <w:sz w:val="24"/>
-          <w:szCs w:val="24"/>
-        </w:rPr>
-        <w:t xml:space="preserve">: o apego seguro, esse colostro psíquico que imuniza o ser contra o desamparo, e todas as relações que, ao longo da vida, oferecem presença verdadeira. O segundo é o </w:t>
-      </w:r>
-      <w:r>
-        <w:rPr>
-          <w:rFonts w:ascii="Times New Roman" w:cs="Times New Roman" w:eastAsia="Times New Roman" w:hAnsi="Times New Roman"/>
-          <w:b/>
-          <w:bCs/>
-          <w:sz w:val="24"/>
-          <w:szCs w:val="24"/>
-        </w:rPr>
-        <w:t xml:space="preserve">limite elaborado</w:t>
-      </w:r>
-      <w:r>
-        <w:rPr>
-          <w:rFonts w:ascii="Times New Roman" w:cs="Times New Roman" w:eastAsia="Times New Roman" w:hAnsi="Times New Roman"/>
-          <w:sz w:val="24"/>
-          <w:szCs w:val="24"/>
-        </w:rPr>
-        <w:t xml:space="preserve">: o “NÃO” que se torna horizonte, a frustração que se torna aprendizado. O terceiro é o </w:t>
-      </w:r>
-      <w:r>
-        <w:rPr>
-          <w:rFonts w:ascii="Times New Roman" w:cs="Times New Roman" w:eastAsia="Times New Roman" w:hAnsi="Times New Roman"/>
-          <w:b/>
-          <w:bCs/>
-          <w:sz w:val="24"/>
-          <w:szCs w:val="24"/>
-        </w:rPr>
-        <w:t xml:space="preserve">fundamento</w:t>
-      </w:r>
-      <w:r>
-        <w:rPr>
-          <w:rFonts w:ascii="Times New Roman" w:cs="Times New Roman" w:eastAsia="Times New Roman" w:hAnsi="Times New Roman"/>
-          <w:sz w:val="24"/>
-          <w:szCs w:val="24"/>
-        </w:rPr>
-        <w:t xml:space="preserve">: a convicção interior de valor que não depende integralmente do aplauso. O quarto é o </w:t>
-      </w:r>
-      <w:r>
-        <w:rPr>
-          <w:rFonts w:ascii="Times New Roman" w:cs="Times New Roman" w:eastAsia="Times New Roman" w:hAnsi="Times New Roman"/>
-          <w:b/>
-          <w:bCs/>
-          <w:sz w:val="24"/>
-          <w:szCs w:val="24"/>
-        </w:rPr>
-        <w:t xml:space="preserve">sentido</w:t>
-      </w:r>
-      <w:r>
-        <w:rPr>
-          <w:rFonts w:ascii="Times New Roman" w:cs="Times New Roman" w:eastAsia="Times New Roman" w:hAnsi="Times New Roman"/>
-          <w:sz w:val="24"/>
-          <w:szCs w:val="24"/>
-        </w:rPr>
-        <w:t xml:space="preserve">: a capacidade de encontrar na própria história, inclusive na dor, uma direção. O quinto é a </w:t>
-      </w:r>
-      <w:r>
-        <w:rPr>
-          <w:rFonts w:ascii="Times New Roman" w:cs="Times New Roman" w:eastAsia="Times New Roman" w:hAnsi="Times New Roman"/>
-          <w:b/>
-          <w:bCs/>
-          <w:sz w:val="24"/>
-          <w:szCs w:val="24"/>
-        </w:rPr>
-        <w:t xml:space="preserve">autoria</w:t>
-      </w:r>
-      <w:r>
-        <w:rPr>
-          <w:rFonts w:ascii="Times New Roman" w:cs="Times New Roman" w:eastAsia="Times New Roman" w:hAnsi="Times New Roman"/>
-          <w:sz w:val="24"/>
-          <w:szCs w:val="24"/>
-        </w:rPr>
-        <w:t xml:space="preserve">: a decisão de responder ao que foi vivido em vez de apenas repeti-lo. O sexto é o </w:t>
-      </w:r>
-      <w:r>
-        <w:rPr>
-          <w:rFonts w:ascii="Times New Roman" w:cs="Times New Roman" w:eastAsia="Times New Roman" w:hAnsi="Times New Roman"/>
-          <w:b/>
-          <w:bCs/>
-          <w:sz w:val="24"/>
-          <w:szCs w:val="24"/>
-        </w:rPr>
-        <w:t xml:space="preserve">amor</w:t>
-      </w:r>
-      <w:r>
-        <w:rPr>
-          <w:rFonts w:ascii="Times New Roman" w:cs="Times New Roman" w:eastAsia="Times New Roman" w:hAnsi="Times New Roman"/>
-          <w:sz w:val="24"/>
-          <w:szCs w:val="24"/>
-        </w:rPr>
-        <w:t xml:space="preserve"> em suas formas mais maduras, incluindo a abertura ao amor que excede o humano. E há ainda o cuidado com o </w:t>
-      </w:r>
-      <w:r>
-        <w:rPr>
-          <w:rFonts w:ascii="Times New Roman" w:cs="Times New Roman" w:eastAsia="Times New Roman" w:hAnsi="Times New Roman"/>
-          <w:b/>
-          <w:bCs/>
-          <w:sz w:val="24"/>
-          <w:szCs w:val="24"/>
-        </w:rPr>
-        <w:t xml:space="preserve">corpo</w:t>
-      </w:r>
-      <w:r>
-        <w:rPr>
-          <w:rFonts w:ascii="Times New Roman" w:cs="Times New Roman" w:eastAsia="Times New Roman" w:hAnsi="Times New Roman"/>
-          <w:sz w:val="24"/>
-          <w:szCs w:val="24"/>
-        </w:rPr>
-        <w:t xml:space="preserve">, o </w:t>
-      </w:r>
-      <w:r>
-        <w:rPr>
-          <w:rFonts w:ascii="Times New Roman" w:cs="Times New Roman" w:eastAsia="Times New Roman" w:hAnsi="Times New Roman"/>
-          <w:b/>
-          <w:bCs/>
-          <w:sz w:val="24"/>
-          <w:szCs w:val="24"/>
-        </w:rPr>
-        <w:t xml:space="preserve">descanso</w:t>
-      </w:r>
-      <w:r>
-        <w:rPr>
-          <w:rFonts w:ascii="Times New Roman" w:cs="Times New Roman" w:eastAsia="Times New Roman" w:hAnsi="Times New Roman"/>
-          <w:sz w:val="24"/>
-          <w:szCs w:val="24"/>
-        </w:rPr>
-        <w:t xml:space="preserve"> e o </w:t>
-      </w:r>
-      <w:r>
-        <w:rPr>
-          <w:rFonts w:ascii="Times New Roman" w:cs="Times New Roman" w:eastAsia="Times New Roman" w:hAnsi="Times New Roman"/>
-          <w:b/>
-          <w:bCs/>
-          <w:sz w:val="24"/>
-          <w:szCs w:val="24"/>
-        </w:rPr>
-        <w:t xml:space="preserve">silêncio</w:t>
-      </w:r>
-      <w:r>
-        <w:rPr>
-          <w:rFonts w:ascii="Times New Roman" w:cs="Times New Roman" w:eastAsia="Times New Roman" w:hAnsi="Times New Roman"/>
-          <w:sz w:val="24"/>
-          <w:szCs w:val="24"/>
-        </w:rPr>
-        <w:t xml:space="preserve">, sem os quais nenhuma plenitude se sustenta.</w:t>
-      </w:r>
-    </w:p>
-    <w:p>
-      <w:pPr>
-        <w:widowControl/>
-        <w:spacing w:after="0" w:line="330" w:lineRule="exact"/>
-        <w:ind w:firstLine="340"/>
-        <w:jc w:val="both"/>
-      </w:pPr>
-      <w:r>
-        <w:rPr>
-          <w:rFonts w:ascii="Times New Roman" w:cs="Times New Roman" w:eastAsia="Times New Roman" w:hAnsi="Times New Roman"/>
-          <w:sz w:val="24"/>
-          <w:szCs w:val="24"/>
-        </w:rPr>
-        <w:t xml:space="preserve">Os agentes de preenchimento não apagam o passado. Eles o reorganizam. Uma pessoa que recebeu pouco apego na infância pode encontrar, mais tarde, vínculos que ofereçam parte do que faltou. Uma pessoa que foi humilhada pode, um dia, ser vista com respeito. Uma pessoa que viveu sem sentido pode descobrir uma causa, uma fé ou uma vocação. O pleno não exige uma origem perfeita; exige que a vida encontre alimento suficiente para continuar crescendo.</w:t>
+        <w:t xml:space="preserve">Entre todos os agentes corrosivos, a TPE dá destaque a três energias que quase sempre atuam juntas e que foram apresentadas antes da Introdução: a inveja, a vaidade e a mentira. Elas obedecem a uma hierarquia. A </w:t>
+      </w:r>
+      <w:r>
+        <w:rPr>
+          <w:rFonts w:ascii="Times New Roman" w:cs="Times New Roman" w:eastAsia="Times New Roman" w:hAnsi="Times New Roman"/>
+          <w:b/>
+          <w:bCs/>
+          <w:sz w:val="24"/>
+          <w:szCs w:val="24"/>
+        </w:rPr>
+        <w:t xml:space="preserve">inveja</w:t>
+      </w:r>
+      <w:r>
+        <w:rPr>
+          <w:rFonts w:ascii="Times New Roman" w:cs="Times New Roman" w:eastAsia="Times New Roman" w:hAnsi="Times New Roman"/>
+          <w:sz w:val="24"/>
+          <w:szCs w:val="24"/>
+        </w:rPr>
+        <w:t xml:space="preserve"> inaugura o desvio, seja como cobiça, que deseja ser ou ter tudo o que é do outro e pode levar à aniquilação do objeto de desejo, seja como inveja disfarçada de admiração, que copia, imita e, em seu pior estado, se transforma em posse movida pelo ciúme. A </w:t>
+      </w:r>
+      <w:r>
+        <w:rPr>
+          <w:rFonts w:ascii="Times New Roman" w:cs="Times New Roman" w:eastAsia="Times New Roman" w:hAnsi="Times New Roman"/>
+          <w:b/>
+          <w:bCs/>
+          <w:sz w:val="24"/>
+          <w:szCs w:val="24"/>
+        </w:rPr>
+        <w:t xml:space="preserve">vaidade</w:t>
+      </w:r>
+      <w:r>
+        <w:rPr>
+          <w:rFonts w:ascii="Times New Roman" w:cs="Times New Roman" w:eastAsia="Times New Roman" w:hAnsi="Times New Roman"/>
+          <w:sz w:val="24"/>
+          <w:szCs w:val="24"/>
+        </w:rPr>
+        <w:t xml:space="preserve"> tenta compensar a falta com um investimento quase inesgotável em autoexposição e poder, em um looping em que quanto mais o sujeito se destaca, mais chama atenção, e quanto mais chama atenção, mais precisa se destacar. A </w:t>
+      </w:r>
+      <w:r>
+        <w:rPr>
+          <w:rFonts w:ascii="Times New Roman" w:cs="Times New Roman" w:eastAsia="Times New Roman" w:hAnsi="Times New Roman"/>
+          <w:b/>
+          <w:bCs/>
+          <w:sz w:val="24"/>
+          <w:szCs w:val="24"/>
+        </w:rPr>
+        <w:t xml:space="preserve">mentira</w:t>
+      </w:r>
+      <w:r>
+        <w:rPr>
+          <w:rFonts w:ascii="Times New Roman" w:cs="Times New Roman" w:eastAsia="Times New Roman" w:hAnsi="Times New Roman"/>
+          <w:sz w:val="24"/>
+          <w:szCs w:val="24"/>
+        </w:rPr>
+        <w:t xml:space="preserve"> sustenta o conjunto, como uma energia que precisa ser constantemente confirmada e validada para que a verdade demore a vir à tona.</w:t>
+      </w:r>
+    </w:p>
+    <w:p>
+      <w:pPr>
+        <w:widowControl/>
+        <w:spacing w:after="0" w:line="330" w:lineRule="exact"/>
+        <w:ind w:firstLine="340"/>
+        <w:jc w:val="both"/>
+      </w:pPr>
+      <w:r>
+        <w:rPr>
+          <w:rFonts w:ascii="Times New Roman" w:cs="Times New Roman" w:eastAsia="Times New Roman" w:hAnsi="Times New Roman"/>
+          <w:sz w:val="24"/>
+          <w:szCs w:val="24"/>
+        </w:rPr>
+        <w:t xml:space="preserve">Essas três energias se mesclam em proporções diferentes em cada pessoa. A TPE afirma que o grau de porcentagem que uma delas tem a mais do que as outras é o que determina o grau de comprometimento psíquico do indivíduo. Quanto mais elevadas e entrelaçadas, maior é a camada que encobre o Pleno Existencial e maior a energia vital desviada para a comparação, a exibição e o encobrimento. Por isso, reconhecer a própria tríade — qual energia predomina, como se combina com as outras e em que situações se intensifica — é um dos primeiros gestos do caminho do reencontro.</w:t>
       </w:r>
     </w:p>
     <w:p>
@@ -11598,7 +12160,7 @@
           <w:sz w:val="24"/>
           <w:szCs w:val="24"/>
         </w:rPr>
-        <w:t xml:space="preserve">A travessia das fases</w:t>
+        <w:t xml:space="preserve">Os agentes de preenchimento</w:t>
       </w:r>
     </w:p>
     <w:p>
@@ -11614,237 +12176,185 @@
           <w:sz w:val="24"/>
           <w:szCs w:val="24"/>
         </w:rPr>
-        <w:t xml:space="preserve">A TPE lê a existência como uma travessia em que cada fase oferece uma ferida típica e uma conquista possível. Na </w:t>
-      </w:r>
-      <w:r>
-        <w:rPr>
-          <w:rFonts w:ascii="Times New Roman" w:cs="Times New Roman" w:eastAsia="Times New Roman" w:hAnsi="Times New Roman"/>
-          <w:b/>
-          <w:bCs/>
-          <w:sz w:val="24"/>
-          <w:szCs w:val="24"/>
-        </w:rPr>
-        <w:t xml:space="preserve">gestação</w:t>
-      </w:r>
-      <w:r>
-        <w:rPr>
-          <w:rFonts w:ascii="Times New Roman" w:cs="Times New Roman" w:eastAsia="Times New Roman" w:hAnsi="Times New Roman"/>
-          <w:sz w:val="24"/>
-          <w:szCs w:val="24"/>
-        </w:rPr>
-        <w:t xml:space="preserve">, a plenitude é recebida; a ferida é a perda do paraíso; a conquista possível é transformar a saudade da inteireza em desejo de construí-la. No </w:t>
-      </w:r>
-      <w:r>
-        <w:rPr>
-          <w:rFonts w:ascii="Times New Roman" w:cs="Times New Roman" w:eastAsia="Times New Roman" w:hAnsi="Times New Roman"/>
-          <w:b/>
-          <w:bCs/>
-          <w:sz w:val="24"/>
-          <w:szCs w:val="24"/>
-        </w:rPr>
-        <w:t xml:space="preserve">nascimento</w:t>
-      </w:r>
-      <w:r>
-        <w:rPr>
-          <w:rFonts w:ascii="Times New Roman" w:cs="Times New Roman" w:eastAsia="Times New Roman" w:hAnsi="Times New Roman"/>
-          <w:sz w:val="24"/>
-          <w:szCs w:val="24"/>
-        </w:rPr>
-        <w:t xml:space="preserve">, a ruptura inaugura a vida; a ferida é o desamparo; a conquista é descobrir que, depois da dor, pode haver colo.</w:t>
-      </w:r>
-    </w:p>
-    <w:p>
-      <w:pPr>
-        <w:widowControl/>
-        <w:spacing w:after="0" w:line="330" w:lineRule="exact"/>
-        <w:ind w:firstLine="340"/>
-        <w:jc w:val="both"/>
-      </w:pPr>
-      <w:r>
-        <w:rPr>
-          <w:rFonts w:ascii="Times New Roman" w:cs="Times New Roman" w:eastAsia="Times New Roman" w:hAnsi="Times New Roman"/>
-          <w:sz w:val="24"/>
-          <w:szCs w:val="24"/>
-        </w:rPr>
-        <w:t xml:space="preserve">No </w:t>
-      </w:r>
-      <w:r>
-        <w:rPr>
-          <w:rFonts w:ascii="Times New Roman" w:cs="Times New Roman" w:eastAsia="Times New Roman" w:hAnsi="Times New Roman"/>
-          <w:b/>
-          <w:bCs/>
-          <w:sz w:val="24"/>
-          <w:szCs w:val="24"/>
-        </w:rPr>
-        <w:t xml:space="preserve">apego</w:t>
-      </w:r>
-      <w:r>
-        <w:rPr>
-          <w:rFonts w:ascii="Times New Roman" w:cs="Times New Roman" w:eastAsia="Times New Roman" w:hAnsi="Times New Roman"/>
-          <w:sz w:val="24"/>
-          <w:szCs w:val="24"/>
-        </w:rPr>
-        <w:t xml:space="preserve">, a ferida é a carência; a conquista é a confiança e a capacidade de troca. No encontro com o </w:t>
-      </w:r>
-      <w:r>
-        <w:rPr>
-          <w:rFonts w:ascii="Times New Roman" w:cs="Times New Roman" w:eastAsia="Times New Roman" w:hAnsi="Times New Roman"/>
-          <w:b/>
-          <w:bCs/>
-          <w:sz w:val="24"/>
-          <w:szCs w:val="24"/>
-        </w:rPr>
-        <w:t xml:space="preserve">“NÃO”</w:t>
-      </w:r>
-      <w:r>
-        <w:rPr>
-          <w:rFonts w:ascii="Times New Roman" w:cs="Times New Roman" w:eastAsia="Times New Roman" w:hAnsi="Times New Roman"/>
-          <w:sz w:val="24"/>
-          <w:szCs w:val="24"/>
-        </w:rPr>
-        <w:t xml:space="preserve">, a ferida é a humilhação do desejo; a conquista é o limite que dá forma à potência. Na </w:t>
-      </w:r>
-      <w:r>
-        <w:rPr>
-          <w:rFonts w:ascii="Times New Roman" w:cs="Times New Roman" w:eastAsia="Times New Roman" w:hAnsi="Times New Roman"/>
-          <w:b/>
-          <w:bCs/>
-          <w:sz w:val="24"/>
-          <w:szCs w:val="24"/>
-        </w:rPr>
-        <w:t xml:space="preserve">arena escolar e social</w:t>
-      </w:r>
-      <w:r>
-        <w:rPr>
-          <w:rFonts w:ascii="Times New Roman" w:cs="Times New Roman" w:eastAsia="Times New Roman" w:hAnsi="Times New Roman"/>
-          <w:sz w:val="24"/>
-          <w:szCs w:val="24"/>
-        </w:rPr>
-        <w:t xml:space="preserve">, a ferida é a rejeição; a conquista é pertencer sem se vender. Na </w:t>
-      </w:r>
-      <w:r>
-        <w:rPr>
-          <w:rFonts w:ascii="Times New Roman" w:cs="Times New Roman" w:eastAsia="Times New Roman" w:hAnsi="Times New Roman"/>
-          <w:b/>
-          <w:bCs/>
-          <w:sz w:val="24"/>
-          <w:szCs w:val="24"/>
-        </w:rPr>
-        <w:t xml:space="preserve">crise de identidade</w:t>
-      </w:r>
-      <w:r>
-        <w:rPr>
-          <w:rFonts w:ascii="Times New Roman" w:cs="Times New Roman" w:eastAsia="Times New Roman" w:hAnsi="Times New Roman"/>
-          <w:sz w:val="24"/>
-          <w:szCs w:val="24"/>
-        </w:rPr>
-        <w:t xml:space="preserve">, a ferida é a confusão; a conquista é um eixo próprio.</w:t>
-      </w:r>
-    </w:p>
-    <w:p>
-      <w:pPr>
-        <w:widowControl/>
-        <w:spacing w:after="0" w:line="330" w:lineRule="exact"/>
-        <w:ind w:firstLine="340"/>
-        <w:jc w:val="both"/>
-      </w:pPr>
-      <w:r>
-        <w:rPr>
-          <w:rFonts w:ascii="Times New Roman" w:cs="Times New Roman" w:eastAsia="Times New Roman" w:hAnsi="Times New Roman"/>
-          <w:sz w:val="24"/>
-          <w:szCs w:val="24"/>
-        </w:rPr>
-        <w:t xml:space="preserve">Na </w:t>
-      </w:r>
-      <w:r>
-        <w:rPr>
-          <w:rFonts w:ascii="Times New Roman" w:cs="Times New Roman" w:eastAsia="Times New Roman" w:hAnsi="Times New Roman"/>
-          <w:b/>
-          <w:bCs/>
-          <w:sz w:val="24"/>
-          <w:szCs w:val="24"/>
-        </w:rPr>
-        <w:t xml:space="preserve">vida adulta</w:t>
-      </w:r>
-      <w:r>
-        <w:rPr>
-          <w:rFonts w:ascii="Times New Roman" w:cs="Times New Roman" w:eastAsia="Times New Roman" w:hAnsi="Times New Roman"/>
-          <w:sz w:val="24"/>
-          <w:szCs w:val="24"/>
-        </w:rPr>
-        <w:t xml:space="preserve">, a ferida é a paralisia diante da perda; a conquista é a autoria. No </w:t>
-      </w:r>
-      <w:r>
-        <w:rPr>
-          <w:rFonts w:ascii="Times New Roman" w:cs="Times New Roman" w:eastAsia="Times New Roman" w:hAnsi="Times New Roman"/>
-          <w:b/>
-          <w:bCs/>
-          <w:sz w:val="24"/>
-          <w:szCs w:val="24"/>
-        </w:rPr>
-        <w:t xml:space="preserve">trabalho e na vida social</w:t>
-      </w:r>
-      <w:r>
-        <w:rPr>
-          <w:rFonts w:ascii="Times New Roman" w:cs="Times New Roman" w:eastAsia="Times New Roman" w:hAnsi="Times New Roman"/>
-          <w:sz w:val="24"/>
-          <w:szCs w:val="24"/>
-        </w:rPr>
-        <w:t xml:space="preserve">, a ferida é a fragmentação; a conquista é a distribuição sábia da própria energia. Na </w:t>
-      </w:r>
-      <w:r>
-        <w:rPr>
-          <w:rFonts w:ascii="Times New Roman" w:cs="Times New Roman" w:eastAsia="Times New Roman" w:hAnsi="Times New Roman"/>
-          <w:b/>
-          <w:bCs/>
-          <w:sz w:val="24"/>
-          <w:szCs w:val="24"/>
-        </w:rPr>
-        <w:t xml:space="preserve">transformação</w:t>
-      </w:r>
-      <w:r>
-        <w:rPr>
-          <w:rFonts w:ascii="Times New Roman" w:cs="Times New Roman" w:eastAsia="Times New Roman" w:hAnsi="Times New Roman"/>
-          <w:sz w:val="24"/>
-          <w:szCs w:val="24"/>
-        </w:rPr>
-        <w:t xml:space="preserve">, a ferida é o medo do casulo; a conquista é a metamorfose. Na </w:t>
-      </w:r>
-      <w:r>
-        <w:rPr>
-          <w:rFonts w:ascii="Times New Roman" w:cs="Times New Roman" w:eastAsia="Times New Roman" w:hAnsi="Times New Roman"/>
-          <w:b/>
-          <w:bCs/>
-          <w:sz w:val="24"/>
-          <w:szCs w:val="24"/>
-        </w:rPr>
-        <w:t xml:space="preserve">velhice</w:t>
-      </w:r>
-      <w:r>
-        <w:rPr>
-          <w:rFonts w:ascii="Times New Roman" w:cs="Times New Roman" w:eastAsia="Times New Roman" w:hAnsi="Times New Roman"/>
-          <w:sz w:val="24"/>
-          <w:szCs w:val="24"/>
-        </w:rPr>
-        <w:t xml:space="preserve">, a ferida é o abandono; a conquista é a sabedoria e o legado. No </w:t>
-      </w:r>
-      <w:r>
-        <w:rPr>
-          <w:rFonts w:ascii="Times New Roman" w:cs="Times New Roman" w:eastAsia="Times New Roman" w:hAnsi="Times New Roman"/>
-          <w:b/>
-          <w:bCs/>
-          <w:sz w:val="24"/>
-          <w:szCs w:val="24"/>
-        </w:rPr>
-        <w:t xml:space="preserve">fim</w:t>
-      </w:r>
-      <w:r>
-        <w:rPr>
-          <w:rFonts w:ascii="Times New Roman" w:cs="Times New Roman" w:eastAsia="Times New Roman" w:hAnsi="Times New Roman"/>
-          <w:sz w:val="24"/>
-          <w:szCs w:val="24"/>
-        </w:rPr>
-        <w:t xml:space="preserve">, a ferida é o medo do silêncio; a conquista é a paz de quem viveu com verdade.</w:t>
+        <w:t xml:space="preserve">Se há agentes que corroem, há também agentes que preenchem. O primeiro deles é o </w:t>
+      </w:r>
+      <w:r>
+        <w:rPr>
+          <w:rFonts w:ascii="Times New Roman" w:cs="Times New Roman" w:eastAsia="Times New Roman" w:hAnsi="Times New Roman"/>
+          <w:b/>
+          <w:bCs/>
+          <w:sz w:val="24"/>
+          <w:szCs w:val="24"/>
+        </w:rPr>
+        <w:t xml:space="preserve">vínculo</w:t>
+      </w:r>
+      <w:r>
+        <w:rPr>
+          <w:rFonts w:ascii="Times New Roman" w:cs="Times New Roman" w:eastAsia="Times New Roman" w:hAnsi="Times New Roman"/>
+          <w:sz w:val="24"/>
+          <w:szCs w:val="24"/>
+        </w:rPr>
+        <w:t xml:space="preserve">: o apego seguro, esse colostro psíquico que imuniza o ser contra o desamparo, e todas as relações que, ao longo da vida, oferecem presença verdadeira. O segundo é o </w:t>
+      </w:r>
+      <w:r>
+        <w:rPr>
+          <w:rFonts w:ascii="Times New Roman" w:cs="Times New Roman" w:eastAsia="Times New Roman" w:hAnsi="Times New Roman"/>
+          <w:b/>
+          <w:bCs/>
+          <w:sz w:val="24"/>
+          <w:szCs w:val="24"/>
+        </w:rPr>
+        <w:t xml:space="preserve">limite elaborado</w:t>
+      </w:r>
+      <w:r>
+        <w:rPr>
+          <w:rFonts w:ascii="Times New Roman" w:cs="Times New Roman" w:eastAsia="Times New Roman" w:hAnsi="Times New Roman"/>
+          <w:sz w:val="24"/>
+          <w:szCs w:val="24"/>
+        </w:rPr>
+        <w:t xml:space="preserve">: o “NÃO” que se torna horizonte, a frustração que se torna aprendizado. O terceiro é o </w:t>
+      </w:r>
+      <w:r>
+        <w:rPr>
+          <w:rFonts w:ascii="Times New Roman" w:cs="Times New Roman" w:eastAsia="Times New Roman" w:hAnsi="Times New Roman"/>
+          <w:b/>
+          <w:bCs/>
+          <w:sz w:val="24"/>
+          <w:szCs w:val="24"/>
+        </w:rPr>
+        <w:t xml:space="preserve">fundamento</w:t>
+      </w:r>
+      <w:r>
+        <w:rPr>
+          <w:rFonts w:ascii="Times New Roman" w:cs="Times New Roman" w:eastAsia="Times New Roman" w:hAnsi="Times New Roman"/>
+          <w:sz w:val="24"/>
+          <w:szCs w:val="24"/>
+        </w:rPr>
+        <w:t xml:space="preserve">: a convicção interior de valor que não depende integralmente do aplauso. O quarto é o </w:t>
+      </w:r>
+      <w:r>
+        <w:rPr>
+          <w:rFonts w:ascii="Times New Roman" w:cs="Times New Roman" w:eastAsia="Times New Roman" w:hAnsi="Times New Roman"/>
+          <w:b/>
+          <w:bCs/>
+          <w:sz w:val="24"/>
+          <w:szCs w:val="24"/>
+        </w:rPr>
+        <w:t xml:space="preserve">sentido</w:t>
+      </w:r>
+      <w:r>
+        <w:rPr>
+          <w:rFonts w:ascii="Times New Roman" w:cs="Times New Roman" w:eastAsia="Times New Roman" w:hAnsi="Times New Roman"/>
+          <w:sz w:val="24"/>
+          <w:szCs w:val="24"/>
+        </w:rPr>
+        <w:t xml:space="preserve">: a capacidade de encontrar na própria história, inclusive na dor, uma direção. O quinto é a </w:t>
+      </w:r>
+      <w:r>
+        <w:rPr>
+          <w:rFonts w:ascii="Times New Roman" w:cs="Times New Roman" w:eastAsia="Times New Roman" w:hAnsi="Times New Roman"/>
+          <w:b/>
+          <w:bCs/>
+          <w:sz w:val="24"/>
+          <w:szCs w:val="24"/>
+        </w:rPr>
+        <w:t xml:space="preserve">autoria</w:t>
+      </w:r>
+      <w:r>
+        <w:rPr>
+          <w:rFonts w:ascii="Times New Roman" w:cs="Times New Roman" w:eastAsia="Times New Roman" w:hAnsi="Times New Roman"/>
+          <w:sz w:val="24"/>
+          <w:szCs w:val="24"/>
+        </w:rPr>
+        <w:t xml:space="preserve">: a decisão de responder ao que foi vivido em vez de apenas repeti-lo. O sexto é o </w:t>
+      </w:r>
+      <w:r>
+        <w:rPr>
+          <w:rFonts w:ascii="Times New Roman" w:cs="Times New Roman" w:eastAsia="Times New Roman" w:hAnsi="Times New Roman"/>
+          <w:b/>
+          <w:bCs/>
+          <w:sz w:val="24"/>
+          <w:szCs w:val="24"/>
+        </w:rPr>
+        <w:t xml:space="preserve">amor</w:t>
+      </w:r>
+      <w:r>
+        <w:rPr>
+          <w:rFonts w:ascii="Times New Roman" w:cs="Times New Roman" w:eastAsia="Times New Roman" w:hAnsi="Times New Roman"/>
+          <w:sz w:val="24"/>
+          <w:szCs w:val="24"/>
+        </w:rPr>
+        <w:t xml:space="preserve"> em suas formas mais maduras, incluindo a abertura ao amor que excede o humano. E há ainda o cuidado com o </w:t>
+      </w:r>
+      <w:r>
+        <w:rPr>
+          <w:rFonts w:ascii="Times New Roman" w:cs="Times New Roman" w:eastAsia="Times New Roman" w:hAnsi="Times New Roman"/>
+          <w:b/>
+          <w:bCs/>
+          <w:sz w:val="24"/>
+          <w:szCs w:val="24"/>
+        </w:rPr>
+        <w:t xml:space="preserve">corpo</w:t>
+      </w:r>
+      <w:r>
+        <w:rPr>
+          <w:rFonts w:ascii="Times New Roman" w:cs="Times New Roman" w:eastAsia="Times New Roman" w:hAnsi="Times New Roman"/>
+          <w:sz w:val="24"/>
+          <w:szCs w:val="24"/>
+        </w:rPr>
+        <w:t xml:space="preserve">, o </w:t>
+      </w:r>
+      <w:r>
+        <w:rPr>
+          <w:rFonts w:ascii="Times New Roman" w:cs="Times New Roman" w:eastAsia="Times New Roman" w:hAnsi="Times New Roman"/>
+          <w:b/>
+          <w:bCs/>
+          <w:sz w:val="24"/>
+          <w:szCs w:val="24"/>
+        </w:rPr>
+        <w:t xml:space="preserve">descanso</w:t>
+      </w:r>
+      <w:r>
+        <w:rPr>
+          <w:rFonts w:ascii="Times New Roman" w:cs="Times New Roman" w:eastAsia="Times New Roman" w:hAnsi="Times New Roman"/>
+          <w:sz w:val="24"/>
+          <w:szCs w:val="24"/>
+        </w:rPr>
+        <w:t xml:space="preserve"> e o </w:t>
+      </w:r>
+      <w:r>
+        <w:rPr>
+          <w:rFonts w:ascii="Times New Roman" w:cs="Times New Roman" w:eastAsia="Times New Roman" w:hAnsi="Times New Roman"/>
+          <w:b/>
+          <w:bCs/>
+          <w:sz w:val="24"/>
+          <w:szCs w:val="24"/>
+        </w:rPr>
+        <w:t xml:space="preserve">silêncio</w:t>
+      </w:r>
+      <w:r>
+        <w:rPr>
+          <w:rFonts w:ascii="Times New Roman" w:cs="Times New Roman" w:eastAsia="Times New Roman" w:hAnsi="Times New Roman"/>
+          <w:sz w:val="24"/>
+          <w:szCs w:val="24"/>
+        </w:rPr>
+        <w:t xml:space="preserve">, sem os quais nenhuma plenitude se sustenta.</w:t>
+      </w:r>
+    </w:p>
+    <w:p>
+      <w:pPr>
+        <w:widowControl/>
+        <w:spacing w:after="0" w:line="330" w:lineRule="exact"/>
+        <w:ind w:firstLine="340"/>
+        <w:jc w:val="both"/>
+      </w:pPr>
+      <w:r>
+        <w:rPr>
+          <w:rFonts w:ascii="Times New Roman" w:cs="Times New Roman" w:eastAsia="Times New Roman" w:hAnsi="Times New Roman"/>
+          <w:sz w:val="24"/>
+          <w:szCs w:val="24"/>
+        </w:rPr>
+        <w:t xml:space="preserve">Os agentes de preenchimento não apagam o passado. Eles o reorganizam. Uma pessoa que recebeu pouco apego na infância pode encontrar, mais tarde, vínculos que ofereçam parte do que faltou. Uma pessoa que foi humilhada pode, um dia, ser vista com respeito. Uma pessoa que viveu sem sentido pode descobrir uma causa, uma fé ou uma vocação. O pleno não exige uma origem perfeita; exige que a vida encontre alimento suficiente para continuar crescendo.</w:t>
       </w:r>
     </w:p>
     <w:p>
@@ -11862,7 +12372,7 @@
           <w:sz w:val="24"/>
           <w:szCs w:val="24"/>
         </w:rPr>
-        <w:t xml:space="preserve">Os dois vetores</w:t>
+        <w:t xml:space="preserve">A travessia das fases</w:t>
       </w:r>
     </w:p>
     <w:p>
@@ -11878,59 +12388,237 @@
           <w:sz w:val="24"/>
           <w:szCs w:val="24"/>
         </w:rPr>
-        <w:t xml:space="preserve">Em todas essas fases, a TPE identifica dois vetores que orientam o modo como o sujeito responde à própria história. O vetor do vazio forma o </w:t>
-      </w:r>
-      <w:r>
-        <w:rPr>
-          <w:rFonts w:ascii="Times New Roman" w:cs="Times New Roman" w:eastAsia="Times New Roman" w:hAnsi="Times New Roman"/>
-          <w:b/>
-          <w:bCs/>
-          <w:sz w:val="24"/>
-          <w:szCs w:val="24"/>
-        </w:rPr>
-        <w:t xml:space="preserve">coveiro</w:t>
-      </w:r>
-      <w:r>
-        <w:rPr>
-          <w:rFonts w:ascii="Times New Roman" w:cs="Times New Roman" w:eastAsia="Times New Roman" w:hAnsi="Times New Roman"/>
-          <w:sz w:val="24"/>
-          <w:szCs w:val="24"/>
-        </w:rPr>
-        <w:t xml:space="preserve">: aquele que, corroído pelas feridas, passa a enterrar possibilidades — as suas e as dos outros. O vetor do pleno forma o </w:t>
-      </w:r>
-      <w:r>
-        <w:rPr>
-          <w:rFonts w:ascii="Times New Roman" w:cs="Times New Roman" w:eastAsia="Times New Roman" w:hAnsi="Times New Roman"/>
-          <w:b/>
-          <w:bCs/>
-          <w:sz w:val="24"/>
-          <w:szCs w:val="24"/>
-        </w:rPr>
-        <w:t xml:space="preserve">parteiro</w:t>
-      </w:r>
-      <w:r>
-        <w:rPr>
-          <w:rFonts w:ascii="Times New Roman" w:cs="Times New Roman" w:eastAsia="Times New Roman" w:hAnsi="Times New Roman"/>
-          <w:sz w:val="24"/>
-          <w:szCs w:val="24"/>
-        </w:rPr>
-        <w:t xml:space="preserve">: aquele que, mesmo ferido, ajuda a vida a nascer — em si e nos outros.</w:t>
-      </w:r>
-    </w:p>
-    <w:p>
-      <w:pPr>
-        <w:widowControl/>
-        <w:spacing w:after="0" w:line="330" w:lineRule="exact"/>
-        <w:ind w:firstLine="340"/>
-        <w:jc w:val="both"/>
-      </w:pPr>
-      <w:r>
-        <w:rPr>
-          <w:rFonts w:ascii="Times New Roman" w:cs="Times New Roman" w:eastAsia="Times New Roman" w:hAnsi="Times New Roman"/>
-          <w:sz w:val="24"/>
-          <w:szCs w:val="24"/>
-        </w:rPr>
-        <w:t xml:space="preserve">Ninguém é apenas coveiro ou apenas parteiro. Os dois vetores convivem em cada pessoa, e o que define a direção de uma vida é qual deles predomina. A maturidade, segundo a TPE, consiste em inverter a lógica do vazio: em vez de enterrar o que está vivo e manter insepulto o que já morreu, aprender a sepultar as ilusões mortas e a dar à luz as potências que esperavam para nascer.</w:t>
+        <w:t xml:space="preserve">A TPE lê a existência como uma travessia em que cada fase oferece uma ferida típica e uma conquista possível. Na </w:t>
+      </w:r>
+      <w:r>
+        <w:rPr>
+          <w:rFonts w:ascii="Times New Roman" w:cs="Times New Roman" w:eastAsia="Times New Roman" w:hAnsi="Times New Roman"/>
+          <w:b/>
+          <w:bCs/>
+          <w:sz w:val="24"/>
+          <w:szCs w:val="24"/>
+        </w:rPr>
+        <w:t xml:space="preserve">gestação</w:t>
+      </w:r>
+      <w:r>
+        <w:rPr>
+          <w:rFonts w:ascii="Times New Roman" w:cs="Times New Roman" w:eastAsia="Times New Roman" w:hAnsi="Times New Roman"/>
+          <w:sz w:val="24"/>
+          <w:szCs w:val="24"/>
+        </w:rPr>
+        <w:t xml:space="preserve">, a plenitude é recebida; a ferida é a perda do paraíso; a conquista possível é transformar a saudade da inteireza em desejo de construí-la. No </w:t>
+      </w:r>
+      <w:r>
+        <w:rPr>
+          <w:rFonts w:ascii="Times New Roman" w:cs="Times New Roman" w:eastAsia="Times New Roman" w:hAnsi="Times New Roman"/>
+          <w:b/>
+          <w:bCs/>
+          <w:sz w:val="24"/>
+          <w:szCs w:val="24"/>
+        </w:rPr>
+        <w:t xml:space="preserve">nascimento</w:t>
+      </w:r>
+      <w:r>
+        <w:rPr>
+          <w:rFonts w:ascii="Times New Roman" w:cs="Times New Roman" w:eastAsia="Times New Roman" w:hAnsi="Times New Roman"/>
+          <w:sz w:val="24"/>
+          <w:szCs w:val="24"/>
+        </w:rPr>
+        <w:t xml:space="preserve">, a ruptura inaugura a vida; a ferida é o desamparo; a conquista é descobrir que, depois da dor, pode haver colo.</w:t>
+      </w:r>
+    </w:p>
+    <w:p>
+      <w:pPr>
+        <w:widowControl/>
+        <w:spacing w:after="0" w:line="330" w:lineRule="exact"/>
+        <w:ind w:firstLine="340"/>
+        <w:jc w:val="both"/>
+      </w:pPr>
+      <w:r>
+        <w:rPr>
+          <w:rFonts w:ascii="Times New Roman" w:cs="Times New Roman" w:eastAsia="Times New Roman" w:hAnsi="Times New Roman"/>
+          <w:sz w:val="24"/>
+          <w:szCs w:val="24"/>
+        </w:rPr>
+        <w:t xml:space="preserve">No </w:t>
+      </w:r>
+      <w:r>
+        <w:rPr>
+          <w:rFonts w:ascii="Times New Roman" w:cs="Times New Roman" w:eastAsia="Times New Roman" w:hAnsi="Times New Roman"/>
+          <w:b/>
+          <w:bCs/>
+          <w:sz w:val="24"/>
+          <w:szCs w:val="24"/>
+        </w:rPr>
+        <w:t xml:space="preserve">apego</w:t>
+      </w:r>
+      <w:r>
+        <w:rPr>
+          <w:rFonts w:ascii="Times New Roman" w:cs="Times New Roman" w:eastAsia="Times New Roman" w:hAnsi="Times New Roman"/>
+          <w:sz w:val="24"/>
+          <w:szCs w:val="24"/>
+        </w:rPr>
+        <w:t xml:space="preserve">, a ferida é a carência; a conquista é a confiança e a capacidade de troca. No encontro com o </w:t>
+      </w:r>
+      <w:r>
+        <w:rPr>
+          <w:rFonts w:ascii="Times New Roman" w:cs="Times New Roman" w:eastAsia="Times New Roman" w:hAnsi="Times New Roman"/>
+          <w:b/>
+          <w:bCs/>
+          <w:sz w:val="24"/>
+          <w:szCs w:val="24"/>
+        </w:rPr>
+        <w:t xml:space="preserve">“NÃO”</w:t>
+      </w:r>
+      <w:r>
+        <w:rPr>
+          <w:rFonts w:ascii="Times New Roman" w:cs="Times New Roman" w:eastAsia="Times New Roman" w:hAnsi="Times New Roman"/>
+          <w:sz w:val="24"/>
+          <w:szCs w:val="24"/>
+        </w:rPr>
+        <w:t xml:space="preserve">, a ferida é a humilhação do desejo; a conquista é o limite que dá forma à potência. Na </w:t>
+      </w:r>
+      <w:r>
+        <w:rPr>
+          <w:rFonts w:ascii="Times New Roman" w:cs="Times New Roman" w:eastAsia="Times New Roman" w:hAnsi="Times New Roman"/>
+          <w:b/>
+          <w:bCs/>
+          <w:sz w:val="24"/>
+          <w:szCs w:val="24"/>
+        </w:rPr>
+        <w:t xml:space="preserve">arena escolar e social</w:t>
+      </w:r>
+      <w:r>
+        <w:rPr>
+          <w:rFonts w:ascii="Times New Roman" w:cs="Times New Roman" w:eastAsia="Times New Roman" w:hAnsi="Times New Roman"/>
+          <w:sz w:val="24"/>
+          <w:szCs w:val="24"/>
+        </w:rPr>
+        <w:t xml:space="preserve">, a ferida é a rejeição; a conquista é pertencer sem se vender. Na </w:t>
+      </w:r>
+      <w:r>
+        <w:rPr>
+          <w:rFonts w:ascii="Times New Roman" w:cs="Times New Roman" w:eastAsia="Times New Roman" w:hAnsi="Times New Roman"/>
+          <w:b/>
+          <w:bCs/>
+          <w:sz w:val="24"/>
+          <w:szCs w:val="24"/>
+        </w:rPr>
+        <w:t xml:space="preserve">crise de identidade</w:t>
+      </w:r>
+      <w:r>
+        <w:rPr>
+          <w:rFonts w:ascii="Times New Roman" w:cs="Times New Roman" w:eastAsia="Times New Roman" w:hAnsi="Times New Roman"/>
+          <w:sz w:val="24"/>
+          <w:szCs w:val="24"/>
+        </w:rPr>
+        <w:t xml:space="preserve">, a ferida é a confusão; a conquista é um eixo próprio.</w:t>
+      </w:r>
+    </w:p>
+    <w:p>
+      <w:pPr>
+        <w:widowControl/>
+        <w:spacing w:after="0" w:line="330" w:lineRule="exact"/>
+        <w:ind w:firstLine="340"/>
+        <w:jc w:val="both"/>
+      </w:pPr>
+      <w:r>
+        <w:rPr>
+          <w:rFonts w:ascii="Times New Roman" w:cs="Times New Roman" w:eastAsia="Times New Roman" w:hAnsi="Times New Roman"/>
+          <w:sz w:val="24"/>
+          <w:szCs w:val="24"/>
+        </w:rPr>
+        <w:t xml:space="preserve">Na </w:t>
+      </w:r>
+      <w:r>
+        <w:rPr>
+          <w:rFonts w:ascii="Times New Roman" w:cs="Times New Roman" w:eastAsia="Times New Roman" w:hAnsi="Times New Roman"/>
+          <w:b/>
+          <w:bCs/>
+          <w:sz w:val="24"/>
+          <w:szCs w:val="24"/>
+        </w:rPr>
+        <w:t xml:space="preserve">vida adulta</w:t>
+      </w:r>
+      <w:r>
+        <w:rPr>
+          <w:rFonts w:ascii="Times New Roman" w:cs="Times New Roman" w:eastAsia="Times New Roman" w:hAnsi="Times New Roman"/>
+          <w:sz w:val="24"/>
+          <w:szCs w:val="24"/>
+        </w:rPr>
+        <w:t xml:space="preserve">, a ferida é a paralisia diante da perda; a conquista é a autoria. No </w:t>
+      </w:r>
+      <w:r>
+        <w:rPr>
+          <w:rFonts w:ascii="Times New Roman" w:cs="Times New Roman" w:eastAsia="Times New Roman" w:hAnsi="Times New Roman"/>
+          <w:b/>
+          <w:bCs/>
+          <w:sz w:val="24"/>
+          <w:szCs w:val="24"/>
+        </w:rPr>
+        <w:t xml:space="preserve">trabalho e na vida social</w:t>
+      </w:r>
+      <w:r>
+        <w:rPr>
+          <w:rFonts w:ascii="Times New Roman" w:cs="Times New Roman" w:eastAsia="Times New Roman" w:hAnsi="Times New Roman"/>
+          <w:sz w:val="24"/>
+          <w:szCs w:val="24"/>
+        </w:rPr>
+        <w:t xml:space="preserve">, a ferida é a fragmentação; a conquista é a distribuição sábia da própria energia. Na </w:t>
+      </w:r>
+      <w:r>
+        <w:rPr>
+          <w:rFonts w:ascii="Times New Roman" w:cs="Times New Roman" w:eastAsia="Times New Roman" w:hAnsi="Times New Roman"/>
+          <w:b/>
+          <w:bCs/>
+          <w:sz w:val="24"/>
+          <w:szCs w:val="24"/>
+        </w:rPr>
+        <w:t xml:space="preserve">transformação</w:t>
+      </w:r>
+      <w:r>
+        <w:rPr>
+          <w:rFonts w:ascii="Times New Roman" w:cs="Times New Roman" w:eastAsia="Times New Roman" w:hAnsi="Times New Roman"/>
+          <w:sz w:val="24"/>
+          <w:szCs w:val="24"/>
+        </w:rPr>
+        <w:t xml:space="preserve">, a ferida é o medo do casulo; a conquista é a metamorfose. Na </w:t>
+      </w:r>
+      <w:r>
+        <w:rPr>
+          <w:rFonts w:ascii="Times New Roman" w:cs="Times New Roman" w:eastAsia="Times New Roman" w:hAnsi="Times New Roman"/>
+          <w:b/>
+          <w:bCs/>
+          <w:sz w:val="24"/>
+          <w:szCs w:val="24"/>
+        </w:rPr>
+        <w:t xml:space="preserve">velhice</w:t>
+      </w:r>
+      <w:r>
+        <w:rPr>
+          <w:rFonts w:ascii="Times New Roman" w:cs="Times New Roman" w:eastAsia="Times New Roman" w:hAnsi="Times New Roman"/>
+          <w:sz w:val="24"/>
+          <w:szCs w:val="24"/>
+        </w:rPr>
+        <w:t xml:space="preserve">, a ferida é o abandono; a conquista é a sabedoria e o legado. No </w:t>
+      </w:r>
+      <w:r>
+        <w:rPr>
+          <w:rFonts w:ascii="Times New Roman" w:cs="Times New Roman" w:eastAsia="Times New Roman" w:hAnsi="Times New Roman"/>
+          <w:b/>
+          <w:bCs/>
+          <w:sz w:val="24"/>
+          <w:szCs w:val="24"/>
+        </w:rPr>
+        <w:t xml:space="preserve">fim</w:t>
+      </w:r>
+      <w:r>
+        <w:rPr>
+          <w:rFonts w:ascii="Times New Roman" w:cs="Times New Roman" w:eastAsia="Times New Roman" w:hAnsi="Times New Roman"/>
+          <w:sz w:val="24"/>
+          <w:szCs w:val="24"/>
+        </w:rPr>
+        <w:t xml:space="preserve">, a ferida é o medo do silêncio; a conquista é a paz de quem viveu com verdade.</w:t>
       </w:r>
     </w:p>
     <w:p>
@@ -11948,7 +12636,7 @@
           <w:sz w:val="24"/>
           <w:szCs w:val="24"/>
         </w:rPr>
-        <w:t xml:space="preserve">Os dez princípios da TPE</w:t>
+        <w:t xml:space="preserve">Os dois vetores</w:t>
       </w:r>
     </w:p>
     <w:p>
@@ -11964,267 +12652,59 @@
           <w:sz w:val="24"/>
           <w:szCs w:val="24"/>
         </w:rPr>
-        <w:t xml:space="preserve">Para facilitar a compreensão e a prática, a Teoria do Pleno Existencial pode ser resumida em dez princípios.</w:t>
-      </w:r>
-    </w:p>
-    <w:p>
-      <w:pPr>
-        <w:widowControl/>
-        <w:spacing w:after="0" w:line="330" w:lineRule="exact"/>
-        <w:ind w:firstLine="340"/>
-        <w:jc w:val="both"/>
-      </w:pPr>
-      <w:r>
-        <w:rPr>
-          <w:rFonts w:ascii="Times New Roman" w:cs="Times New Roman" w:eastAsia="Times New Roman" w:hAnsi="Times New Roman"/>
-          <w:b/>
-          <w:bCs/>
-          <w:sz w:val="24"/>
-          <w:szCs w:val="24"/>
-        </w:rPr>
-        <w:t xml:space="preserve">1. Princípio da origem.</w:t>
-      </w:r>
-      <w:r>
-        <w:rPr>
-          <w:rFonts w:ascii="Times New Roman" w:cs="Times New Roman" w:eastAsia="Times New Roman" w:hAnsi="Times New Roman"/>
-          <w:sz w:val="24"/>
-          <w:szCs w:val="24"/>
-        </w:rPr>
-        <w:t xml:space="preserve"> A plenitude é anterior à ferida. Antes de qualquer dor, há no ser uma potência originária de inteireza.</w:t>
-      </w:r>
-    </w:p>
-    <w:p>
-      <w:pPr>
-        <w:widowControl/>
-        <w:spacing w:after="0" w:line="330" w:lineRule="exact"/>
-        <w:ind w:firstLine="340"/>
-        <w:jc w:val="both"/>
-      </w:pPr>
-      <w:r>
-        <w:rPr>
-          <w:rFonts w:ascii="Times New Roman" w:cs="Times New Roman" w:eastAsia="Times New Roman" w:hAnsi="Times New Roman"/>
-          <w:b/>
-          <w:bCs/>
-          <w:sz w:val="24"/>
-          <w:szCs w:val="24"/>
-        </w:rPr>
-        <w:t xml:space="preserve">2. Princípio do adormecimento.</w:t>
-      </w:r>
-      <w:r>
-        <w:rPr>
-          <w:rFonts w:ascii="Times New Roman" w:cs="Times New Roman" w:eastAsia="Times New Roman" w:hAnsi="Times New Roman"/>
-          <w:sz w:val="24"/>
-          <w:szCs w:val="24"/>
-        </w:rPr>
-        <w:t xml:space="preserve"> A potência não morre; adormece. O sujeito não perde o Pleno Existencial — perde o acesso consciente a ele.</w:t>
-      </w:r>
-    </w:p>
-    <w:p>
-      <w:pPr>
-        <w:widowControl/>
-        <w:spacing w:after="0" w:line="330" w:lineRule="exact"/>
-        <w:ind w:firstLine="340"/>
-        <w:jc w:val="both"/>
-      </w:pPr>
-      <w:r>
-        <w:rPr>
-          <w:rFonts w:ascii="Times New Roman" w:cs="Times New Roman" w:eastAsia="Times New Roman" w:hAnsi="Times New Roman"/>
-          <w:b/>
-          <w:bCs/>
-          <w:sz w:val="24"/>
-          <w:szCs w:val="24"/>
-        </w:rPr>
-        <w:t xml:space="preserve">3. Princípio da corrosão.</w:t>
-      </w:r>
-      <w:r>
-        <w:rPr>
-          <w:rFonts w:ascii="Times New Roman" w:cs="Times New Roman" w:eastAsia="Times New Roman" w:hAnsi="Times New Roman"/>
-          <w:sz w:val="24"/>
-          <w:szCs w:val="24"/>
-        </w:rPr>
-        <w:t xml:space="preserve"> O que não é elaborado corrói. Não é a dor que destrói a potencialidade, mas a dor sem nome, sem sentido e sem vínculo.</w:t>
-      </w:r>
-    </w:p>
-    <w:p>
-      <w:pPr>
-        <w:widowControl/>
-        <w:spacing w:after="0" w:line="330" w:lineRule="exact"/>
-        <w:ind w:firstLine="340"/>
-        <w:jc w:val="both"/>
-      </w:pPr>
-      <w:r>
-        <w:rPr>
-          <w:rFonts w:ascii="Times New Roman" w:cs="Times New Roman" w:eastAsia="Times New Roman" w:hAnsi="Times New Roman"/>
-          <w:b/>
-          <w:bCs/>
-          <w:sz w:val="24"/>
-          <w:szCs w:val="24"/>
-        </w:rPr>
-        <w:t xml:space="preserve">4. Princípio da medida.</w:t>
-      </w:r>
-      <w:r>
-        <w:rPr>
-          <w:rFonts w:ascii="Times New Roman" w:cs="Times New Roman" w:eastAsia="Times New Roman" w:hAnsi="Times New Roman"/>
-          <w:sz w:val="24"/>
-          <w:szCs w:val="24"/>
-        </w:rPr>
-        <w:t xml:space="preserve"> O pleno não é o cheio. Sofre-se pela falta e sofre-se pelo excesso; a plenitude é ritmo, proporção e integração.</w:t>
-      </w:r>
-    </w:p>
-    <w:p>
-      <w:pPr>
-        <w:widowControl/>
-        <w:spacing w:after="0" w:line="330" w:lineRule="exact"/>
-        <w:ind w:firstLine="340"/>
-        <w:jc w:val="both"/>
-      </w:pPr>
-      <w:r>
-        <w:rPr>
-          <w:rFonts w:ascii="Times New Roman" w:cs="Times New Roman" w:eastAsia="Times New Roman" w:hAnsi="Times New Roman"/>
-          <w:b/>
-          <w:bCs/>
-          <w:sz w:val="24"/>
-          <w:szCs w:val="24"/>
-        </w:rPr>
-        <w:t xml:space="preserve">5. Princípio da pulsação.</w:t>
-      </w:r>
-      <w:r>
-        <w:rPr>
-          <w:rFonts w:ascii="Times New Roman" w:cs="Times New Roman" w:eastAsia="Times New Roman" w:hAnsi="Times New Roman"/>
-          <w:sz w:val="24"/>
-          <w:szCs w:val="24"/>
-        </w:rPr>
-        <w:t xml:space="preserve"> Eros e Tânatos convivem em cada ser. O problema não é ter forças de vida e de apagamento, mas não saber qual delas governa a caminhada.</w:t>
-      </w:r>
-    </w:p>
-    <w:p>
-      <w:pPr>
-        <w:widowControl/>
-        <w:spacing w:after="0" w:line="330" w:lineRule="exact"/>
-        <w:ind w:firstLine="340"/>
-        <w:jc w:val="both"/>
-      </w:pPr>
-      <w:r>
-        <w:rPr>
-          <w:rFonts w:ascii="Times New Roman" w:cs="Times New Roman" w:eastAsia="Times New Roman" w:hAnsi="Times New Roman"/>
-          <w:b/>
-          <w:bCs/>
-          <w:sz w:val="24"/>
-          <w:szCs w:val="24"/>
-        </w:rPr>
-        <w:t xml:space="preserve">6. Princípio da perda.</w:t>
-      </w:r>
-      <w:r>
-        <w:rPr>
-          <w:rFonts w:ascii="Times New Roman" w:cs="Times New Roman" w:eastAsia="Times New Roman" w:hAnsi="Times New Roman"/>
-          <w:sz w:val="24"/>
-          <w:szCs w:val="24"/>
-        </w:rPr>
-        <w:t xml:space="preserve"> Toda expansão cobra uma perda. Ninguém teme o que vai ganhar, mas sofre pelo que vai perder; por isso, crescer exige luto.</w:t>
-      </w:r>
-    </w:p>
-    <w:p>
-      <w:pPr>
-        <w:widowControl/>
-        <w:spacing w:after="0" w:line="330" w:lineRule="exact"/>
-        <w:ind w:firstLine="340"/>
-        <w:jc w:val="both"/>
-      </w:pPr>
-      <w:r>
-        <w:rPr>
-          <w:rFonts w:ascii="Times New Roman" w:cs="Times New Roman" w:eastAsia="Times New Roman" w:hAnsi="Times New Roman"/>
-          <w:b/>
-          <w:bCs/>
-          <w:sz w:val="24"/>
-          <w:szCs w:val="24"/>
-        </w:rPr>
-        <w:t xml:space="preserve">7. Princípio do fundamento.</w:t>
-      </w:r>
-      <w:r>
-        <w:rPr>
-          <w:rFonts w:ascii="Times New Roman" w:cs="Times New Roman" w:eastAsia="Times New Roman" w:hAnsi="Times New Roman"/>
-          <w:sz w:val="24"/>
-          <w:szCs w:val="24"/>
-        </w:rPr>
-        <w:t xml:space="preserve"> O reconhecimento confirma; o fundamento sustenta. Quem depende só do olhar alheio vive em oscilação; quem toca o próprio fundamento conquista liberdade.</w:t>
-      </w:r>
-    </w:p>
-    <w:p>
-      <w:pPr>
-        <w:widowControl/>
-        <w:spacing w:after="0" w:line="330" w:lineRule="exact"/>
-        <w:ind w:firstLine="340"/>
-        <w:jc w:val="both"/>
-      </w:pPr>
-      <w:r>
-        <w:rPr>
-          <w:rFonts w:ascii="Times New Roman" w:cs="Times New Roman" w:eastAsia="Times New Roman" w:hAnsi="Times New Roman"/>
-          <w:b/>
-          <w:bCs/>
-          <w:sz w:val="24"/>
-          <w:szCs w:val="24"/>
-        </w:rPr>
-        <w:t xml:space="preserve">8. Princípio da autoria.</w:t>
-      </w:r>
-      <w:r>
-        <w:rPr>
-          <w:rFonts w:ascii="Times New Roman" w:cs="Times New Roman" w:eastAsia="Times New Roman" w:hAnsi="Times New Roman"/>
-          <w:sz w:val="24"/>
-          <w:szCs w:val="24"/>
-        </w:rPr>
-        <w:t xml:space="preserve"> Não importa apenas o que fizeram de nós, mas o que fazemos com o que fizeram de nós. A origem importa, mas não determina o destino.</w:t>
-      </w:r>
-    </w:p>
-    <w:p>
-      <w:pPr>
-        <w:widowControl/>
-        <w:spacing w:after="0" w:line="330" w:lineRule="exact"/>
-        <w:ind w:firstLine="340"/>
-        <w:jc w:val="both"/>
-      </w:pPr>
-      <w:r>
-        <w:rPr>
-          <w:rFonts w:ascii="Times New Roman" w:cs="Times New Roman" w:eastAsia="Times New Roman" w:hAnsi="Times New Roman"/>
-          <w:b/>
-          <w:bCs/>
-          <w:sz w:val="24"/>
-          <w:szCs w:val="24"/>
-        </w:rPr>
-        <w:t xml:space="preserve">9. Princípio da troca.</w:t>
-      </w:r>
-      <w:r>
-        <w:rPr>
-          <w:rFonts w:ascii="Times New Roman" w:cs="Times New Roman" w:eastAsia="Times New Roman" w:hAnsi="Times New Roman"/>
-          <w:sz w:val="24"/>
-          <w:szCs w:val="24"/>
-        </w:rPr>
-        <w:t xml:space="preserve"> O pleno circula. Quem está no vazio suga; quem está no cheio sufoca; quem está no pleno recebe e devolve.</w:t>
-      </w:r>
-    </w:p>
-    <w:p>
-      <w:pPr>
-        <w:widowControl/>
-        <w:spacing w:after="0" w:line="330" w:lineRule="exact"/>
-        <w:ind w:firstLine="340"/>
-        <w:jc w:val="both"/>
-      </w:pPr>
-      <w:r>
-        <w:rPr>
-          <w:rFonts w:ascii="Times New Roman" w:cs="Times New Roman" w:eastAsia="Times New Roman" w:hAnsi="Times New Roman"/>
-          <w:b/>
-          <w:bCs/>
-          <w:sz w:val="24"/>
-          <w:szCs w:val="24"/>
-        </w:rPr>
-        <w:t xml:space="preserve">10. Princípio da transcendência.</w:t>
-      </w:r>
-      <w:r>
-        <w:rPr>
-          <w:rFonts w:ascii="Times New Roman" w:cs="Times New Roman" w:eastAsia="Times New Roman" w:hAnsi="Times New Roman"/>
-          <w:sz w:val="24"/>
-          <w:szCs w:val="24"/>
-        </w:rPr>
-        <w:t xml:space="preserve"> O pleno humano se completa na abertura ao amor que o excede. Não como posse, mas como chamado que transforma.</w:t>
+        <w:t xml:space="preserve">Em todas essas fases, a TPE identifica dois vetores que orientam o modo como o sujeito responde à própria história. O vetor do vazio forma o </w:t>
+      </w:r>
+      <w:r>
+        <w:rPr>
+          <w:rFonts w:ascii="Times New Roman" w:cs="Times New Roman" w:eastAsia="Times New Roman" w:hAnsi="Times New Roman"/>
+          <w:b/>
+          <w:bCs/>
+          <w:sz w:val="24"/>
+          <w:szCs w:val="24"/>
+        </w:rPr>
+        <w:t xml:space="preserve">coveiro</w:t>
+      </w:r>
+      <w:r>
+        <w:rPr>
+          <w:rFonts w:ascii="Times New Roman" w:cs="Times New Roman" w:eastAsia="Times New Roman" w:hAnsi="Times New Roman"/>
+          <w:sz w:val="24"/>
+          <w:szCs w:val="24"/>
+        </w:rPr>
+        <w:t xml:space="preserve">: aquele que, corroído pelas feridas, passa a enterrar possibilidades — as suas e as dos outros. O vetor do pleno forma o </w:t>
+      </w:r>
+      <w:r>
+        <w:rPr>
+          <w:rFonts w:ascii="Times New Roman" w:cs="Times New Roman" w:eastAsia="Times New Roman" w:hAnsi="Times New Roman"/>
+          <w:b/>
+          <w:bCs/>
+          <w:sz w:val="24"/>
+          <w:szCs w:val="24"/>
+        </w:rPr>
+        <w:t xml:space="preserve">parteiro</w:t>
+      </w:r>
+      <w:r>
+        <w:rPr>
+          <w:rFonts w:ascii="Times New Roman" w:cs="Times New Roman" w:eastAsia="Times New Roman" w:hAnsi="Times New Roman"/>
+          <w:sz w:val="24"/>
+          <w:szCs w:val="24"/>
+        </w:rPr>
+        <w:t xml:space="preserve">: aquele que, mesmo ferido, ajuda a vida a nascer — em si e nos outros.</w:t>
+      </w:r>
+    </w:p>
+    <w:p>
+      <w:pPr>
+        <w:widowControl/>
+        <w:spacing w:after="0" w:line="330" w:lineRule="exact"/>
+        <w:ind w:firstLine="340"/>
+        <w:jc w:val="both"/>
+      </w:pPr>
+      <w:r>
+        <w:rPr>
+          <w:rFonts w:ascii="Times New Roman" w:cs="Times New Roman" w:eastAsia="Times New Roman" w:hAnsi="Times New Roman"/>
+          <w:sz w:val="24"/>
+          <w:szCs w:val="24"/>
+        </w:rPr>
+        <w:t xml:space="preserve">Ninguém é apenas coveiro ou apenas parteiro. Os dois vetores convivem em cada pessoa, e o que define a direção de uma vida é qual deles predomina. A maturidade, segundo a TPE, consiste em inverter a lógica do vazio: em vez de enterrar o que está vivo e manter insepulto o que já morreu, aprender a sepultar as ilusões mortas e a dar à luz as potências que esperavam para nascer.</w:t>
       </w:r>
     </w:p>
     <w:p>
@@ -12242,7 +12722,7 @@
           <w:sz w:val="24"/>
           <w:szCs w:val="24"/>
         </w:rPr>
-        <w:t xml:space="preserve">O caminho do reencontro</w:t>
+        <w:t xml:space="preserve">Os dez princípios da TPE</w:t>
       </w:r>
     </w:p>
     <w:p>
@@ -12258,211 +12738,267 @@
           <w:sz w:val="24"/>
           <w:szCs w:val="24"/>
         </w:rPr>
-        <w:t xml:space="preserve">Se o Pleno Existencial adormece, é possível despertá-lo. A TPE propõe que esse despertar se dá por meio de seis movimentos, que não são etapas rígidas, mas gestos que se repetem e se aprofundam ao longo da vida.</w:t>
-      </w:r>
-    </w:p>
-    <w:p>
-      <w:pPr>
-        <w:widowControl/>
-        <w:spacing w:after="0" w:line="330" w:lineRule="exact"/>
-        <w:ind w:firstLine="340"/>
-        <w:jc w:val="both"/>
-      </w:pPr>
-      <w:r>
-        <w:rPr>
-          <w:rFonts w:ascii="Times New Roman" w:cs="Times New Roman" w:eastAsia="Times New Roman" w:hAnsi="Times New Roman"/>
-          <w:sz w:val="24"/>
-          <w:szCs w:val="24"/>
-        </w:rPr>
-        <w:t xml:space="preserve">O primeiro movimento é </w:t>
-      </w:r>
-      <w:r>
-        <w:rPr>
-          <w:rFonts w:ascii="Times New Roman" w:cs="Times New Roman" w:eastAsia="Times New Roman" w:hAnsi="Times New Roman"/>
-          <w:b/>
-          <w:bCs/>
-          <w:sz w:val="24"/>
-          <w:szCs w:val="24"/>
-        </w:rPr>
-        <w:t xml:space="preserve">nomear</w:t>
-      </w:r>
-      <w:r>
-        <w:rPr>
-          <w:rFonts w:ascii="Times New Roman" w:cs="Times New Roman" w:eastAsia="Times New Roman" w:hAnsi="Times New Roman"/>
-          <w:sz w:val="24"/>
-          <w:szCs w:val="24"/>
-        </w:rPr>
-        <w:t xml:space="preserve">. Aquilo que não tem nome governa em silêncio. Nomear a ferida, o medo, a inveja, a carência ou a máscara é o primeiro passo para deixar de ser comandado por elas. Por isso, a honestidade consigo mesmo é a porta de entrada de toda transformação.</w:t>
-      </w:r>
-    </w:p>
-    <w:p>
-      <w:pPr>
-        <w:widowControl/>
-        <w:spacing w:after="0" w:line="330" w:lineRule="exact"/>
-        <w:ind w:firstLine="340"/>
-        <w:jc w:val="both"/>
-      </w:pPr>
-      <w:r>
-        <w:rPr>
-          <w:rFonts w:ascii="Times New Roman" w:cs="Times New Roman" w:eastAsia="Times New Roman" w:hAnsi="Times New Roman"/>
-          <w:sz w:val="24"/>
-          <w:szCs w:val="24"/>
-        </w:rPr>
-        <w:t xml:space="preserve">O segundo movimento é </w:t>
-      </w:r>
-      <w:r>
-        <w:rPr>
-          <w:rFonts w:ascii="Times New Roman" w:cs="Times New Roman" w:eastAsia="Times New Roman" w:hAnsi="Times New Roman"/>
-          <w:b/>
-          <w:bCs/>
-          <w:sz w:val="24"/>
-          <w:szCs w:val="24"/>
-        </w:rPr>
-        <w:t xml:space="preserve">elaborar</w:t>
-      </w:r>
-      <w:r>
-        <w:rPr>
-          <w:rFonts w:ascii="Times New Roman" w:cs="Times New Roman" w:eastAsia="Times New Roman" w:hAnsi="Times New Roman"/>
-          <w:sz w:val="24"/>
-          <w:szCs w:val="24"/>
-        </w:rPr>
-        <w:t xml:space="preserve">. Nomear não basta; é preciso atravessar. Elaborar é permitir que a dor seja sentida, chorada e compreendida, em vez de apenas evitada. É fazer o luto do que não aconteceu, do amor que não veio, da infância que poderia ter sido diferente. Muitas vezes, esse movimento exige companhia: de um terapeuta, de um guia espiritual, de um grupo, de um amigo que saiba escutar.</w:t>
-      </w:r>
-    </w:p>
-    <w:p>
-      <w:pPr>
-        <w:widowControl/>
-        <w:spacing w:after="0" w:line="330" w:lineRule="exact"/>
-        <w:ind w:firstLine="340"/>
-        <w:jc w:val="both"/>
-      </w:pPr>
-      <w:r>
-        <w:rPr>
-          <w:rFonts w:ascii="Times New Roman" w:cs="Times New Roman" w:eastAsia="Times New Roman" w:hAnsi="Times New Roman"/>
-          <w:sz w:val="24"/>
-          <w:szCs w:val="24"/>
-        </w:rPr>
-        <w:t xml:space="preserve">O terceiro movimento é </w:t>
-      </w:r>
-      <w:r>
-        <w:rPr>
-          <w:rFonts w:ascii="Times New Roman" w:cs="Times New Roman" w:eastAsia="Times New Roman" w:hAnsi="Times New Roman"/>
-          <w:b/>
-          <w:bCs/>
-          <w:sz w:val="24"/>
-          <w:szCs w:val="24"/>
-        </w:rPr>
-        <w:t xml:space="preserve">ressignificar</w:t>
-      </w:r>
-      <w:r>
-        <w:rPr>
-          <w:rFonts w:ascii="Times New Roman" w:cs="Times New Roman" w:eastAsia="Times New Roman" w:hAnsi="Times New Roman"/>
-          <w:sz w:val="24"/>
-          <w:szCs w:val="24"/>
-        </w:rPr>
-        <w:t xml:space="preserve">. Uma vez atravessada, a dor pode ganhar outro lugar na história. Ela deixa de ser sentença e passa a ser matéria. A rejeição pode se transformar em discernimento; a frustração, em paciência; a perda, em compaixão. Ressignificar não é fingir que a dor foi boa, mas descobrir o que ela pode ensinar.</w:t>
-      </w:r>
-    </w:p>
-    <w:p>
-      <w:pPr>
-        <w:widowControl/>
-        <w:spacing w:after="0" w:line="330" w:lineRule="exact"/>
-        <w:ind w:firstLine="340"/>
-        <w:jc w:val="both"/>
-      </w:pPr>
-      <w:r>
-        <w:rPr>
-          <w:rFonts w:ascii="Times New Roman" w:cs="Times New Roman" w:eastAsia="Times New Roman" w:hAnsi="Times New Roman"/>
-          <w:sz w:val="24"/>
-          <w:szCs w:val="24"/>
-        </w:rPr>
-        <w:t xml:space="preserve">O quarto movimento é </w:t>
-      </w:r>
-      <w:r>
-        <w:rPr>
-          <w:rFonts w:ascii="Times New Roman" w:cs="Times New Roman" w:eastAsia="Times New Roman" w:hAnsi="Times New Roman"/>
-          <w:b/>
-          <w:bCs/>
-          <w:sz w:val="24"/>
-          <w:szCs w:val="24"/>
-        </w:rPr>
-        <w:t xml:space="preserve">escolher</w:t>
-      </w:r>
-      <w:r>
-        <w:rPr>
-          <w:rFonts w:ascii="Times New Roman" w:cs="Times New Roman" w:eastAsia="Times New Roman" w:hAnsi="Times New Roman"/>
-          <w:sz w:val="24"/>
-          <w:szCs w:val="24"/>
-        </w:rPr>
-        <w:t xml:space="preserve">. É aqui que a autoria se manifesta. Diante da própria história, o sujeito decide quais vozes continuará ouvindo, quais vínculos manterá, quais caminhos seguirá. Toda escolha implica perda, e por isso exige coragem. Mas é a escolha que transforma a compreensão em vida.</w:t>
-      </w:r>
-    </w:p>
-    <w:p>
-      <w:pPr>
-        <w:widowControl/>
-        <w:spacing w:after="0" w:line="330" w:lineRule="exact"/>
-        <w:ind w:firstLine="340"/>
-        <w:jc w:val="both"/>
-      </w:pPr>
-      <w:r>
-        <w:rPr>
-          <w:rFonts w:ascii="Times New Roman" w:cs="Times New Roman" w:eastAsia="Times New Roman" w:hAnsi="Times New Roman"/>
-          <w:sz w:val="24"/>
-          <w:szCs w:val="24"/>
-        </w:rPr>
-        <w:t xml:space="preserve">O quinto movimento é </w:t>
-      </w:r>
-      <w:r>
-        <w:rPr>
-          <w:rFonts w:ascii="Times New Roman" w:cs="Times New Roman" w:eastAsia="Times New Roman" w:hAnsi="Times New Roman"/>
-          <w:b/>
-          <w:bCs/>
-          <w:sz w:val="24"/>
-          <w:szCs w:val="24"/>
-        </w:rPr>
-        <w:t xml:space="preserve">habitar</w:t>
-      </w:r>
-      <w:r>
-        <w:rPr>
-          <w:rFonts w:ascii="Times New Roman" w:cs="Times New Roman" w:eastAsia="Times New Roman" w:hAnsi="Times New Roman"/>
-          <w:sz w:val="24"/>
-          <w:szCs w:val="24"/>
-        </w:rPr>
-        <w:t xml:space="preserve">. O pleno não é um lugar a que se chega uma vez, mas uma morada que se aprende a ocupar. Habitar é viver com presença no próprio corpo, no próprio tempo, nas próprias relações. É respeitar o ritmo, descansar, silenciar, cuidar da medida.</w:t>
-      </w:r>
-    </w:p>
-    <w:p>
-      <w:pPr>
-        <w:widowControl/>
-        <w:spacing w:after="0" w:line="330" w:lineRule="exact"/>
-        <w:ind w:firstLine="340"/>
-        <w:jc w:val="both"/>
-      </w:pPr>
-      <w:r>
-        <w:rPr>
-          <w:rFonts w:ascii="Times New Roman" w:cs="Times New Roman" w:eastAsia="Times New Roman" w:hAnsi="Times New Roman"/>
-          <w:sz w:val="24"/>
-          <w:szCs w:val="24"/>
-        </w:rPr>
-        <w:t xml:space="preserve">O sexto movimento é </w:t>
-      </w:r>
-      <w:r>
-        <w:rPr>
-          <w:rFonts w:ascii="Times New Roman" w:cs="Times New Roman" w:eastAsia="Times New Roman" w:hAnsi="Times New Roman"/>
-          <w:b/>
-          <w:bCs/>
-          <w:sz w:val="24"/>
-          <w:szCs w:val="24"/>
-        </w:rPr>
-        <w:t xml:space="preserve">frutificar</w:t>
-      </w:r>
-      <w:r>
-        <w:rPr>
-          <w:rFonts w:ascii="Times New Roman" w:cs="Times New Roman" w:eastAsia="Times New Roman" w:hAnsi="Times New Roman"/>
-          <w:sz w:val="24"/>
-          <w:szCs w:val="24"/>
-        </w:rPr>
-        <w:t xml:space="preserve">. Quem reencontra a própria plenitude não a guarda para si. Torna-se parteiro de outros, oferece presença, interrompe correntes de dor, deixa legado. O pleno, quando desperta, transborda — não como excesso, mas como fruto. E é nesse transbordar que a vida individual encontra o seu sentido mais amplo.</w:t>
+        <w:t xml:space="preserve">Para facilitar a compreensão e a prática, a Teoria do Pleno Existencial pode ser resumida em dez princípios.</w:t>
+      </w:r>
+    </w:p>
+    <w:p>
+      <w:pPr>
+        <w:widowControl/>
+        <w:spacing w:after="0" w:line="330" w:lineRule="exact"/>
+        <w:ind w:firstLine="340"/>
+        <w:jc w:val="both"/>
+      </w:pPr>
+      <w:r>
+        <w:rPr>
+          <w:rFonts w:ascii="Times New Roman" w:cs="Times New Roman" w:eastAsia="Times New Roman" w:hAnsi="Times New Roman"/>
+          <w:b/>
+          <w:bCs/>
+          <w:sz w:val="24"/>
+          <w:szCs w:val="24"/>
+        </w:rPr>
+        <w:t xml:space="preserve">1. Princípio da origem.</w:t>
+      </w:r>
+      <w:r>
+        <w:rPr>
+          <w:rFonts w:ascii="Times New Roman" w:cs="Times New Roman" w:eastAsia="Times New Roman" w:hAnsi="Times New Roman"/>
+          <w:sz w:val="24"/>
+          <w:szCs w:val="24"/>
+        </w:rPr>
+        <w:t xml:space="preserve"> A plenitude é anterior à ferida. Antes de qualquer dor, há no ser uma potência originária de inteireza.</w:t>
+      </w:r>
+    </w:p>
+    <w:p>
+      <w:pPr>
+        <w:widowControl/>
+        <w:spacing w:after="0" w:line="330" w:lineRule="exact"/>
+        <w:ind w:firstLine="340"/>
+        <w:jc w:val="both"/>
+      </w:pPr>
+      <w:r>
+        <w:rPr>
+          <w:rFonts w:ascii="Times New Roman" w:cs="Times New Roman" w:eastAsia="Times New Roman" w:hAnsi="Times New Roman"/>
+          <w:b/>
+          <w:bCs/>
+          <w:sz w:val="24"/>
+          <w:szCs w:val="24"/>
+        </w:rPr>
+        <w:t xml:space="preserve">2. Princípio do adormecimento.</w:t>
+      </w:r>
+      <w:r>
+        <w:rPr>
+          <w:rFonts w:ascii="Times New Roman" w:cs="Times New Roman" w:eastAsia="Times New Roman" w:hAnsi="Times New Roman"/>
+          <w:sz w:val="24"/>
+          <w:szCs w:val="24"/>
+        </w:rPr>
+        <w:t xml:space="preserve"> A potência não morre; adormece. O sujeito não perde o Pleno Existencial — perde o acesso consciente a ele.</w:t>
+      </w:r>
+    </w:p>
+    <w:p>
+      <w:pPr>
+        <w:widowControl/>
+        <w:spacing w:after="0" w:line="330" w:lineRule="exact"/>
+        <w:ind w:firstLine="340"/>
+        <w:jc w:val="both"/>
+      </w:pPr>
+      <w:r>
+        <w:rPr>
+          <w:rFonts w:ascii="Times New Roman" w:cs="Times New Roman" w:eastAsia="Times New Roman" w:hAnsi="Times New Roman"/>
+          <w:b/>
+          <w:bCs/>
+          <w:sz w:val="24"/>
+          <w:szCs w:val="24"/>
+        </w:rPr>
+        <w:t xml:space="preserve">3. Princípio da corrosão.</w:t>
+      </w:r>
+      <w:r>
+        <w:rPr>
+          <w:rFonts w:ascii="Times New Roman" w:cs="Times New Roman" w:eastAsia="Times New Roman" w:hAnsi="Times New Roman"/>
+          <w:sz w:val="24"/>
+          <w:szCs w:val="24"/>
+        </w:rPr>
+        <w:t xml:space="preserve"> O que não é elaborado corrói. Não é a dor que destrói a potencialidade, mas a dor sem nome, sem sentido e sem vínculo. Entre os agentes corrosivos, a tríade da sombra — inveja, vaidade e mentira — tem papel central, e a proporção entre elas define o grau de comprometimento psíquico.</w:t>
+      </w:r>
+    </w:p>
+    <w:p>
+      <w:pPr>
+        <w:widowControl/>
+        <w:spacing w:after="0" w:line="330" w:lineRule="exact"/>
+        <w:ind w:firstLine="340"/>
+        <w:jc w:val="both"/>
+      </w:pPr>
+      <w:r>
+        <w:rPr>
+          <w:rFonts w:ascii="Times New Roman" w:cs="Times New Roman" w:eastAsia="Times New Roman" w:hAnsi="Times New Roman"/>
+          <w:b/>
+          <w:bCs/>
+          <w:sz w:val="24"/>
+          <w:szCs w:val="24"/>
+        </w:rPr>
+        <w:t xml:space="preserve">4. Princípio da medida.</w:t>
+      </w:r>
+      <w:r>
+        <w:rPr>
+          <w:rFonts w:ascii="Times New Roman" w:cs="Times New Roman" w:eastAsia="Times New Roman" w:hAnsi="Times New Roman"/>
+          <w:sz w:val="24"/>
+          <w:szCs w:val="24"/>
+        </w:rPr>
+        <w:t xml:space="preserve"> O pleno não é o cheio. Sofre-se pela falta e sofre-se pelo excesso; a plenitude é ritmo, proporção e integração.</w:t>
+      </w:r>
+    </w:p>
+    <w:p>
+      <w:pPr>
+        <w:widowControl/>
+        <w:spacing w:after="0" w:line="330" w:lineRule="exact"/>
+        <w:ind w:firstLine="340"/>
+        <w:jc w:val="both"/>
+      </w:pPr>
+      <w:r>
+        <w:rPr>
+          <w:rFonts w:ascii="Times New Roman" w:cs="Times New Roman" w:eastAsia="Times New Roman" w:hAnsi="Times New Roman"/>
+          <w:b/>
+          <w:bCs/>
+          <w:sz w:val="24"/>
+          <w:szCs w:val="24"/>
+        </w:rPr>
+        <w:t xml:space="preserve">5. Princípio da pulsação.</w:t>
+      </w:r>
+      <w:r>
+        <w:rPr>
+          <w:rFonts w:ascii="Times New Roman" w:cs="Times New Roman" w:eastAsia="Times New Roman" w:hAnsi="Times New Roman"/>
+          <w:sz w:val="24"/>
+          <w:szCs w:val="24"/>
+        </w:rPr>
+        <w:t xml:space="preserve"> Eros e Tânatos convivem em cada ser. O problema não é ter forças de vida e de apagamento, mas não saber qual delas governa a caminhada.</w:t>
+      </w:r>
+    </w:p>
+    <w:p>
+      <w:pPr>
+        <w:widowControl/>
+        <w:spacing w:after="0" w:line="330" w:lineRule="exact"/>
+        <w:ind w:firstLine="340"/>
+        <w:jc w:val="both"/>
+      </w:pPr>
+      <w:r>
+        <w:rPr>
+          <w:rFonts w:ascii="Times New Roman" w:cs="Times New Roman" w:eastAsia="Times New Roman" w:hAnsi="Times New Roman"/>
+          <w:b/>
+          <w:bCs/>
+          <w:sz w:val="24"/>
+          <w:szCs w:val="24"/>
+        </w:rPr>
+        <w:t xml:space="preserve">6. Princípio da perda.</w:t>
+      </w:r>
+      <w:r>
+        <w:rPr>
+          <w:rFonts w:ascii="Times New Roman" w:cs="Times New Roman" w:eastAsia="Times New Roman" w:hAnsi="Times New Roman"/>
+          <w:sz w:val="24"/>
+          <w:szCs w:val="24"/>
+        </w:rPr>
+        <w:t xml:space="preserve"> Toda expansão cobra uma perda. Ninguém teme o que vai ganhar, mas sofre pelo que vai perder; por isso, crescer exige luto.</w:t>
+      </w:r>
+    </w:p>
+    <w:p>
+      <w:pPr>
+        <w:widowControl/>
+        <w:spacing w:after="0" w:line="330" w:lineRule="exact"/>
+        <w:ind w:firstLine="340"/>
+        <w:jc w:val="both"/>
+      </w:pPr>
+      <w:r>
+        <w:rPr>
+          <w:rFonts w:ascii="Times New Roman" w:cs="Times New Roman" w:eastAsia="Times New Roman" w:hAnsi="Times New Roman"/>
+          <w:b/>
+          <w:bCs/>
+          <w:sz w:val="24"/>
+          <w:szCs w:val="24"/>
+        </w:rPr>
+        <w:t xml:space="preserve">7. Princípio do fundamento.</w:t>
+      </w:r>
+      <w:r>
+        <w:rPr>
+          <w:rFonts w:ascii="Times New Roman" w:cs="Times New Roman" w:eastAsia="Times New Roman" w:hAnsi="Times New Roman"/>
+          <w:sz w:val="24"/>
+          <w:szCs w:val="24"/>
+        </w:rPr>
+        <w:t xml:space="preserve"> O reconhecimento confirma; o fundamento sustenta. Quem depende só do olhar alheio vive em oscilação; quem toca o próprio fundamento conquista liberdade.</w:t>
+      </w:r>
+    </w:p>
+    <w:p>
+      <w:pPr>
+        <w:widowControl/>
+        <w:spacing w:after="0" w:line="330" w:lineRule="exact"/>
+        <w:ind w:firstLine="340"/>
+        <w:jc w:val="both"/>
+      </w:pPr>
+      <w:r>
+        <w:rPr>
+          <w:rFonts w:ascii="Times New Roman" w:cs="Times New Roman" w:eastAsia="Times New Roman" w:hAnsi="Times New Roman"/>
+          <w:b/>
+          <w:bCs/>
+          <w:sz w:val="24"/>
+          <w:szCs w:val="24"/>
+        </w:rPr>
+        <w:t xml:space="preserve">8. Princípio da autoria.</w:t>
+      </w:r>
+      <w:r>
+        <w:rPr>
+          <w:rFonts w:ascii="Times New Roman" w:cs="Times New Roman" w:eastAsia="Times New Roman" w:hAnsi="Times New Roman"/>
+          <w:sz w:val="24"/>
+          <w:szCs w:val="24"/>
+        </w:rPr>
+        <w:t xml:space="preserve"> Não importa apenas o que fizeram de nós, mas o que fazemos com o que fizeram de nós. A origem importa, mas não determina o destino.</w:t>
+      </w:r>
+    </w:p>
+    <w:p>
+      <w:pPr>
+        <w:widowControl/>
+        <w:spacing w:after="0" w:line="330" w:lineRule="exact"/>
+        <w:ind w:firstLine="340"/>
+        <w:jc w:val="both"/>
+      </w:pPr>
+      <w:r>
+        <w:rPr>
+          <w:rFonts w:ascii="Times New Roman" w:cs="Times New Roman" w:eastAsia="Times New Roman" w:hAnsi="Times New Roman"/>
+          <w:b/>
+          <w:bCs/>
+          <w:sz w:val="24"/>
+          <w:szCs w:val="24"/>
+        </w:rPr>
+        <w:t xml:space="preserve">9. Princípio da troca.</w:t>
+      </w:r>
+      <w:r>
+        <w:rPr>
+          <w:rFonts w:ascii="Times New Roman" w:cs="Times New Roman" w:eastAsia="Times New Roman" w:hAnsi="Times New Roman"/>
+          <w:sz w:val="24"/>
+          <w:szCs w:val="24"/>
+        </w:rPr>
+        <w:t xml:space="preserve"> O pleno circula. Quem está no vazio suga; quem está no cheio sufoca; quem está no pleno recebe e devolve.</w:t>
+      </w:r>
+    </w:p>
+    <w:p>
+      <w:pPr>
+        <w:widowControl/>
+        <w:spacing w:after="0" w:line="330" w:lineRule="exact"/>
+        <w:ind w:firstLine="340"/>
+        <w:jc w:val="both"/>
+      </w:pPr>
+      <w:r>
+        <w:rPr>
+          <w:rFonts w:ascii="Times New Roman" w:cs="Times New Roman" w:eastAsia="Times New Roman" w:hAnsi="Times New Roman"/>
+          <w:b/>
+          <w:bCs/>
+          <w:sz w:val="24"/>
+          <w:szCs w:val="24"/>
+        </w:rPr>
+        <w:t xml:space="preserve">10. Princípio da transcendência.</w:t>
+      </w:r>
+      <w:r>
+        <w:rPr>
+          <w:rFonts w:ascii="Times New Roman" w:cs="Times New Roman" w:eastAsia="Times New Roman" w:hAnsi="Times New Roman"/>
+          <w:sz w:val="24"/>
+          <w:szCs w:val="24"/>
+        </w:rPr>
+        <w:t xml:space="preserve"> O pleno humano se completa na abertura ao amor que o excede. Não como posse, mas como chamado que transforma.</w:t>
       </w:r>
     </w:p>
     <w:p>
@@ -12480,6 +13016,244 @@
           <w:sz w:val="24"/>
           <w:szCs w:val="24"/>
         </w:rPr>
+        <w:t xml:space="preserve">O caminho do reencontro</w:t>
+      </w:r>
+    </w:p>
+    <w:p>
+      <w:pPr>
+        <w:widowControl/>
+        <w:spacing w:after="0" w:line="330" w:lineRule="exact"/>
+        <w:ind w:firstLine="0"/>
+        <w:jc w:val="both"/>
+      </w:pPr>
+      <w:r>
+        <w:rPr>
+          <w:rFonts w:ascii="Times New Roman" w:cs="Times New Roman" w:eastAsia="Times New Roman" w:hAnsi="Times New Roman"/>
+          <w:sz w:val="24"/>
+          <w:szCs w:val="24"/>
+        </w:rPr>
+        <w:t xml:space="preserve">Se o Pleno Existencial adormece, é possível despertá-lo. A TPE propõe que esse despertar se dá por meio de seis movimentos, que não são etapas rígidas, mas gestos que se repetem e se aprofundam ao longo da vida.</w:t>
+      </w:r>
+    </w:p>
+    <w:p>
+      <w:pPr>
+        <w:widowControl/>
+        <w:spacing w:after="0" w:line="330" w:lineRule="exact"/>
+        <w:ind w:firstLine="340"/>
+        <w:jc w:val="both"/>
+      </w:pPr>
+      <w:r>
+        <w:rPr>
+          <w:rFonts w:ascii="Times New Roman" w:cs="Times New Roman" w:eastAsia="Times New Roman" w:hAnsi="Times New Roman"/>
+          <w:sz w:val="24"/>
+          <w:szCs w:val="24"/>
+        </w:rPr>
+        <w:t xml:space="preserve">O primeiro movimento é </w:t>
+      </w:r>
+      <w:r>
+        <w:rPr>
+          <w:rFonts w:ascii="Times New Roman" w:cs="Times New Roman" w:eastAsia="Times New Roman" w:hAnsi="Times New Roman"/>
+          <w:b/>
+          <w:bCs/>
+          <w:sz w:val="24"/>
+          <w:szCs w:val="24"/>
+        </w:rPr>
+        <w:t xml:space="preserve">nomear</w:t>
+      </w:r>
+      <w:r>
+        <w:rPr>
+          <w:rFonts w:ascii="Times New Roman" w:cs="Times New Roman" w:eastAsia="Times New Roman" w:hAnsi="Times New Roman"/>
+          <w:sz w:val="24"/>
+          <w:szCs w:val="24"/>
+        </w:rPr>
+        <w:t xml:space="preserve">. Aquilo que não tem nome governa em silêncio. Nomear a ferida, o medo, a carência, a máscara e, sobretudo, a inveja, a vaidade e a mentira é o primeiro passo para deixar de ser comandado por elas. Por isso, a honestidade consigo mesmo é a porta de entrada de toda transformação.</w:t>
+      </w:r>
+    </w:p>
+    <w:p>
+      <w:pPr>
+        <w:widowControl/>
+        <w:spacing w:after="0" w:line="330" w:lineRule="exact"/>
+        <w:ind w:firstLine="340"/>
+        <w:jc w:val="both"/>
+      </w:pPr>
+      <w:r>
+        <w:rPr>
+          <w:rFonts w:ascii="Times New Roman" w:cs="Times New Roman" w:eastAsia="Times New Roman" w:hAnsi="Times New Roman"/>
+          <w:sz w:val="24"/>
+          <w:szCs w:val="24"/>
+        </w:rPr>
+        <w:t xml:space="preserve">O segundo movimento é </w:t>
+      </w:r>
+      <w:r>
+        <w:rPr>
+          <w:rFonts w:ascii="Times New Roman" w:cs="Times New Roman" w:eastAsia="Times New Roman" w:hAnsi="Times New Roman"/>
+          <w:b/>
+          <w:bCs/>
+          <w:sz w:val="24"/>
+          <w:szCs w:val="24"/>
+        </w:rPr>
+        <w:t xml:space="preserve">elaborar</w:t>
+      </w:r>
+      <w:r>
+        <w:rPr>
+          <w:rFonts w:ascii="Times New Roman" w:cs="Times New Roman" w:eastAsia="Times New Roman" w:hAnsi="Times New Roman"/>
+          <w:sz w:val="24"/>
+          <w:szCs w:val="24"/>
+        </w:rPr>
+        <w:t xml:space="preserve">. Nomear não basta; é preciso atravessar. Elaborar é permitir que a dor seja sentida, chorada e compreendida, em vez de apenas evitada. É fazer o luto do que não aconteceu, do amor que não veio, da infância que poderia ter sido diferente. Muitas vezes, esse movimento exige companhia: de um terapeuta, de um guia espiritual, de um grupo, de um amigo que saiba escutar.</w:t>
+      </w:r>
+    </w:p>
+    <w:p>
+      <w:pPr>
+        <w:widowControl/>
+        <w:spacing w:after="0" w:line="330" w:lineRule="exact"/>
+        <w:ind w:firstLine="340"/>
+        <w:jc w:val="both"/>
+      </w:pPr>
+      <w:r>
+        <w:rPr>
+          <w:rFonts w:ascii="Times New Roman" w:cs="Times New Roman" w:eastAsia="Times New Roman" w:hAnsi="Times New Roman"/>
+          <w:sz w:val="24"/>
+          <w:szCs w:val="24"/>
+        </w:rPr>
+        <w:t xml:space="preserve">O terceiro movimento é </w:t>
+      </w:r>
+      <w:r>
+        <w:rPr>
+          <w:rFonts w:ascii="Times New Roman" w:cs="Times New Roman" w:eastAsia="Times New Roman" w:hAnsi="Times New Roman"/>
+          <w:b/>
+          <w:bCs/>
+          <w:sz w:val="24"/>
+          <w:szCs w:val="24"/>
+        </w:rPr>
+        <w:t xml:space="preserve">ressignificar</w:t>
+      </w:r>
+      <w:r>
+        <w:rPr>
+          <w:rFonts w:ascii="Times New Roman" w:cs="Times New Roman" w:eastAsia="Times New Roman" w:hAnsi="Times New Roman"/>
+          <w:sz w:val="24"/>
+          <w:szCs w:val="24"/>
+        </w:rPr>
+        <w:t xml:space="preserve">. Uma vez atravessada, a dor pode ganhar outro lugar na história. Ela deixa de ser sentença e passa a ser matéria. A rejeição pode se transformar em discernimento; a frustração, em paciência; a perda, em compaixão. Ressignificar não é fingir que a dor foi boa, mas descobrir o que ela pode ensinar.</w:t>
+      </w:r>
+    </w:p>
+    <w:p>
+      <w:pPr>
+        <w:widowControl/>
+        <w:spacing w:after="0" w:line="330" w:lineRule="exact"/>
+        <w:ind w:firstLine="340"/>
+        <w:jc w:val="both"/>
+      </w:pPr>
+      <w:r>
+        <w:rPr>
+          <w:rFonts w:ascii="Times New Roman" w:cs="Times New Roman" w:eastAsia="Times New Roman" w:hAnsi="Times New Roman"/>
+          <w:sz w:val="24"/>
+          <w:szCs w:val="24"/>
+        </w:rPr>
+        <w:t xml:space="preserve">O quarto movimento é </w:t>
+      </w:r>
+      <w:r>
+        <w:rPr>
+          <w:rFonts w:ascii="Times New Roman" w:cs="Times New Roman" w:eastAsia="Times New Roman" w:hAnsi="Times New Roman"/>
+          <w:b/>
+          <w:bCs/>
+          <w:sz w:val="24"/>
+          <w:szCs w:val="24"/>
+        </w:rPr>
+        <w:t xml:space="preserve">escolher</w:t>
+      </w:r>
+      <w:r>
+        <w:rPr>
+          <w:rFonts w:ascii="Times New Roman" w:cs="Times New Roman" w:eastAsia="Times New Roman" w:hAnsi="Times New Roman"/>
+          <w:sz w:val="24"/>
+          <w:szCs w:val="24"/>
+        </w:rPr>
+        <w:t xml:space="preserve">. É aqui que a autoria se manifesta. Diante da própria história, o sujeito decide quais vozes continuará ouvindo, quais vínculos manterá, quais caminhos seguirá. Toda escolha implica perda, e por isso exige coragem. Mas é a escolha que transforma a compreensão em vida.</w:t>
+      </w:r>
+    </w:p>
+    <w:p>
+      <w:pPr>
+        <w:widowControl/>
+        <w:spacing w:after="0" w:line="330" w:lineRule="exact"/>
+        <w:ind w:firstLine="340"/>
+        <w:jc w:val="both"/>
+      </w:pPr>
+      <w:r>
+        <w:rPr>
+          <w:rFonts w:ascii="Times New Roman" w:cs="Times New Roman" w:eastAsia="Times New Roman" w:hAnsi="Times New Roman"/>
+          <w:sz w:val="24"/>
+          <w:szCs w:val="24"/>
+        </w:rPr>
+        <w:t xml:space="preserve">O quinto movimento é </w:t>
+      </w:r>
+      <w:r>
+        <w:rPr>
+          <w:rFonts w:ascii="Times New Roman" w:cs="Times New Roman" w:eastAsia="Times New Roman" w:hAnsi="Times New Roman"/>
+          <w:b/>
+          <w:bCs/>
+          <w:sz w:val="24"/>
+          <w:szCs w:val="24"/>
+        </w:rPr>
+        <w:t xml:space="preserve">habitar</w:t>
+      </w:r>
+      <w:r>
+        <w:rPr>
+          <w:rFonts w:ascii="Times New Roman" w:cs="Times New Roman" w:eastAsia="Times New Roman" w:hAnsi="Times New Roman"/>
+          <w:sz w:val="24"/>
+          <w:szCs w:val="24"/>
+        </w:rPr>
+        <w:t xml:space="preserve">. O pleno não é um lugar a que se chega uma vez, mas uma morada que se aprende a ocupar. Habitar é viver com presença no próprio corpo, no próprio tempo, nas próprias relações. É respeitar o ritmo, descansar, silenciar, cuidar da medida.</w:t>
+      </w:r>
+    </w:p>
+    <w:p>
+      <w:pPr>
+        <w:widowControl/>
+        <w:spacing w:after="0" w:line="330" w:lineRule="exact"/>
+        <w:ind w:firstLine="340"/>
+        <w:jc w:val="both"/>
+      </w:pPr>
+      <w:r>
+        <w:rPr>
+          <w:rFonts w:ascii="Times New Roman" w:cs="Times New Roman" w:eastAsia="Times New Roman" w:hAnsi="Times New Roman"/>
+          <w:sz w:val="24"/>
+          <w:szCs w:val="24"/>
+        </w:rPr>
+        <w:t xml:space="preserve">O sexto movimento é </w:t>
+      </w:r>
+      <w:r>
+        <w:rPr>
+          <w:rFonts w:ascii="Times New Roman" w:cs="Times New Roman" w:eastAsia="Times New Roman" w:hAnsi="Times New Roman"/>
+          <w:b/>
+          <w:bCs/>
+          <w:sz w:val="24"/>
+          <w:szCs w:val="24"/>
+        </w:rPr>
+        <w:t xml:space="preserve">frutificar</w:t>
+      </w:r>
+      <w:r>
+        <w:rPr>
+          <w:rFonts w:ascii="Times New Roman" w:cs="Times New Roman" w:eastAsia="Times New Roman" w:hAnsi="Times New Roman"/>
+          <w:sz w:val="24"/>
+          <w:szCs w:val="24"/>
+        </w:rPr>
+        <w:t xml:space="preserve">. Quem reencontra a própria plenitude não a guarda para si. Torna-se parteiro de outros, oferece presença, interrompe correntes de dor, deixa legado. O pleno, quando desperta, transborda — não como excesso, mas como fruto. E é nesse transbordar que a vida individual encontra o seu sentido mais amplo.</w:t>
+      </w:r>
+    </w:p>
+    <w:p>
+      <w:pPr>
+        <w:keepNext/>
+        <w:keepLines/>
+        <w:spacing w:after="160" w:before="400"/>
+      </w:pPr>
+      <w:r>
+        <w:rPr>
+          <w:rFonts w:ascii="Times New Roman" w:cs="Times New Roman" w:eastAsia="Times New Roman" w:hAnsi="Times New Roman"/>
+          <w:b/>
+          <w:bCs/>
+          <w:smallCaps/>
+          <w:sz w:val="24"/>
+          <w:szCs w:val="24"/>
+        </w:rPr>
         <w:t xml:space="preserve">O que a TPE não é</w:t>
       </w:r>
     </w:p>
@@ -12496,7 +13270,7 @@
           <w:sz w:val="24"/>
           <w:szCs w:val="24"/>
         </w:rPr>
-        <w:t xml:space="preserve">Para evitar equívocos, é importante dizer também o que a Teoria do Pleno Existencial não é. Ela não é uma promessa de felicidade permanente: o pleno convive com a dor, a perda e o limite. Não é um discurso de autoajuda que culpa o sujeito por não ter superado tudo: ela reconhece o peso da origem, das desigualdades e das feridas que ninguém escolheu. Não é um substituto para tratamento psicológico, psiquiátrico ou médico: quando há sofrimento intenso, a busca por ajuda profissional é, ela mesma, um gesto de parteiro. E não é uma doutrina religiosa fechada: dialoga com a espiritualidade, especialmente com a experiência do amor ágape, mas permanece aberta a cada pessoa em sua própria fé e em seu próprio caminho.</w:t>
+        <w:t xml:space="preserve">Para evitar equívocos, é importante dizer também o que a Teoria do Pleno Existencial não é. Ela não é uma promessa de felicidade permanente: o pleno convive com a dor, a perda e o limite. Não é um discurso de autoajuda que culpa o sujeito por não ter superado tudo: ela reconhece o peso da origem, das desigualdades e das feridas que ninguém escolheu. Não é um instrumento de diagnóstico: quando fala em grau de comprometimento psíquico, oferece uma chave de leitura para o autoconhecimento, e não uma avaliação clínica. Também não é um substituto para tratamento psicológico, psiquiátrico ou médico: quando há sofrimento intenso, a busca por ajuda profissional é, ela mesma, um gesto de parteiro. E não é uma doutrina religiosa fechada: dialoga com a espiritualidade, especialmente com a experiência do amor ágape, mas permanece aberta a cada pessoa em sua própria fé e em seu próprio caminho.</w:t>
       </w:r>
     </w:p>
     <w:p>
@@ -12985,7 +13759,7 @@
           <w:sz w:val="24"/>
           <w:szCs w:val="24"/>
         </w:rPr>
-        <w:t xml:space="preserve"> Quando sinto inveja, o que exatamente ela revela sobre aquilo que eu ainda não me permiti ser?</w:t>
+        <w:t xml:space="preserve"> Das três energias da sombra — inveja, vaidade e mentira —, qual ocupa hoje o maior espaço em mim? Como ela se mistura com as outras duas?</w:t>
       </w:r>
     </w:p>
     <w:p>
@@ -13011,6 +13785,84 @@
           <w:sz w:val="24"/>
           <w:szCs w:val="24"/>
         </w:rPr>
+        <w:t xml:space="preserve"> Quando sinto inveja, ela se parece mais com a cobiça, que quer tomar, ou com a admiração disfarçada, que quer copiar e possuir?</w:t>
+      </w:r>
+    </w:p>
+    <w:p>
+      <w:pPr>
+        <w:widowControl/>
+        <w:spacing w:after="0" w:line="330" w:lineRule="exact"/>
+        <w:ind w:firstLine="340"/>
+        <w:jc w:val="both"/>
+      </w:pPr>
+      <w:r>
+        <w:rPr>
+          <w:rFonts w:ascii="Times New Roman" w:cs="Times New Roman" w:eastAsia="Times New Roman" w:hAnsi="Times New Roman"/>
+          <w:b/>
+          <w:bCs/>
+          <w:sz w:val="24"/>
+          <w:szCs w:val="24"/>
+        </w:rPr>
+        <w:t xml:space="preserve">5.</w:t>
+      </w:r>
+      <w:r>
+        <w:rPr>
+          <w:rFonts w:ascii="Times New Roman" w:cs="Times New Roman" w:eastAsia="Times New Roman" w:hAnsi="Times New Roman"/>
+          <w:sz w:val="24"/>
+          <w:szCs w:val="24"/>
+        </w:rPr>
+        <w:t xml:space="preserve"> Em que áreas da minha vida entrei no looping da vaidade: quanto mais me destaco, mais preciso me destacar?</w:t>
+      </w:r>
+    </w:p>
+    <w:p>
+      <w:pPr>
+        <w:widowControl/>
+        <w:spacing w:after="0" w:line="330" w:lineRule="exact"/>
+        <w:ind w:firstLine="340"/>
+        <w:jc w:val="both"/>
+      </w:pPr>
+      <w:r>
+        <w:rPr>
+          <w:rFonts w:ascii="Times New Roman" w:cs="Times New Roman" w:eastAsia="Times New Roman" w:hAnsi="Times New Roman"/>
+          <w:b/>
+          <w:bCs/>
+          <w:sz w:val="24"/>
+          <w:szCs w:val="24"/>
+        </w:rPr>
+        <w:t xml:space="preserve">6.</w:t>
+      </w:r>
+      <w:r>
+        <w:rPr>
+          <w:rFonts w:ascii="Times New Roman" w:cs="Times New Roman" w:eastAsia="Times New Roman" w:hAnsi="Times New Roman"/>
+          <w:sz w:val="24"/>
+          <w:szCs w:val="24"/>
+        </w:rPr>
+        <w:t xml:space="preserve"> Que mentira — contada aos outros ou a mim mesmo — preciso continuar confirmando para que uma verdade não venha à tona?</w:t>
+      </w:r>
+    </w:p>
+    <w:p>
+      <w:pPr>
+        <w:widowControl/>
+        <w:spacing w:after="0" w:line="330" w:lineRule="exact"/>
+        <w:ind w:firstLine="340"/>
+        <w:jc w:val="both"/>
+      </w:pPr>
+      <w:r>
+        <w:rPr>
+          <w:rFonts w:ascii="Times New Roman" w:cs="Times New Roman" w:eastAsia="Times New Roman" w:hAnsi="Times New Roman"/>
+          <w:b/>
+          <w:bCs/>
+          <w:sz w:val="24"/>
+          <w:szCs w:val="24"/>
+        </w:rPr>
+        <w:t xml:space="preserve">7.</w:t>
+      </w:r>
+      <w:r>
+        <w:rPr>
+          <w:rFonts w:ascii="Times New Roman" w:cs="Times New Roman" w:eastAsia="Times New Roman" w:hAnsi="Times New Roman"/>
+          <w:sz w:val="24"/>
+          <w:szCs w:val="24"/>
+        </w:rPr>
         <w:t xml:space="preserve"> Em que situações o meu cuidado com os outros pode estar servindo para me esconder das minhas próprias feridas?</w:t>
       </w:r>
     </w:p>
@@ -13029,7 +13881,7 @@
           <w:sz w:val="24"/>
           <w:szCs w:val="24"/>
         </w:rPr>
-        <w:t xml:space="preserve">5.</w:t>
+        <w:t xml:space="preserve">8.</w:t>
       </w:r>
       <w:r>
         <w:rPr>
@@ -13055,7 +13907,7 @@
           <w:sz w:val="24"/>
           <w:szCs w:val="24"/>
         </w:rPr>
-        <w:t xml:space="preserve">6.</w:t>
+        <w:t xml:space="preserve">9.</w:t>
       </w:r>
       <w:r>
         <w:rPr>

</xml_diff>

<commit_message>
Livro: novo capítulo 17 sobre ganho e perda secundários
- Novo capítulo 'Quando ganhar é perder e perder é ganhar' após 'O custo
  da transformação', com os exemplos do autor (vice-campeão, cabo e
  sargento, pai e filho) e novos exemplos
- Capítulos seguintes renumerados (18 a 30) e sumário atualizado
- Princípio da perda (TPE) e Apêndice ampliados com o tema
- Livro regerado em 14 x 21 cm (199 páginas)

Co-Authored-By: Claude Opus 5.5 <noreply@anthropic.com>
Claude-Session: https://claude.ai/code/session_01BrurxSYygRC3rRhaUYosm1
</commit_message>
<xml_diff>
--- a/docs/livro/O_PLENO_EXISTENCIAL.docx
+++ b/docs/livro/O_PLENO_EXISTENCIAL.docx
@@ -842,7 +842,7 @@
           <w:sz w:val="20"/>
           <w:szCs w:val="20"/>
         </w:rPr>
-        <w:t xml:space="preserve">17. O envelhecimento subjetivo antes da velhice</w:t>
+        <w:t xml:space="preserve">17. Quando ganhar é perder e perder é ganhar</w:t>
       </w:r>
       <w:r>
         <w:rPr>
@@ -852,6 +852,33 @@
         </w:rPr>
         <w:tab/>
         <w:t xml:space="preserve">120</w:t>
+      </w:r>
+    </w:p>
+    <w:p>
+      <w:pPr>
+        <w:keepNext w:val="false"/>
+        <w:tabs>
+          <w:tab w:val="right" w:pos="5670" w:leader="dot"/>
+        </w:tabs>
+        <w:spacing w:after="40" w:before="40"/>
+        <w:ind w:left="510" w:hanging="284"/>
+      </w:pPr>
+      <w:r>
+        <w:rPr>
+          <w:rFonts w:ascii="Times New Roman" w:cs="Times New Roman" w:eastAsia="Times New Roman" w:hAnsi="Times New Roman"/>
+          <w:sz w:val="20"/>
+          <w:szCs w:val="20"/>
+        </w:rPr>
+        <w:t xml:space="preserve">18. O envelhecimento subjetivo antes da velhice</w:t>
+      </w:r>
+      <w:r>
+        <w:rPr>
+          <w:rFonts w:ascii="Times New Roman" w:cs="Times New Roman" w:eastAsia="Times New Roman" w:hAnsi="Times New Roman"/>
+          <w:sz w:val="20"/>
+          <w:szCs w:val="20"/>
+        </w:rPr>
+        <w:tab/>
+        <w:t xml:space="preserve">128</w:t>
       </w:r>
     </w:p>
     <w:p>
@@ -889,7 +916,7 @@
           <w:sz w:val="20"/>
           <w:szCs w:val="20"/>
         </w:rPr>
-        <w:t xml:space="preserve">18. A velhice e a colheita da existência</w:t>
+        <w:t xml:space="preserve">19. A velhice e a colheita da existência</w:t>
       </w:r>
       <w:r>
         <w:rPr>
@@ -898,7 +925,7 @@
           <w:szCs w:val="20"/>
         </w:rPr>
         <w:tab/>
-        <w:t xml:space="preserve">125</w:t>
+        <w:t xml:space="preserve">133</w:t>
       </w:r>
     </w:p>
     <w:p>
@@ -916,7 +943,7 @@
           <w:sz w:val="20"/>
           <w:szCs w:val="20"/>
         </w:rPr>
-        <w:t xml:space="preserve">19. A colheita das relações e dos vínculos</w:t>
+        <w:t xml:space="preserve">20. A colheita das relações e dos vínculos</w:t>
       </w:r>
       <w:r>
         <w:rPr>
@@ -925,7 +952,7 @@
           <w:szCs w:val="20"/>
         </w:rPr>
         <w:tab/>
-        <w:t xml:space="preserve">131</w:t>
+        <w:t xml:space="preserve">139</w:t>
       </w:r>
     </w:p>
     <w:p>
@@ -943,7 +970,7 @@
           <w:sz w:val="20"/>
           <w:szCs w:val="20"/>
         </w:rPr>
-        <w:t xml:space="preserve">20. O corpo, o tempo e os limites da matéria</w:t>
+        <w:t xml:space="preserve">21. O corpo, o tempo e os limites da matéria</w:t>
       </w:r>
       <w:r>
         <w:rPr>
@@ -952,7 +979,7 @@
           <w:szCs w:val="20"/>
         </w:rPr>
         <w:tab/>
-        <w:t xml:space="preserve">135</w:t>
+        <w:t xml:space="preserve">143</w:t>
       </w:r>
     </w:p>
     <w:p>
@@ -970,7 +997,7 @@
           <w:sz w:val="20"/>
           <w:szCs w:val="20"/>
         </w:rPr>
-        <w:t xml:space="preserve">21. A solidão, o abandono e a revisão da própria vida</w:t>
+        <w:t xml:space="preserve">22. A solidão, o abandono e a revisão da própria vida</w:t>
       </w:r>
       <w:r>
         <w:rPr>
@@ -979,7 +1006,7 @@
           <w:szCs w:val="20"/>
         </w:rPr>
         <w:tab/>
-        <w:t xml:space="preserve">139</w:t>
+        <w:t xml:space="preserve">147</w:t>
       </w:r>
     </w:p>
     <w:p>
@@ -997,7 +1024,7 @@
           <w:sz w:val="20"/>
           <w:szCs w:val="20"/>
         </w:rPr>
-        <w:t xml:space="preserve">22. A colheita final da maturidade</w:t>
+        <w:t xml:space="preserve">23. A colheita final da maturidade</w:t>
       </w:r>
       <w:r>
         <w:rPr>
@@ -1006,7 +1033,7 @@
           <w:szCs w:val="20"/>
         </w:rPr>
         <w:tab/>
-        <w:t xml:space="preserve">143</w:t>
+        <w:t xml:space="preserve">151</w:t>
       </w:r>
     </w:p>
     <w:p>
@@ -1024,7 +1051,7 @@
           <w:sz w:val="20"/>
           <w:szCs w:val="20"/>
         </w:rPr>
-        <w:t xml:space="preserve">23. O legado e a permanência invisível</w:t>
+        <w:t xml:space="preserve">24. O legado e a permanência invisível</w:t>
       </w:r>
       <w:r>
         <w:rPr>
@@ -1033,7 +1060,7 @@
           <w:szCs w:val="20"/>
         </w:rPr>
         <w:tab/>
-        <w:t xml:space="preserve">146</w:t>
+        <w:t xml:space="preserve">154</w:t>
       </w:r>
     </w:p>
     <w:p>
@@ -1071,7 +1098,7 @@
           <w:sz w:val="20"/>
           <w:szCs w:val="20"/>
         </w:rPr>
-        <w:t xml:space="preserve">24. O amor: vínculo e desejo</w:t>
+        <w:t xml:space="preserve">25. O amor: vínculo e desejo</w:t>
       </w:r>
       <w:r>
         <w:rPr>
@@ -1080,7 +1107,7 @@
           <w:szCs w:val="20"/>
         </w:rPr>
         <w:tab/>
-        <w:t xml:space="preserve">150</w:t>
+        <w:t xml:space="preserve">158</w:t>
       </w:r>
     </w:p>
     <w:p>
@@ -1098,7 +1125,7 @@
           <w:sz w:val="20"/>
           <w:szCs w:val="20"/>
         </w:rPr>
-        <w:t xml:space="preserve">25. O amor ágape e o pleno em Deus</w:t>
+        <w:t xml:space="preserve">26. O amor ágape e o pleno em Deus</w:t>
       </w:r>
       <w:r>
         <w:rPr>
@@ -1107,7 +1134,7 @@
           <w:szCs w:val="20"/>
         </w:rPr>
         <w:tab/>
-        <w:t xml:space="preserve">155</w:t>
+        <w:t xml:space="preserve">163</w:t>
       </w:r>
     </w:p>
     <w:p>
@@ -1125,7 +1152,7 @@
           <w:sz w:val="20"/>
           <w:szCs w:val="20"/>
         </w:rPr>
-        <w:t xml:space="preserve">26. A continuidade da consciência</w:t>
+        <w:t xml:space="preserve">27. A continuidade da consciência</w:t>
       </w:r>
       <w:r>
         <w:rPr>
@@ -1134,7 +1161,7 @@
           <w:szCs w:val="20"/>
         </w:rPr>
         <w:tab/>
-        <w:t xml:space="preserve">160</w:t>
+        <w:t xml:space="preserve">168</w:t>
       </w:r>
     </w:p>
     <w:p>
@@ -1152,7 +1179,7 @@
           <w:sz w:val="20"/>
           <w:szCs w:val="20"/>
         </w:rPr>
-        <w:t xml:space="preserve">27. O silêncio que resta</w:t>
+        <w:t xml:space="preserve">28. O silêncio que resta</w:t>
       </w:r>
       <w:r>
         <w:rPr>
@@ -1161,7 +1188,7 @@
           <w:szCs w:val="20"/>
         </w:rPr>
         <w:tab/>
-        <w:t xml:space="preserve">163</w:t>
+        <w:t xml:space="preserve">171</w:t>
       </w:r>
     </w:p>
     <w:p>
@@ -1179,7 +1206,7 @@
           <w:sz w:val="20"/>
           <w:szCs w:val="20"/>
         </w:rPr>
-        <w:t xml:space="preserve">28. TPE — A Teoria do Pleno Existencial</w:t>
+        <w:t xml:space="preserve">29. TPE — A Teoria do Pleno Existencial</w:t>
       </w:r>
       <w:r>
         <w:rPr>
@@ -1188,7 +1215,7 @@
           <w:szCs w:val="20"/>
         </w:rPr>
         <w:tab/>
-        <w:t xml:space="preserve">166</w:t>
+        <w:t xml:space="preserve">174</w:t>
       </w:r>
     </w:p>
     <w:p>
@@ -1206,7 +1233,7 @@
           <w:sz w:val="20"/>
           <w:szCs w:val="20"/>
         </w:rPr>
-        <w:t xml:space="preserve">29. O retorno ao pleno</w:t>
+        <w:t xml:space="preserve">30. O retorno ao pleno</w:t>
       </w:r>
       <w:r>
         <w:rPr>
@@ -1215,7 +1242,7 @@
           <w:szCs w:val="20"/>
         </w:rPr>
         <w:tab/>
-        <w:t xml:space="preserve">177</w:t>
+        <w:t xml:space="preserve">185</w:t>
       </w:r>
     </w:p>
     <w:p>
@@ -1242,7 +1269,7 @@
           <w:szCs w:val="20"/>
         </w:rPr>
         <w:tab/>
-        <w:t xml:space="preserve">180</w:t>
+        <w:t xml:space="preserve">188</w:t>
       </w:r>
     </w:p>
     <w:p>
@@ -1269,7 +1296,7 @@
           <w:szCs w:val="20"/>
         </w:rPr>
         <w:tab/>
-        <w:t xml:space="preserve">182</w:t>
+        <w:t xml:space="preserve">190</w:t>
       </w:r>
     </w:p>
     <w:p>
@@ -8657,6 +8684,587 @@
           <w:sz w:val="34"/>
           <w:szCs w:val="34"/>
         </w:rPr>
+        <w:t xml:space="preserve">Quando ganhar é perder e perder é ganhar</w:t>
+      </w:r>
+    </w:p>
+    <w:p>
+      <w:pPr>
+        <w:widowControl/>
+        <w:spacing w:after="0" w:line="330" w:lineRule="exact"/>
+        <w:ind w:firstLine="0"/>
+        <w:jc w:val="both"/>
+      </w:pPr>
+      <w:r>
+        <w:rPr>
+          <w:rFonts w:ascii="Times New Roman" w:cs="Times New Roman" w:eastAsia="Times New Roman" w:hAnsi="Times New Roman"/>
+          <w:sz w:val="24"/>
+          <w:szCs w:val="24"/>
+        </w:rPr>
+        <w:t xml:space="preserve">Existe uma dinâmica silenciosa no conflito social e pessoal que quase ninguém nomeia, embora todos a vivam. É a dança entre o ganho secundário e a perda secundária. Ela carrega uma realidade subjetiva cruel, porque inverte o sentido dos resultados. Em certas situações ganhar é perder, e perder é ganhar, desde que se olhe com atenção para o que está por trás do placar.</w:t>
+      </w:r>
+    </w:p>
+    <w:p>
+      <w:pPr>
+        <w:widowControl/>
+        <w:spacing w:after="0" w:line="330" w:lineRule="exact"/>
+        <w:ind w:firstLine="340"/>
+        <w:jc w:val="both"/>
+      </w:pPr>
+      <w:r>
+        <w:rPr>
+          <w:rFonts w:ascii="Times New Roman" w:cs="Times New Roman" w:eastAsia="Times New Roman" w:hAnsi="Times New Roman"/>
+          <w:sz w:val="24"/>
+          <w:szCs w:val="24"/>
+        </w:rPr>
+        <w:t xml:space="preserve">Na superfície tudo parece em ordem. Quem vence uma partida comemora, sente alegria e confirma o próprio valor. Quem perde sente tristeza e frustração. Os resultados ficam dentro do esperado e ninguém estranha nada. A vida, porém, funciona em mais de uma camada, e debaixo do resultado visível costumam correr intenções, cálculos e necessidades que ninguém diz em voz alta. Algumas são inconfessáveis, outras nem chegam à consciência de quem as carrega. Ficam no nível do subliminar e, mesmo sem nome, conduzem escolhas.</w:t>
+      </w:r>
+    </w:p>
+    <w:p>
+      <w:pPr>
+        <w:widowControl/>
+        <w:spacing w:after="0" w:line="330" w:lineRule="exact"/>
+        <w:ind w:firstLine="340"/>
+        <w:jc w:val="both"/>
+      </w:pPr>
+      <w:r>
+        <w:rPr>
+          <w:rFonts w:ascii="Times New Roman" w:cs="Times New Roman" w:eastAsia="Times New Roman" w:hAnsi="Times New Roman"/>
+          <w:sz w:val="24"/>
+          <w:szCs w:val="24"/>
+        </w:rPr>
+        <w:t xml:space="preserve">Chamo de ganho secundário aquilo que uma perda aparente oferece por baixo do pano: proteção, conforto, atenção, segurança ou alívio. Chamo de perda secundária o preço escondido que uma vitória aparente cobra depois, quando a festa já acabou. A primeira explica por que tanta gente permanece em lugares que, vistos de fora, parecem derrota. A segunda explica por que tantas conquistas terminam em arrependimento.</w:t>
+      </w:r>
+    </w:p>
+    <w:p>
+      <w:pPr>
+        <w:keepNext/>
+        <w:keepLines/>
+        <w:spacing w:after="160" w:before="400"/>
+      </w:pPr>
+      <w:r>
+        <w:rPr>
+          <w:rFonts w:ascii="Times New Roman" w:cs="Times New Roman" w:eastAsia="Times New Roman" w:hAnsi="Times New Roman"/>
+          <w:b/>
+          <w:bCs/>
+          <w:smallCaps/>
+          <w:sz w:val="24"/>
+          <w:szCs w:val="24"/>
+        </w:rPr>
+        <w:t xml:space="preserve">O que o placar não mostra</w:t>
+      </w:r>
+    </w:p>
+    <w:p>
+      <w:pPr>
+        <w:widowControl/>
+        <w:spacing w:after="0" w:line="330" w:lineRule="exact"/>
+        <w:ind w:firstLine="0"/>
+        <w:jc w:val="both"/>
+      </w:pPr>
+      <w:r>
+        <w:rPr>
+          <w:rFonts w:ascii="Times New Roman" w:cs="Times New Roman" w:eastAsia="Times New Roman" w:hAnsi="Times New Roman"/>
+          <w:sz w:val="24"/>
+          <w:szCs w:val="24"/>
+        </w:rPr>
+        <w:t xml:space="preserve">O futebol oferece um retrato fácil de entender. Imagine um time que, campeonato após campeonato, termina na segunda colocação da série em que joga e nunca chega ao acesso. A torcida reclama e a imprensa fala em falta de ambição. Por trás disso pode haver um cálculo que ninguém admite. Como vice, o clube arrecada bem, mantém o elenco, paga as contas e segue respeitado. Se subisse, enfrentaria equipes muito mais estruturadas, colecionaria derrotas, perderia receita e correria o risco de cair de novo em pior situação. Ficar em segundo, nesse caso, protege.</w:t>
+      </w:r>
+    </w:p>
+    <w:p>
+      <w:pPr>
+        <w:widowControl/>
+        <w:spacing w:after="0" w:line="330" w:lineRule="exact"/>
+        <w:ind w:firstLine="340"/>
+        <w:jc w:val="both"/>
+      </w:pPr>
+      <w:r>
+        <w:rPr>
+          <w:rFonts w:ascii="Times New Roman" w:cs="Times New Roman" w:eastAsia="Times New Roman" w:hAnsi="Times New Roman"/>
+          <w:sz w:val="24"/>
+          <w:szCs w:val="24"/>
+        </w:rPr>
+        <w:t xml:space="preserve">O caminho inverso também existe. O time que vive como lanterna na série superior, apanhando rodada após rodada, às vezes encontra na queda um alívio inesperado. Na série de baixo volta a vencer, reencontra a autoestima, enche o estádio e termina campeão. O rebaixamento, que parecia vergonha, devolveu ao clube a alegria de jogar.</w:t>
+      </w:r>
+    </w:p>
+    <w:p>
+      <w:pPr>
+        <w:widowControl/>
+        <w:spacing w:after="0" w:line="330" w:lineRule="exact"/>
+        <w:ind w:firstLine="340"/>
+        <w:jc w:val="both"/>
+      </w:pPr>
+      <w:r>
+        <w:rPr>
+          <w:rFonts w:ascii="Times New Roman" w:cs="Times New Roman" w:eastAsia="Times New Roman" w:hAnsi="Times New Roman"/>
+          <w:sz w:val="24"/>
+          <w:szCs w:val="24"/>
+        </w:rPr>
+        <w:t xml:space="preserve">O que vale para os clubes vale para as pessoas. Muitas posições que parecem estagnação são, na verdade, abrigo. E muitas subidas que parecem triunfo levam a pessoa a um lugar onde ela vai sofrer como nunca sofreu.</w:t>
+      </w:r>
+    </w:p>
+    <w:p>
+      <w:pPr>
+        <w:keepNext/>
+        <w:keepLines/>
+        <w:spacing w:after="160" w:before="400"/>
+      </w:pPr>
+      <w:r>
+        <w:rPr>
+          <w:rFonts w:ascii="Times New Roman" w:cs="Times New Roman" w:eastAsia="Times New Roman" w:hAnsi="Times New Roman"/>
+          <w:b/>
+          <w:bCs/>
+          <w:smallCaps/>
+          <w:sz w:val="24"/>
+          <w:szCs w:val="24"/>
+        </w:rPr>
+        <w:t xml:space="preserve">A promoção que custou a paz</w:t>
+      </w:r>
+    </w:p>
+    <w:p>
+      <w:pPr>
+        <w:widowControl/>
+        <w:spacing w:after="0" w:line="330" w:lineRule="exact"/>
+        <w:ind w:firstLine="0"/>
+        <w:jc w:val="both"/>
+      </w:pPr>
+      <w:r>
+        <w:rPr>
+          <w:rFonts w:ascii="Times New Roman" w:cs="Times New Roman" w:eastAsia="Times New Roman" w:hAnsi="Times New Roman"/>
+          <w:sz w:val="24"/>
+          <w:szCs w:val="24"/>
+        </w:rPr>
+        <w:t xml:space="preserve">Conheço de perto a história de um cabo que estava a pouco tempo da inatividade. Depois de muitos anos de serviço, tinha se tornado o cabo mais antigo da sua tropa, e essa antiguidade lhe dava regalias conquistadas com o tempo. Era poupado da maior parte das escalas de serviço, porque havia recrutas mais novos antes dele, e trabalhava numa unidade tranquila, sem grandes embates no policiamento. Tinha encontrado, depois de uma longa travessia, um lugar de relativa paz.</w:t>
+      </w:r>
+    </w:p>
+    <w:p>
+      <w:pPr>
+        <w:widowControl/>
+        <w:spacing w:after="0" w:line="330" w:lineRule="exact"/>
+        <w:ind w:firstLine="340"/>
+        <w:jc w:val="both"/>
+      </w:pPr>
+      <w:r>
+        <w:rPr>
+          <w:rFonts w:ascii="Times New Roman" w:cs="Times New Roman" w:eastAsia="Times New Roman" w:hAnsi="Times New Roman"/>
+          <w:sz w:val="24"/>
+          <w:szCs w:val="24"/>
+        </w:rPr>
+        <w:t xml:space="preserve">Muita gente à sua volta, porém, cobrava dele a promoção. Diziam que um homem com a sua experiência não podia terminar a carreira como cabo, que sargento era o lugar dele, que se acomodar era desperdício. A promoção aparecia aos olhos de todos como ganho, e recusá-la parecia fraqueza. Ele atendeu às cobranças, se esforçou e foi promovido.</w:t>
+      </w:r>
+    </w:p>
+    <w:p>
+      <w:pPr>
+        <w:widowControl/>
+        <w:spacing w:after="0" w:line="330" w:lineRule="exact"/>
+        <w:ind w:firstLine="340"/>
+        <w:jc w:val="both"/>
+      </w:pPr>
+      <w:r>
+        <w:rPr>
+          <w:rFonts w:ascii="Times New Roman" w:cs="Times New Roman" w:eastAsia="Times New Roman" w:hAnsi="Times New Roman"/>
+          <w:sz w:val="24"/>
+          <w:szCs w:val="24"/>
+        </w:rPr>
+        <w:t xml:space="preserve">No dia da promoção deixou de ser o cabo mais antigo e passou a ser o sargento mais novo. Com isso herdou todas as escalas que os sargentos mais antigos já não precisavam puxar. Como faltavam muitos sargentos no efetivo, passou a ser empregado quase todos os dias, em lugares insalubres, com confrontos frequentes e ocorrências com mortes. A tranquilidade acabou. Vieram escalas atrás de escalas, e às vésperas da aposentadoria ele estava trabalhando mais do que tinha trabalhado em toda a carreira.</w:t>
+      </w:r>
+    </w:p>
+    <w:p>
+      <w:pPr>
+        <w:widowControl/>
+        <w:spacing w:after="0" w:line="330" w:lineRule="exact"/>
+        <w:ind w:firstLine="340"/>
+        <w:jc w:val="both"/>
+      </w:pPr>
+      <w:r>
+        <w:rPr>
+          <w:rFonts w:ascii="Times New Roman" w:cs="Times New Roman" w:eastAsia="Times New Roman" w:hAnsi="Times New Roman"/>
+          <w:sz w:val="24"/>
+          <w:szCs w:val="24"/>
+        </w:rPr>
+        <w:t xml:space="preserve">O ganho virou uma perda muito maior. Os traumas se acumularam e o arrependimento por ter buscado a promoção começou a pesar mais do que a própria divisa no ombro. As complicações emocionais chegaram à beira da depressão. Os dias viraram tormento e angústia, a vontade de chorar passou a ser constante e o medo se tornou a única resposta que cabia na rotina.</w:t>
+      </w:r>
+    </w:p>
+    <w:p>
+      <w:pPr>
+        <w:widowControl/>
+        <w:spacing w:after="0" w:line="330" w:lineRule="exact"/>
+        <w:ind w:firstLine="340"/>
+        <w:jc w:val="both"/>
+      </w:pPr>
+      <w:r>
+        <w:rPr>
+          <w:rFonts w:ascii="Times New Roman" w:cs="Times New Roman" w:eastAsia="Times New Roman" w:hAnsi="Times New Roman"/>
+          <w:sz w:val="24"/>
+          <w:szCs w:val="24"/>
+        </w:rPr>
+        <w:t xml:space="preserve">Essa história não serve para condenar a ambição, nem para dizer que ninguém deve buscar crescimento. Ela mostra que um mesmo fato pode ser ganho no olhar dos outros e perda na vida de quem o carrega. A promoção existia na planilha, no salário e nos parabéns. A perda existia no corpo, no sono e na alma. Quem decide olhando apenas para o primeiro lado costuma descobrir o segundo tarde demais.</w:t>
+      </w:r>
+    </w:p>
+    <w:p>
+      <w:pPr>
+        <w:widowControl/>
+        <w:spacing w:after="0" w:line="330" w:lineRule="exact"/>
+        <w:ind w:firstLine="340"/>
+        <w:jc w:val="both"/>
+      </w:pPr>
+      <w:r>
+        <w:rPr>
+          <w:rFonts w:ascii="Times New Roman" w:cs="Times New Roman" w:eastAsia="Times New Roman" w:hAnsi="Times New Roman"/>
+          <w:sz w:val="24"/>
+          <w:szCs w:val="24"/>
+        </w:rPr>
+        <w:t xml:space="preserve">Quem reconhece em si um sofrimento parecido com o desse sargento, com medo constante, choro frequente e dias que viraram tormento, merece cuidado. Pedir ajuda a alguém de confiança e a um profissional de saúde é um gesto de coragem e faz parte da travessia.</w:t>
+      </w:r>
+    </w:p>
+    <w:p>
+      <w:pPr>
+        <w:keepNext/>
+        <w:keepLines/>
+        <w:spacing w:after="160" w:before="400"/>
+      </w:pPr>
+      <w:r>
+        <w:rPr>
+          <w:rFonts w:ascii="Times New Roman" w:cs="Times New Roman" w:eastAsia="Times New Roman" w:hAnsi="Times New Roman"/>
+          <w:b/>
+          <w:bCs/>
+          <w:smallCaps/>
+          <w:sz w:val="24"/>
+          <w:szCs w:val="24"/>
+        </w:rPr>
+        <w:t xml:space="preserve">Perder por amor</w:t>
+      </w:r>
+    </w:p>
+    <w:p>
+      <w:pPr>
+        <w:widowControl/>
+        <w:spacing w:after="0" w:line="330" w:lineRule="exact"/>
+        <w:ind w:firstLine="0"/>
+        <w:jc w:val="both"/>
+      </w:pPr>
+      <w:r>
+        <w:rPr>
+          <w:rFonts w:ascii="Times New Roman" w:cs="Times New Roman" w:eastAsia="Times New Roman" w:hAnsi="Times New Roman"/>
+          <w:sz w:val="24"/>
+          <w:szCs w:val="24"/>
+        </w:rPr>
+        <w:t xml:space="preserve">A mesma dinâmica tem um lado luminoso. Um pai joga uma partida com o filho e perde de propósito. No placar perdeu, e ganhou o sorriso e a alegria do filho amado, que corre pela casa contando a vitória. Aquela derrota escolhida ensina à criança que ela é capaz e alimenta a confiança de que ela precisa para continuar tentando.</w:t>
+      </w:r>
+    </w:p>
+    <w:p>
+      <w:pPr>
+        <w:widowControl/>
+        <w:spacing w:after="0" w:line="330" w:lineRule="exact"/>
+        <w:ind w:firstLine="340"/>
+        <w:jc w:val="both"/>
+      </w:pPr>
+      <w:r>
+        <w:rPr>
+          <w:rFonts w:ascii="Times New Roman" w:cs="Times New Roman" w:eastAsia="Times New Roman" w:hAnsi="Times New Roman"/>
+          <w:sz w:val="24"/>
+          <w:szCs w:val="24"/>
+        </w:rPr>
+        <w:t xml:space="preserve">Com o tempo os papéis podem se inverter. O filho, já crescido e mais habilidoso no videogame, deixa o pai vencer só para vê-lo feliz, confiante e com vontade de continuar jogando junto. Ninguém fala nada. Os dois sabem, de algum modo, que ali o resultado importa menos do que o vínculo.</w:t>
+      </w:r>
+    </w:p>
+    <w:p>
+      <w:pPr>
+        <w:widowControl/>
+        <w:spacing w:after="0" w:line="330" w:lineRule="exact"/>
+        <w:ind w:firstLine="340"/>
+        <w:jc w:val="both"/>
+      </w:pPr>
+      <w:r>
+        <w:rPr>
+          <w:rFonts w:ascii="Times New Roman" w:cs="Times New Roman" w:eastAsia="Times New Roman" w:hAnsi="Times New Roman"/>
+          <w:sz w:val="24"/>
+          <w:szCs w:val="24"/>
+        </w:rPr>
+        <w:t xml:space="preserve">Perder por amor é uma das formas mais altas de ganho secundário, porque o ganho vai para o outro. O avô que deixa o neto vencer a corrida até o portão, a mãe que finge não achar o filho no esconde-esconde, o amigo que cede na discussão para não ferir quem está fragilizado, todos sabem que existem vitórias que não valem o preço de uma tristeza no rosto de quem se ama.</w:t>
+      </w:r>
+    </w:p>
+    <w:p>
+      <w:pPr>
+        <w:keepNext/>
+        <w:keepLines/>
+        <w:spacing w:after="160" w:before="400"/>
+      </w:pPr>
+      <w:r>
+        <w:rPr>
+          <w:rFonts w:ascii="Times New Roman" w:cs="Times New Roman" w:eastAsia="Times New Roman" w:hAnsi="Times New Roman"/>
+          <w:b/>
+          <w:bCs/>
+          <w:smallCaps/>
+          <w:sz w:val="24"/>
+          <w:szCs w:val="24"/>
+        </w:rPr>
+        <w:t xml:space="preserve">Vitórias que custam caro</w:t>
+      </w:r>
+    </w:p>
+    <w:p>
+      <w:pPr>
+        <w:widowControl/>
+        <w:spacing w:after="0" w:line="330" w:lineRule="exact"/>
+        <w:ind w:firstLine="0"/>
+        <w:jc w:val="both"/>
+      </w:pPr>
+      <w:r>
+        <w:rPr>
+          <w:rFonts w:ascii="Times New Roman" w:cs="Times New Roman" w:eastAsia="Times New Roman" w:hAnsi="Times New Roman"/>
+          <w:sz w:val="24"/>
+          <w:szCs w:val="24"/>
+        </w:rPr>
+        <w:t xml:space="preserve">Na vida cotidiana as perdas secundárias aparecem o tempo todo. O casal que transforma cada conversa num tribunal conhece bem o fenômeno. Um dos dois ganha a discussão, prova que tinha razão e sai com a sensação de vitória. Na mesa do jantar, porém, há silêncio, distância e mágoa. Ganhou a briga e perdeu a intimidade.</w:t>
+      </w:r>
+    </w:p>
+    <w:p>
+      <w:pPr>
+        <w:widowControl/>
+        <w:spacing w:after="0" w:line="330" w:lineRule="exact"/>
+        <w:ind w:firstLine="340"/>
+        <w:jc w:val="both"/>
+      </w:pPr>
+      <w:r>
+        <w:rPr>
+          <w:rFonts w:ascii="Times New Roman" w:cs="Times New Roman" w:eastAsia="Times New Roman" w:hAnsi="Times New Roman"/>
+          <w:sz w:val="24"/>
+          <w:szCs w:val="24"/>
+        </w:rPr>
+        <w:t xml:space="preserve">Os irmãos que disputam uma herança na justiça durante anos podem terminar com a sentença a favor, a casa no nome e a família desfeita. O estudante que cola na prova ganha a nota e perde o aprendizado que lhe faria falta mais tarde. O profissional que aceita uma proposta muito bem paga em outra cidade ganha salário e status, e perde a convivência com os filhos numa fase que não volta. O atleta que compete lesionado para não perder a medalha pode subir ao pódio e encerrar ali a carreira.</w:t>
+      </w:r>
+    </w:p>
+    <w:p>
+      <w:pPr>
+        <w:widowControl/>
+        <w:spacing w:after="0" w:line="330" w:lineRule="exact"/>
+        <w:ind w:firstLine="340"/>
+        <w:jc w:val="both"/>
+      </w:pPr>
+      <w:r>
+        <w:rPr>
+          <w:rFonts w:ascii="Times New Roman" w:cs="Times New Roman" w:eastAsia="Times New Roman" w:hAnsi="Times New Roman"/>
+          <w:sz w:val="24"/>
+          <w:szCs w:val="24"/>
+        </w:rPr>
+        <w:t xml:space="preserve">Nenhum desses exemplos condena quem venceu. Eles mostram que toda vitória tem um verso, e que esse verso precisa ser lido antes da escolha, sempre que possível, e depois dela, quando não deu para prever.</w:t>
+      </w:r>
+    </w:p>
+    <w:p>
+      <w:pPr>
+        <w:keepNext/>
+        <w:keepLines/>
+        <w:spacing w:after="160" w:before="400"/>
+      </w:pPr>
+      <w:r>
+        <w:rPr>
+          <w:rFonts w:ascii="Times New Roman" w:cs="Times New Roman" w:eastAsia="Times New Roman" w:hAnsi="Times New Roman"/>
+          <w:b/>
+          <w:bCs/>
+          <w:smallCaps/>
+          <w:sz w:val="24"/>
+          <w:szCs w:val="24"/>
+        </w:rPr>
+        <w:t xml:space="preserve">Perdas que libertam</w:t>
+      </w:r>
+    </w:p>
+    <w:p>
+      <w:pPr>
+        <w:widowControl/>
+        <w:spacing w:after="0" w:line="330" w:lineRule="exact"/>
+        <w:ind w:firstLine="0"/>
+        <w:jc w:val="both"/>
+      </w:pPr>
+      <w:r>
+        <w:rPr>
+          <w:rFonts w:ascii="Times New Roman" w:cs="Times New Roman" w:eastAsia="Times New Roman" w:hAnsi="Times New Roman"/>
+          <w:sz w:val="24"/>
+          <w:szCs w:val="24"/>
+        </w:rPr>
+        <w:t xml:space="preserve">O caminho oposto também é comum. A pessoa que perde o emprego e, forçada a recomeçar, descobre a vocação que vinha adiando há anos. O candidato que é recusado num concurso e, meses depois, percebe que aquele cargo o teria afastado de tudo o que amava. A pessoa que perde uma relação que a diminuía e, depois do luto, reencontra a própria voz.</w:t>
+      </w:r>
+    </w:p>
+    <w:p>
+      <w:pPr>
+        <w:widowControl/>
+        <w:spacing w:after="0" w:line="330" w:lineRule="exact"/>
+        <w:ind w:firstLine="340"/>
+        <w:jc w:val="both"/>
+      </w:pPr>
+      <w:r>
+        <w:rPr>
+          <w:rFonts w:ascii="Times New Roman" w:cs="Times New Roman" w:eastAsia="Times New Roman" w:hAnsi="Times New Roman"/>
+          <w:sz w:val="24"/>
+          <w:szCs w:val="24"/>
+        </w:rPr>
+        <w:t xml:space="preserve">Nesses casos a perda abriu espaço. Ela doeu, foi vivida como derrota e, com o tempo, revelou um ganho que não cabia no momento da queda. Muitas pessoas, olhando para trás, conseguem dizer com serenidade que a pior coisa que lhes aconteceu foi também a porta para a melhor parte da vida.</w:t>
+      </w:r>
+    </w:p>
+    <w:p>
+      <w:pPr>
+        <w:keepNext/>
+        <w:keepLines/>
+        <w:spacing w:after="160" w:before="400"/>
+      </w:pPr>
+      <w:r>
+        <w:rPr>
+          <w:rFonts w:ascii="Times New Roman" w:cs="Times New Roman" w:eastAsia="Times New Roman" w:hAnsi="Times New Roman"/>
+          <w:b/>
+          <w:bCs/>
+          <w:smallCaps/>
+          <w:sz w:val="24"/>
+          <w:szCs w:val="24"/>
+        </w:rPr>
+        <w:t xml:space="preserve">Quando o ganho secundário aprisiona</w:t>
+      </w:r>
+    </w:p>
+    <w:p>
+      <w:pPr>
+        <w:widowControl/>
+        <w:spacing w:after="0" w:line="330" w:lineRule="exact"/>
+        <w:ind w:firstLine="0"/>
+        <w:jc w:val="both"/>
+      </w:pPr>
+      <w:r>
+        <w:rPr>
+          <w:rFonts w:ascii="Times New Roman" w:cs="Times New Roman" w:eastAsia="Times New Roman" w:hAnsi="Times New Roman"/>
+          <w:sz w:val="24"/>
+          <w:szCs w:val="24"/>
+        </w:rPr>
+        <w:t xml:space="preserve">O ganho secundário tem também um lado sombrio, que a psicologia estudou com cuidado. Às vezes a pessoa permanece numa dor porque essa dor lhe oferece alguma coisa. A doença que traz atenção da família, a fragilidade que dispensa responsabilidades, a queixa constante que garante cuidado, o papel de vítima que evita o risco de tentar de novo. Nada disso é escolha consciente, e por isso mesmo não cabe julgamento. A dor é real, e o ganho escondido também.</w:t>
+      </w:r>
+    </w:p>
+    <w:p>
+      <w:pPr>
+        <w:widowControl/>
+        <w:spacing w:after="0" w:line="330" w:lineRule="exact"/>
+        <w:ind w:firstLine="340"/>
+        <w:jc w:val="both"/>
+      </w:pPr>
+      <w:r>
+        <w:rPr>
+          <w:rFonts w:ascii="Times New Roman" w:cs="Times New Roman" w:eastAsia="Times New Roman" w:hAnsi="Times New Roman"/>
+          <w:sz w:val="24"/>
+          <w:szCs w:val="24"/>
+        </w:rPr>
+        <w:t xml:space="preserve">O mesmo acontece nos conflitos sociais. Há disputas que ninguém quer de fato resolver, porque o conflito dá identidade, plateia, poder ou um inimigo para culpar. Grupos inteiros podem se organizar em torno de uma ferida que os mantém unidos, e resolver o problema significaria perder a razão de existir daquele jeito. Nas famílias acontece algo parecido. A briga antiga entre dois irmãos às vezes sustenta o equilíbrio de todos, porque cada um sabe exatamente qual papel ocupa enquanto ela durar.</w:t>
+      </w:r>
+    </w:p>
+    <w:p>
+      <w:pPr>
+        <w:widowControl/>
+        <w:spacing w:after="0" w:line="330" w:lineRule="exact"/>
+        <w:ind w:firstLine="340"/>
+        <w:jc w:val="both"/>
+      </w:pPr>
+      <w:r>
+        <w:rPr>
+          <w:rFonts w:ascii="Times New Roman" w:cs="Times New Roman" w:eastAsia="Times New Roman" w:hAnsi="Times New Roman"/>
+          <w:sz w:val="24"/>
+          <w:szCs w:val="24"/>
+        </w:rPr>
+        <w:t xml:space="preserve">Reconhecer um ganho secundário escondido exige coragem e muita delicadeza. A pergunta útil, aqui, deixa de lado a culpa e pede verdade: o que essa situação me oferece que eu tenho medo de perder? Quando a resposta aparece, a pessoa pode procurar outro jeito, mais saudável, de receber aquilo de que precisa.</w:t>
+      </w:r>
+    </w:p>
+    <w:p>
+      <w:pPr>
+        <w:keepNext/>
+        <w:keepLines/>
+        <w:spacing w:after="160" w:before="400"/>
+      </w:pPr>
+      <w:r>
+        <w:rPr>
+          <w:rFonts w:ascii="Times New Roman" w:cs="Times New Roman" w:eastAsia="Times New Roman" w:hAnsi="Times New Roman"/>
+          <w:b/>
+          <w:bCs/>
+          <w:smallCaps/>
+          <w:sz w:val="24"/>
+          <w:szCs w:val="24"/>
+        </w:rPr>
+        <w:t xml:space="preserve">Ler o resultado com os olhos do pleno</w:t>
+      </w:r>
+    </w:p>
+    <w:p>
+      <w:pPr>
+        <w:widowControl/>
+        <w:spacing w:after="0" w:line="330" w:lineRule="exact"/>
+        <w:ind w:firstLine="0"/>
+        <w:jc w:val="both"/>
+      </w:pPr>
+      <w:r>
+        <w:rPr>
+          <w:rFonts w:ascii="Times New Roman" w:cs="Times New Roman" w:eastAsia="Times New Roman" w:hAnsi="Times New Roman"/>
+          <w:sz w:val="24"/>
+          <w:szCs w:val="24"/>
+        </w:rPr>
+        <w:t xml:space="preserve">A Teoria do Pleno Existencial ajuda a enxergar essa dinâmica com mais clareza. O vazio costuma empurrar a pessoa para vitórias que preenchem por fora e esvaziam por dentro, porque ela precisa do aplauso para se sentir alguém. O cheio aparece quando a pessoa acumula conquistas, cargos e títulos além da medida e passa a ser sufocada por eles. O pleno pede uma pergunta anterior a qualquer disputa: o que este ganho vai custar à minha inteireza, e o que esta perda pode proteger?</w:t>
+      </w:r>
+    </w:p>
+    <w:p>
+      <w:pPr>
+        <w:widowControl/>
+        <w:spacing w:after="0" w:line="330" w:lineRule="exact"/>
+        <w:ind w:firstLine="340"/>
+        <w:jc w:val="both"/>
+      </w:pPr>
+      <w:r>
+        <w:rPr>
+          <w:rFonts w:ascii="Times New Roman" w:cs="Times New Roman" w:eastAsia="Times New Roman" w:hAnsi="Times New Roman"/>
+          <w:sz w:val="24"/>
+          <w:szCs w:val="24"/>
+        </w:rPr>
+        <w:t xml:space="preserve">Quem aprende a fazer essa pergunta deixa de ser refém do placar. Pode recusar uma promoção sem se sentir fracassado e aceitar outra sabendo exatamente o preço que vai pagar. Pode perder uma discussão para ganhar a paz da casa, ou insistir numa causa justa mesmo sabendo que vai custar caro, porque escolheu o custo com consciência. A medida passa a ser a vida inteira da pessoa, e o resultado de um dia deixa de decidir tudo.</w:t>
+      </w:r>
+    </w:p>
+    <w:p>
+      <w:pPr>
+        <w:widowControl/>
+        <w:spacing w:after="0" w:line="330" w:lineRule="exact"/>
+        <w:ind w:firstLine="340"/>
+        <w:jc w:val="both"/>
+      </w:pPr>
+      <w:r>
+        <w:rPr>
+          <w:rFonts w:ascii="Times New Roman" w:cs="Times New Roman" w:eastAsia="Times New Roman" w:hAnsi="Times New Roman"/>
+          <w:sz w:val="24"/>
+          <w:szCs w:val="24"/>
+        </w:rPr>
+        <w:t xml:space="preserve">Antes de comemorar uma vitória ou lamentar uma derrota, vale escutar o que está por trás dela. Às vezes o maior ganho da vida chegou disfarçado de perda, e às vezes a perda mais dolorosa entrou pela porta da frente vestida de conquista. Quem aprende a ler essas camadas atravessa os conflitos com mais lucidez, protege os próprios vínculos e escolhe com mais liberdade o que vale a pena ganhar.</w:t>
+      </w:r>
+    </w:p>
+    <w:p>
+      <w:pPr>
+        <w:pageBreakBefore/>
+        <w:spacing w:after="1134"/>
+      </w:pPr>
+    </w:p>
+    <w:p>
+      <w:pPr>
+        <w:spacing w:after="200"/>
+        <w:jc w:val="center"/>
+      </w:pPr>
+      <w:r>
+        <w:rPr>
+          <w:rFonts w:ascii="Times New Roman" w:cs="Times New Roman" w:eastAsia="Times New Roman" w:hAnsi="Times New Roman"/>
+          <w:color w:val="555555"/>
+          <w:spacing w:val="80"/>
+          <w:sz w:val="20"/>
+          <w:szCs w:val="20"/>
+        </w:rPr>
+        <w:t xml:space="preserve">CAPÍTULO 18</w:t>
+      </w:r>
+    </w:p>
+    <w:p>
+      <w:pPr>
+        <w:keepNext/>
+        <w:spacing w:after="720"/>
+        <w:jc w:val="center"/>
+      </w:pPr>
+      <w:r>
+        <w:rPr>
+          <w:rFonts w:ascii="Times New Roman" w:cs="Times New Roman" w:eastAsia="Times New Roman" w:hAnsi="Times New Roman"/>
+          <w:b/>
+          <w:bCs/>
+          <w:sz w:val="34"/>
+          <w:szCs w:val="34"/>
+        </w:rPr>
         <w:t xml:space="preserve">O envelhecimento subjetivo antes da velhice</w:t>
       </w:r>
     </w:p>
@@ -8975,7 +9583,7 @@
           <w:sz w:val="20"/>
           <w:szCs w:val="20"/>
         </w:rPr>
-        <w:t xml:space="preserve">CAPÍTULO 18</w:t>
+        <w:t xml:space="preserve">CAPÍTULO 19</w:t>
       </w:r>
     </w:p>
     <w:p>
@@ -9374,7 +9982,7 @@
           <w:sz w:val="20"/>
           <w:szCs w:val="20"/>
         </w:rPr>
-        <w:t xml:space="preserve">CAPÍTULO 19</w:t>
+        <w:t xml:space="preserve">CAPÍTULO 20</w:t>
       </w:r>
     </w:p>
     <w:p>
@@ -9639,7 +10247,7 @@
           <w:sz w:val="20"/>
           <w:szCs w:val="20"/>
         </w:rPr>
-        <w:t xml:space="preserve">CAPÍTULO 20</w:t>
+        <w:t xml:space="preserve">CAPÍTULO 21</w:t>
       </w:r>
     </w:p>
     <w:p>
@@ -9888,7 +10496,7 @@
           <w:sz w:val="20"/>
           <w:szCs w:val="20"/>
         </w:rPr>
-        <w:t xml:space="preserve">CAPÍTULO 21</w:t>
+        <w:t xml:space="preserve">CAPÍTULO 22</w:t>
       </w:r>
     </w:p>
     <w:p>
@@ -10137,7 +10745,7 @@
           <w:sz w:val="20"/>
           <w:szCs w:val="20"/>
         </w:rPr>
-        <w:t xml:space="preserve">CAPÍTULO 22</w:t>
+        <w:t xml:space="preserve">CAPÍTULO 23</w:t>
       </w:r>
     </w:p>
     <w:p>
@@ -10354,7 +10962,7 @@
           <w:sz w:val="20"/>
           <w:szCs w:val="20"/>
         </w:rPr>
-        <w:t xml:space="preserve">CAPÍTULO 23</w:t>
+        <w:t xml:space="preserve">CAPÍTULO 24</w:t>
       </w:r>
     </w:p>
     <w:p>
@@ -10639,7 +11247,7 @@
           <w:sz w:val="20"/>
           <w:szCs w:val="20"/>
         </w:rPr>
-        <w:t xml:space="preserve">CAPÍTULO 24</w:t>
+        <w:t xml:space="preserve">CAPÍTULO 25</w:t>
       </w:r>
     </w:p>
     <w:p>
@@ -10922,7 +11530,7 @@
           <w:sz w:val="20"/>
           <w:szCs w:val="20"/>
         </w:rPr>
-        <w:t xml:space="preserve">CAPÍTULO 25</w:t>
+        <w:t xml:space="preserve">CAPÍTULO 26</w:t>
       </w:r>
     </w:p>
     <w:p>
@@ -11287,7 +11895,7 @@
           <w:sz w:val="20"/>
           <w:szCs w:val="20"/>
         </w:rPr>
-        <w:t xml:space="preserve">CAPÍTULO 26</w:t>
+        <w:t xml:space="preserve">CAPÍTULO 27</w:t>
       </w:r>
     </w:p>
     <w:p>
@@ -11488,7 +12096,7 @@
           <w:sz w:val="20"/>
           <w:szCs w:val="20"/>
         </w:rPr>
-        <w:t xml:space="preserve">CAPÍTULO 27</w:t>
+        <w:t xml:space="preserve">CAPÍTULO 28</w:t>
       </w:r>
     </w:p>
     <w:p>
@@ -11689,7 +12297,7 @@
           <w:sz w:val="20"/>
           <w:szCs w:val="20"/>
         </w:rPr>
-        <w:t xml:space="preserve">CAPÍTULO 28</w:t>
+        <w:t xml:space="preserve">CAPÍTULO 29</w:t>
       </w:r>
     </w:p>
     <w:p>
@@ -12830,7 +13438,7 @@
           <w:sz w:val="24"/>
           <w:szCs w:val="24"/>
         </w:rPr>
-        <w:t xml:space="preserve"> Toda expansão cobra uma perda. Ninguém teme o que vai ganhar, mas sofre pelo que vai perder, e por isso crescer exige luto.</w:t>
+        <w:t xml:space="preserve"> Toda expansão cobra uma perda. Ninguém teme o que vai ganhar, mas sofre pelo que vai perder, e por isso crescer exige luto. Do mesmo modo, nem toda vitória é ganho e nem toda derrota é perda, porque cada resultado precisa ser lido junto com o que custa e com o que protege.</w:t>
       </w:r>
     </w:p>
     <w:p>
@@ -13279,7 +13887,7 @@
           <w:sz w:val="20"/>
           <w:szCs w:val="20"/>
         </w:rPr>
-        <w:t xml:space="preserve">CAPÍTULO 29</w:t>
+        <w:t xml:space="preserve">CAPÍTULO 30</w:t>
       </w:r>
     </w:p>
     <w:p>
@@ -14366,6 +14974,58 @@
           <w:szCs w:val="24"/>
         </w:rPr>
         <w:t xml:space="preserve">6.</w:t>
+      </w:r>
+      <w:r>
+        <w:rPr>
+          <w:rFonts w:ascii="Times New Roman" w:cs="Times New Roman" w:eastAsia="Times New Roman" w:hAnsi="Times New Roman"/>
+          <w:sz w:val="24"/>
+          <w:szCs w:val="24"/>
+        </w:rPr>
+        <w:t xml:space="preserve"> Que vitória da minha vida me custou mais do que me deu? E que perda, vista hoje, acabou me protegendo ou me libertando?</w:t>
+      </w:r>
+    </w:p>
+    <w:p>
+      <w:pPr>
+        <w:widowControl/>
+        <w:spacing w:after="0" w:line="330" w:lineRule="exact"/>
+        <w:ind w:firstLine="340"/>
+        <w:jc w:val="both"/>
+      </w:pPr>
+      <w:r>
+        <w:rPr>
+          <w:rFonts w:ascii="Times New Roman" w:cs="Times New Roman" w:eastAsia="Times New Roman" w:hAnsi="Times New Roman"/>
+          <w:b/>
+          <w:bCs/>
+          <w:sz w:val="24"/>
+          <w:szCs w:val="24"/>
+        </w:rPr>
+        <w:t xml:space="preserve">7.</w:t>
+      </w:r>
+      <w:r>
+        <w:rPr>
+          <w:rFonts w:ascii="Times New Roman" w:cs="Times New Roman" w:eastAsia="Times New Roman" w:hAnsi="Times New Roman"/>
+          <w:sz w:val="24"/>
+          <w:szCs w:val="24"/>
+        </w:rPr>
+        <w:t xml:space="preserve"> Que situação de dor ou de conflito pode estar me oferecendo algum ganho escondido que tenho medo de perder?</w:t>
+      </w:r>
+    </w:p>
+    <w:p>
+      <w:pPr>
+        <w:widowControl/>
+        <w:spacing w:after="0" w:line="330" w:lineRule="exact"/>
+        <w:ind w:firstLine="340"/>
+        <w:jc w:val="both"/>
+      </w:pPr>
+      <w:r>
+        <w:rPr>
+          <w:rFonts w:ascii="Times New Roman" w:cs="Times New Roman" w:eastAsia="Times New Roman" w:hAnsi="Times New Roman"/>
+          <w:b/>
+          <w:bCs/>
+          <w:sz w:val="24"/>
+          <w:szCs w:val="24"/>
+        </w:rPr>
+        <w:t xml:space="preserve">8.</w:t>
       </w:r>
       <w:r>
         <w:rPr>

</xml_diff>

<commit_message>
Livro: subtítulo da capa e "pleno" no lugar de "plenitude"
- Subtítulo: A teoria entre o vazio e o cheio (igual à capa)
- 35 ocorrências de "plenitude" reescritas com "pleno", com concordância ajustada
- Definição da TPE usa "energia psíquica de inteireza" para não ficar circular
- Só o DOCX foi regerado; o PDF fica para a versão final

Co-Authored-By: Claude Opus 5.5 <noreply@anthropic.com>
Claude-Session: https://claude.ai/code/session_01BrurxSYygRC3rRhaUYosm1
</commit_message>
<xml_diff>
--- a/docs/livro/O_PLENO_EXISTENCIAL.docx
+++ b/docs/livro/O_PLENO_EXISTENCIAL.docx
@@ -37,7 +37,7 @@
           <w:sz w:val="26"/>
           <w:szCs w:val="26"/>
         </w:rPr>
-        <w:t xml:space="preserve">Uma travessia do vazio à plenitude</w:t>
+        <w:t xml:space="preserve">A teoria entre o vazio e o cheio</w:t>
       </w:r>
     </w:p>
     <w:p/>
@@ -116,7 +116,7 @@
           <w:sz w:val="18"/>
           <w:szCs w:val="18"/>
         </w:rPr>
-        <w:t xml:space="preserve">O Pleno Existencial: uma travessia do vazio à plenitude</w:t>
+        <w:t xml:space="preserve">O Pleno Existencial: a teoria entre o vazio e o cheio</w:t>
       </w:r>
     </w:p>
     <w:p>
@@ -2251,7 +2251,7 @@
           <w:sz w:val="24"/>
           <w:szCs w:val="24"/>
         </w:rPr>
-        <w:t xml:space="preserve">Este livro foi escrito contra esse exílio. Não pretendo negar o sofrimento nem prometer uma plenitude automática. Proponho ler o ser humano como portador de uma energia psíquica de plenitude, uma força interior que continua existindo mesmo quando é reprimida, distorcida ou empurrada para o inconsciente. A essa força dei o nome de PLENO EXISTENCIAL.</w:t>
+        <w:t xml:space="preserve">Este livro foi escrito contra esse exílio. Não pretendo negar o sofrimento nem prometer um pleno automático. Proponho ler o ser humano como portador de uma energia psíquica do pleno, uma força interior que continua existindo mesmo quando é reprimida, distorcida ou empurrada para o inconsciente. A essa força dei o nome de PLENO EXISTENCIAL.</w:t>
       </w:r>
     </w:p>
     <w:p>
@@ -2379,7 +2379,7 @@
           <w:sz w:val="24"/>
           <w:szCs w:val="24"/>
         </w:rPr>
-        <w:t xml:space="preserve">A história humana, felizmente, não termina nessa queda. Existe reencontro, existe retomada, existe despertar, e mostrar isso é um dos grandes objetivos deste livro. A plenitude é uma possibilidade inscrita na estrutura mais profunda de todo ser humano. Ninguém a recebe como privilégio exclusivo. A potência existe em todos, e o que muda de uma pessoa para outra é o grau de acesso consciente a ela.</w:t>
+        <w:t xml:space="preserve">A história humana, felizmente, não termina nessa queda. Existe reencontro, existe retomada, existe despertar, e mostrar isso é um dos grandes objetivos deste livro. O pleno é uma possibilidade inscrita na estrutura mais profunda de todo ser humano. Ninguém o recebe como privilégio exclusivo. A potência existe em todos, e o que muda de uma pessoa para outra é o grau de acesso consciente a ela.</w:t>
       </w:r>
     </w:p>
     <w:p>
@@ -2411,7 +2411,7 @@
           <w:sz w:val="24"/>
           <w:szCs w:val="24"/>
         </w:rPr>
-        <w:t xml:space="preserve">Considero este livro uma travessia. Não quis escrever autoajuda simplista nem uma filosofia distante da dor real. Busco uma compreensão filosófica e espiritual do potencial humano a partir de uma tese central: existe em cada ser uma energia psíquica de plenitude, e a vida pode ser entendida como o processo de reencontrá-la, libertá-la e habitá-la.</w:t>
+        <w:t xml:space="preserve">Considero este livro uma travessia. Não quis escrever autoajuda simplista nem uma filosofia distante da dor real. Busco uma compreensão filosófica e espiritual do potencial humano a partir de uma tese central: existe em cada ser uma energia psíquica do pleno, e a vida pode ser entendida como o processo de reencontrá-la, libertá-la e habitá-la.</w:t>
       </w:r>
     </w:p>
     <w:p>
@@ -2475,7 +2475,7 @@
           <w:sz w:val="24"/>
           <w:szCs w:val="24"/>
         </w:rPr>
-        <w:t xml:space="preserve">Meu desejo é que esta leitura funcione como um espelho. Em cada capítulo procuro explicar uma ideia e, junto com ela, tocar algum ponto da alma onde o leitor talvez ainda não tenha tido coragem de entrar. Saber se existe plenitude no ser humano me interessa menos do que entender o que impede essa plenitude de aparecer e o que acontece quando ela finalmente desperta.</w:t>
+        <w:t xml:space="preserve">Meu desejo é que esta leitura funcione como um espelho. Em cada capítulo procuro explicar uma ideia e, junto com ela, tocar algum ponto da alma onde o leitor talvez ainda não tenha tido coragem de entrar. Saber se existe o pleno no ser humano me interessa menos do que entender o que impede esse pleno de aparecer e o que acontece quando ele finalmente desperta.</w:t>
       </w:r>
     </w:p>
     <w:p>
@@ -2822,7 +2822,7 @@
           <w:sz w:val="24"/>
           <w:szCs w:val="24"/>
         </w:rPr>
-        <w:t xml:space="preserve">Em contato com essa verdade, a pessoa percebe que a falta de reconhecimento feriu a imagem que ela tinha de si, mas não destruiu a sua potência original. O tesouro continua lá. A luz, mesmo abafada, não se apagou, e a energia psíquica de plenitude seguiu habitando o ser à espera de condições para voltar à consciência.</w:t>
+        <w:t xml:space="preserve">Em contato com essa verdade, a pessoa percebe que a falta de reconhecimento feriu a imagem que ela tinha de si, mas não destruiu a sua potência original. O tesouro continua lá. A luz, mesmo abafada, não se apagou, e a energia psíquica do pleno seguiu habitando o ser à espera de condições para voltar à consciência.</w:t>
       </w:r>
     </w:p>
     <w:p>
@@ -2886,7 +2886,7 @@
           <w:sz w:val="24"/>
           <w:szCs w:val="24"/>
         </w:rPr>
-        <w:t xml:space="preserve">Vejo a ferida do não reconhecimento como uma das portas de entrada para compreender o PLENO EXISTENCIAL. Ela mostra como a energia de plenitude pode ser recalcada quando alguém constrói a vida sobre carência e validação, e mostra também que o reencontro consigo começa no dia em que a pessoa deixa de fazer do olhar do outro a única fonte da sua legitimidade. Atravessar essa ferida não elimina a necessidade humana de amor. Purifica essa necessidade e a devolve ao lugar certo.</w:t>
+        <w:t xml:space="preserve">Vejo a ferida do não reconhecimento como uma das portas de entrada para compreender o PLENO EXISTENCIAL. Ela mostra como a energia do pleno pode ser recalcada quando alguém constrói a vida sobre carência e validação, e mostra também que o reencontro consigo começa no dia em que a pessoa deixa de fazer do olhar do outro a única fonte da sua legitimidade. Atravessar essa ferida não elimina a necessidade humana de amor. Purifica essa necessidade e a devolve ao lugar certo.</w:t>
       </w:r>
     </w:p>
     <w:p>
@@ -3300,7 +3300,7 @@
           <w:sz w:val="24"/>
           <w:szCs w:val="24"/>
         </w:rPr>
-        <w:t xml:space="preserve">A vida, porém, não se resume a essa captura. Sempre é possível voltar ao centro, e isso não exige negar a dor nem fingir maturidade. Exige aprender a perceber quando o desejo está servindo à plenitude e quando está servindo à carência, distinguir o impulso que nos aproxima da verdade daquele que só nos arrasta para o espelho dos outros e entender que a energia vital precisa ser habitada, e não provada diante do mundo.</w:t>
+        <w:t xml:space="preserve">A vida, porém, não se resume a essa captura. Sempre é possível voltar ao centro, e isso não exige negar a dor nem fingir maturidade. Exige aprender a perceber quando o desejo está servindo ao pleno e quando está servindo à carência, distinguir o impulso que nos aproxima da verdade daquele que só nos arrasta para o espelho dos outros e entender que a energia vital precisa ser habitada, e não provada diante do mundo.</w:t>
       </w:r>
     </w:p>
     <w:p>
@@ -3551,7 +3551,7 @@
           <w:sz w:val="24"/>
           <w:szCs w:val="24"/>
         </w:rPr>
-        <w:t xml:space="preserve">Muita gente passa anos acreditando que só vai sofrer quando lhe faltar alguma coisa. Luta para sair da escassez, o que é compreensível, e quando enfim chega lá descobre uma dor de outro tipo. Comer além da conta é excesso, e plenitude passa longe disso. Acumular reconhecimento sem limite também adoece. Atenção, cobrança, visibilidade e demanda em excesso tiram da pessoa o espaço interno de que ela precisa para viver com serenidade.</w:t>
+        <w:t xml:space="preserve">Muita gente passa anos acreditando que só vai sofrer quando lhe faltar alguma coisa. Luta para sair da escassez, o que é compreensível, e quando enfim chega lá descobre uma dor de outro tipo. Comer além da conta é excesso, e o pleno passa longe disso. Acumular reconhecimento sem limite também adoece. Atenção, cobrança, visibilidade e demanda em excesso tiram da pessoa o espaço interno de que ela precisa para viver com serenidade.</w:t>
       </w:r>
     </w:p>
     <w:p>
@@ -3833,7 +3833,7 @@
           <w:sz w:val="24"/>
           <w:szCs w:val="24"/>
         </w:rPr>
-        <w:t xml:space="preserve">O erro começa quando a pessoa confunde plenitude com excesso e acredita que terá mais vida se juntar mais coisas, mais gente, mais reconhecimento, mais poder e mais controle. Acúmulo sem medida gera sobrecarga, e a falta de tudo gera desamparo, nunca liberdade. O pleno é o ponto em que a vida sai do domínio dos extremos e passa a ser conduzida por uma lógica de harmonia.</w:t>
+        <w:t xml:space="preserve">O erro começa quando a pessoa confunde o pleno com o excesso e acredita que terá mais vida se juntar mais coisas, mais gente, mais reconhecimento, mais poder e mais controle. Acúmulo sem medida gera sobrecarga, e a falta de tudo gera desamparo, nunca liberdade. O pleno é o ponto em que a vida sai do domínio dos extremos e passa a ser conduzida por uma lógica de harmonia.</w:t>
       </w:r>
     </w:p>
     <w:p>
@@ -4269,7 +4269,7 @@
           <w:sz w:val="24"/>
           <w:szCs w:val="24"/>
         </w:rPr>
-        <w:t xml:space="preserve">O paraíso gestacional é, para mim, mais do que uma lembrança poética do começo da vida. Ele ajuda a entender a arquitetura da existência. Medo, dependência, desejo de ser desejado, busca de aprovação e dificuldade de crescer já começam ali, na passagem da plenitude recebida para a perda que inaugura a consciência. Não falo de nostalgia biológica. Falo de reconhecer que a primeira experiência de mundo foi plenitude e separação ao mesmo tempo.</w:t>
+        <w:t xml:space="preserve">O paraíso gestacional é, para mim, mais do que uma lembrança poética do começo da vida. Ele ajuda a entender a arquitetura da existência. Medo, dependência, desejo de ser desejado, busca de aprovação e dificuldade de crescer já começam ali, na passagem do pleno recebido para a perda que inaugura a consciência. Não falo de nostalgia biológica. Falo de reconhecer que a primeira experiência de mundo foi o pleno e a separação ao mesmo tempo.</w:t>
       </w:r>
     </w:p>
     <w:p>
@@ -4301,7 +4301,7 @@
           <w:sz w:val="24"/>
           <w:szCs w:val="24"/>
         </w:rPr>
-        <w:t xml:space="preserve">O nascimento, visto assim, é o primeiro grande rito da condição humana, muito mais do que um evento biológico. Ao sair do paraíso, o ser descobre que a vida será uma travessia entre perdas e reconstruções. Talvez seja a lembrança inconsciente dessa plenitude original que faz o ser humano continuar procurando, no amor, no trabalho, na fé, no cuidado e no sentido, um jeito de reencontrar algo que, lá no fundo, sabe que já foi seu.</w:t>
+        <w:t xml:space="preserve">O nascimento, visto assim, é o primeiro grande rito da condição humana, muito mais do que um evento biológico. Ao sair do paraíso, o ser descobre que a vida será uma travessia entre perdas e reconstruções. Talvez seja a lembrança inconsciente desse pleno original que faz o ser humano continuar procurando, no amor, no trabalho, na fé, no cuidado e no sentido, um jeito de reencontrar algo que, lá no fundo, sabe que já foi seu.</w:t>
       </w:r>
     </w:p>
     <w:p>
@@ -4484,7 +4484,7 @@
           <w:sz w:val="24"/>
           <w:szCs w:val="24"/>
         </w:rPr>
-        <w:t xml:space="preserve">Dessa fenda nasce o problema existencial que vai atravessar a vida inteira. A gestação foi plenitude recebida, e o nascimento é a primeira prova de que essa plenitude não vai durar. O bebê perde o mundo que o continha e, com ele, a ilusão de que tudo continuaria como estava. A vida fora do útero se apresenta como exigência, e exigência sempre tem custo.</w:t>
+        <w:t xml:space="preserve">Dessa fenda nasce o problema existencial que vai atravessar a vida inteira. A gestação foi o pleno recebido, e o nascimento é a primeira prova de que esse pleno não vai durar. O bebê perde o mundo que o continha e, com ele, a ilusão de que tudo continuaria como estava. A vida fora do útero se apresenta como exigência, e exigência sempre tem custo.</w:t>
       </w:r>
     </w:p>
     <w:p>
@@ -8314,7 +8314,7 @@
           <w:sz w:val="24"/>
           <w:szCs w:val="24"/>
         </w:rPr>
-        <w:t xml:space="preserve">Essa reflexão prepara o terreno para uma compreensão mais ampla da Teoria do Pleno Existencial. Antes de pensar a plenitude como conceito, é preciso reconhecer que a vida humana é atravessada por forças que tentam definir o seu rumo. A pergunta central passa a incluir, além do que aconteceu com a pessoa, o que ela faz com tudo aquilo que continua tentando moldá-la.</w:t>
+        <w:t xml:space="preserve">Essa reflexão prepara o terreno para uma compreensão mais ampla da Teoria do Pleno Existencial. Antes de pensar o pleno como conceito, é preciso reconhecer que a vida humana é atravessada por forças que tentam definir o seu rumo. A pergunta central passa a incluir, além do que aconteceu com a pessoa, o que ela faz com tudo aquilo que continua tentando moldá-la.</w:t>
       </w:r>
     </w:p>
     <w:p>
@@ -9509,7 +9509,7 @@
           <w:sz w:val="24"/>
           <w:szCs w:val="24"/>
         </w:rPr>
-        <w:t xml:space="preserve">A alma pode antecipar o desgaste humano. Por isso o trabalho com a plenitude precisa começar cedo, para que ninguém descubra tarde demais que vinha envelhecendo por dentro havia muito tempo.</w:t>
+        <w:t xml:space="preserve">A alma pode antecipar o desgaste humano. Por isso o trabalho com o pleno precisa começar cedo, para que ninguém descubra tarde demais que vinha envelhecendo por dentro havia muito tempo.</w:t>
       </w:r>
     </w:p>
     <w:p>
@@ -9944,7 +9944,7 @@
           <w:sz w:val="24"/>
           <w:szCs w:val="24"/>
         </w:rPr>
-        <w:t xml:space="preserve">Envelhecer com algum grau de plenitude depende do que a pessoa cultivou ao longo da vida e da maneira como a sociedade à sua volta a acolhe. A primeira parte está, em boa medida, nas mãos dela. A segunda depende de todos nós. Uma sociedade que esconde os seus velhos e os trata como custo ou incômodo está cavando o próprio vazio, porque ensina às novas gerações que o valor de uma vida acaba quando acaba a sua utilidade.</w:t>
+        <w:t xml:space="preserve">Envelhecer habitando, em alguma medida, o pleno depende do que a pessoa cultivou ao longo da vida e da maneira como a sociedade à sua volta a acolhe. A primeira parte está, em boa medida, nas mãos dela. A segunda depende de todos nós. Uma sociedade que esconde os seus velhos e os trata como custo ou incômodo está cavando o próprio vazio, porque ensina às novas gerações que o valor de uma vida acaba quando acaba a sua utilidade.</w:t>
       </w:r>
     </w:p>
     <w:p>
@@ -10225,7 +10225,7 @@
           <w:sz w:val="24"/>
           <w:szCs w:val="24"/>
         </w:rPr>
-        <w:t xml:space="preserve">Fica, no fim, uma verdade simples e dura. Ninguém amadurece sozinho, e ninguém pode entregar inteiramente ao outro a responsabilidade pelo próprio vazio. Os vínculos mostram a qualidade da travessia e o grau de plenitude ou de corrosão que cada um conseguiu carregar até ali.</w:t>
+        <w:t xml:space="preserve">Fica, no fim, uma verdade simples e dura. Ninguém amadurece sozinho, e ninguém pode entregar inteiramente ao outro a responsabilidade pelo próprio vazio. Os vínculos mostram a qualidade da travessia e o quanto de pleno ou de corrosão que cada um conseguiu carregar até ali.</w:t>
       </w:r>
     </w:p>
     <w:p>
@@ -10474,7 +10474,7 @@
           <w:sz w:val="24"/>
           <w:szCs w:val="24"/>
         </w:rPr>
-        <w:t xml:space="preserve">Vejo a plenitude como a arte de morar na matéria sem violência, e acho essa uma das chaves mais importantes para entender a travessia humana.</w:t>
+        <w:t xml:space="preserve">Vejo o pleno como a arte de morar na matéria sem violência, e acho essa uma das chaves mais importantes para entender a travessia humana.</w:t>
       </w:r>
     </w:p>
     <w:p>
@@ -11125,7 +11125,7 @@
           <w:sz w:val="24"/>
           <w:szCs w:val="24"/>
         </w:rPr>
-        <w:t xml:space="preserve">Cada pessoa transmite algo, queira ou não. Transmite medo ou coragem, ressentimento ou perdão, desconfiança ou fé, vazio ou plenitude. Os filhos herdam bens e sobrenomes e herdam também maneiras de reagir à frustração, de lidar com o dinheiro, de amar e de sofrer. Trabalhar a própria plenitude, portanto, tem pouco de egoísmo. Quem cura algo em si interrompe uma corrente de dor que poderia atravessar gerações, e quem se torna parteiro de si mesmo ensina, sem precisar discursar, que é possível fazer algo novo com o que se recebeu.</w:t>
+        <w:t xml:space="preserve">Cada pessoa transmite algo, queira ou não. Transmite medo ou coragem, ressentimento ou perdão, desconfiança ou fé, vazio ou pleno. Os filhos herdam bens e sobrenomes e herdam também maneiras de reagir à frustração, de lidar com o dinheiro, de amar e de sofrer. Trabalhar o próprio pleno, portanto, tem pouco de egoísmo. Quem cura algo em si interrompe uma corrente de dor que poderia atravessar gerações, e quem se torna parteiro de si mesmo ensina, sem precisar discursar, que é possível fazer algo novo com o que se recebeu.</w:t>
       </w:r>
     </w:p>
     <w:p>
@@ -11759,7 +11759,7 @@
           <w:sz w:val="24"/>
           <w:szCs w:val="24"/>
         </w:rPr>
-        <w:t xml:space="preserve">Não pretendo dar aqui uma interpretação teológica definitiva da passagem. Proponho uma leitura existencial. Pedro pode ser visto como a figura do ser humano que se acha próximo, escolhido e seguro de si, e que por isso mesmo corre o risco de confundir proximidade com plenitude. A pergunta repetida o desinstala sem humilhá-lo, tirando-o do lugar da certeza e levando-o de volta à humildade.</w:t>
+        <w:t xml:space="preserve">Não pretendo dar aqui uma interpretação teológica definitiva da passagem. Proponho uma leitura existencial. Pedro pode ser visto como a figura do ser humano que se acha próximo, escolhido e seguro de si, e que por isso mesmo corre o risco de confundir proximidade com o pleno. A pergunta repetida o desinstala sem humilhá-lo, tirando-o do lugar da certeza e levando-o de volta à humildade.</w:t>
       </w:r>
     </w:p>
     <w:p>
@@ -12380,23 +12380,23 @@
           <w:sz w:val="24"/>
           <w:szCs w:val="24"/>
         </w:rPr>
-        <w:t xml:space="preserve">A tese central da TPE pode ser dita assim: existe em cada ser humano uma energia psíquica de plenitude, original e orientadora, que o habita desde o começo da vida. Essa energia é o Pleno Existencial. Ninguém precisa conquistá-la do zero, e ninguém a recebe do olhar dos outros, porque ela já está presente como possibilidade. Ao longo da existência pode ser encoberta por feridas, frustrações, rejeições e valores emprestados, até cair no silêncio do inconsciente. Mesmo assim não morre. Adormece.</w:t>
-      </w:r>
-    </w:p>
-    <w:p>
-      <w:pPr>
-        <w:widowControl/>
-        <w:spacing w:after="0" w:line="330" w:lineRule="exact"/>
-        <w:ind w:firstLine="340"/>
-        <w:jc w:val="both"/>
-      </w:pPr>
-      <w:r>
-        <w:rPr>
-          <w:rFonts w:ascii="Times New Roman" w:cs="Times New Roman" w:eastAsia="Times New Roman" w:hAnsi="Times New Roman"/>
-          <w:sz w:val="24"/>
-          <w:szCs w:val="24"/>
-        </w:rPr>
-        <w:t xml:space="preserve">Daí vem a compreensão da vida que esta teoria propõe. Viver é, em grande parte, reencontrar essa energia, libertá-la das camadas que a abafam e aprender a habitá-la com consciência. O drama humano está no adormecimento da potência. Valor nunca faltou. Interessa-me menos provar que existe plenitude no ser humano e mais entender o que a impede de aparecer e o que acontece quando ela enfim desperta.</w:t>
+        <w:t xml:space="preserve">A tese central da TPE pode ser dita assim: existe em cada ser humano uma energia psíquica de inteireza, original e orientadora, que o habita desde o começo da vida. Essa energia é o Pleno Existencial. Ninguém precisa conquistá-la do zero, e ninguém a recebe do olhar dos outros, porque ela já está presente como possibilidade. Ao longo da existência pode ser encoberta por feridas, frustrações, rejeições e valores emprestados, até cair no silêncio do inconsciente. Mesmo assim não morre. Adormece.</w:t>
+      </w:r>
+    </w:p>
+    <w:p>
+      <w:pPr>
+        <w:widowControl/>
+        <w:spacing w:after="0" w:line="330" w:lineRule="exact"/>
+        <w:ind w:firstLine="340"/>
+        <w:jc w:val="both"/>
+      </w:pPr>
+      <w:r>
+        <w:rPr>
+          <w:rFonts w:ascii="Times New Roman" w:cs="Times New Roman" w:eastAsia="Times New Roman" w:hAnsi="Times New Roman"/>
+          <w:sz w:val="24"/>
+          <w:szCs w:val="24"/>
+        </w:rPr>
+        <w:t xml:space="preserve">Daí vem a compreensão da vida que esta teoria propõe. Viver é, em grande parte, reencontrar essa energia, libertá-la das camadas que a abafam e aprender a habitá-la com consciência. O drama humano está no adormecimento da potência. Valor nunca faltou. Interessa-me menos provar que existe o pleno no ser humano e mais entender o que o impede de aparecer e o que acontece quando ele enfim desperta.</w:t>
       </w:r>
     </w:p>
     <w:p>
@@ -12482,7 +12482,7 @@
           <w:sz w:val="24"/>
           <w:szCs w:val="24"/>
         </w:rPr>
-        <w:t xml:space="preserve">, o excesso, a saturação, o acúmulo que passou da medida. Aparece quando a pessoa tenta curar o vazio pela quantidade, com mais coisas, mais reconhecimento, mais controle, mais ocupação e mais estímulo. A sua marca é o sufocamento. Promete plenitude e entrega sobrecarga, promete segurança e entrega exaustão.</w:t>
+        <w:t xml:space="preserve">, o excesso, a saturação, o acúmulo que passou da medida. Aparece quando a pessoa tenta curar o vazio pela quantidade, com mais coisas, mais reconhecimento, mais controle, mais ocupação e mais estímulo. A sua marca é o sufocamento. Promete o pleno e entrega sobrecarga, promete segurança e entrega exaustão.</w:t>
       </w:r>
     </w:p>
     <w:p>
@@ -12882,7 +12882,7 @@
           <w:sz w:val="24"/>
           <w:szCs w:val="24"/>
         </w:rPr>
-        <w:t xml:space="preserve">, sem os quais plenitude nenhuma se sustenta.</w:t>
+        <w:t xml:space="preserve">, sem os quais nenhum pleno se sustenta.</w:t>
       </w:r>
     </w:p>
     <w:p>
@@ -12950,7 +12950,7 @@
           <w:sz w:val="24"/>
           <w:szCs w:val="24"/>
         </w:rPr>
-        <w:t xml:space="preserve"> a plenitude é recebida, a ferida é a perda do paraíso, e a conquista possível é transformar a saudade da inteireza em vontade de construí-la. No </w:t>
+        <w:t xml:space="preserve"> o pleno é recebido, a ferida é a perda do paraíso, e a conquista possível é transformar a saudade da inteireza em vontade de construí-la. No </w:t>
       </w:r>
       <w:r>
         <w:rPr>
@@ -13308,7 +13308,7 @@
           <w:sz w:val="24"/>
           <w:szCs w:val="24"/>
         </w:rPr>
-        <w:t xml:space="preserve"> A plenitude vem antes da ferida. Antes de qualquer dor, existe no ser uma potência original de inteireza.</w:t>
+        <w:t xml:space="preserve"> O pleno vem antes da ferida. Antes de qualquer dor, existe no ser uma potência original de inteireza.</w:t>
       </w:r>
     </w:p>
     <w:p>
@@ -13386,7 +13386,7 @@
           <w:sz w:val="24"/>
           <w:szCs w:val="24"/>
         </w:rPr>
-        <w:t xml:space="preserve"> Pleno e cheio são coisas diferentes. Sofre-se pela falta e pelo excesso, e a plenitude é ritmo, proporção e integração.</w:t>
+        <w:t xml:space="preserve"> Pleno e cheio são coisas diferentes. Sofre-se pela falta e pelo excesso, e o pleno é ritmo, proporção e integração.</w:t>
       </w:r>
     </w:p>
     <w:p>
@@ -13780,7 +13780,7 @@
           <w:sz w:val="24"/>
           <w:szCs w:val="24"/>
         </w:rPr>
-        <w:t xml:space="preserve">. Quem reencontra a própria plenitude não a guarda para si. Torna-se parteiro de outros, oferece presença, interrompe correntes de dor e deixa legado. O pleno desperto transborda em forma de fruto, sem virar excesso, e nesse transbordar a vida de cada um encontra o seu sentido mais amplo.</w:t>
+        <w:t xml:space="preserve">. Quem reencontra o próprio pleno não o guarda para si. Torna-se parteiro de outros, oferece presença, interrompe correntes de dor e deixa legado. O pleno desperto transborda em forma de fruto, sem virar excesso, e nesse transbordar a vida de cada um encontra o seu sentido mais amplo.</w:t>
       </w:r>
     </w:p>
     <w:p>
@@ -13865,7 +13865,7 @@
           <w:sz w:val="24"/>
           <w:szCs w:val="24"/>
         </w:rPr>
-        <w:t xml:space="preserve">O Pleno Existencial é a energia psíquica de plenitude que habita o ser desde a origem. Adormecida pelas feridas e corroída pelo que não foi elaborado, ela pode ser reencontrada, libertada e habitada como medida e como direção.</w:t>
+        <w:t xml:space="preserve">O Pleno Existencial é a energia psíquica de inteireza que habita o ser desde a origem. Adormecida pelas feridas e corroída pelo que não foi elaborado, ela pode ser reencontrada, libertada e habitada como medida e como direção.</w:t>
       </w:r>
     </w:p>
     <w:p>
@@ -14016,7 +14016,7 @@
           <w:sz w:val="24"/>
           <w:szCs w:val="24"/>
         </w:rPr>
-        <w:t xml:space="preserve">Esse retorno é diferente de uma volta ao paraíso gestacional. Lá a plenitude era recebida sem consciência, e aqui é reencontrada com lucidez. Lá o ser era tudo porque ainda não sabia de nada, e aqui é inteiro porque já conhece a falta, o excesso e a medida. A inteireza do fim tem menos ilusões e muito mais verdade.</w:t>
+        <w:t xml:space="preserve">Esse retorno é diferente de uma volta ao paraíso gestacional. Lá o pleno era recebido sem consciência, e aqui é reencontrado com lucidez. Lá o ser era tudo porque ainda não sabia de nada, e aqui é inteiro porque já conhece a falta, o excesso e a medida. A inteireza do fim tem menos ilusões e muito mais verdade.</w:t>
       </w:r>
     </w:p>
     <w:p>
@@ -15303,7 +15303,7 @@
           <w:sz w:val="24"/>
           <w:szCs w:val="24"/>
         </w:rPr>
-        <w:t xml:space="preserve"> Em que situações confundi proximidade com plenitude, como Pedro diante da pergunta repetida?</w:t>
+        <w:t xml:space="preserve"> Em que situações confundi proximidade com o pleno, como Pedro diante da pergunta repetida?</w:t>
       </w:r>
     </w:p>
     <w:p>

</xml_diff>

<commit_message>
Livro: página de dedicatória
Co-Authored-By: Claude Opus 5.5 <noreply@anthropic.com>
Claude-Session: https://claude.ai/code/session_01BrurxSYygRC3rRhaUYosm1
</commit_message>
<xml_diff>
--- a/docs/livro/O_PLENO_EXISTENCIAL.docx
+++ b/docs/livro/O_PLENO_EXISTENCIAL.docx
@@ -169,6 +169,86 @@
           <w:szCs w:val="18"/>
         </w:rPr>
         <w:t xml:space="preserve">Irmandade Conhecimento com Luz</w:t>
+      </w:r>
+    </w:p>
+    <w:p>
+      <w:pPr>
+        <w:pageBreakBefore/>
+      </w:pPr>
+    </w:p>
+    <w:p/>
+    <w:p/>
+    <w:p/>
+    <w:p/>
+    <w:p/>
+    <w:p/>
+    <w:p/>
+    <w:p>
+      <w:pPr>
+        <w:spacing w:after="220" w:line="300"/>
+        <w:ind w:left="1418"/>
+        <w:jc w:val="right"/>
+      </w:pPr>
+      <w:r>
+        <w:rPr>
+          <w:rFonts w:ascii="Times New Roman" w:cs="Times New Roman" w:eastAsia="Times New Roman" w:hAnsi="Times New Roman"/>
+          <w:i/>
+          <w:iCs/>
+          <w:sz w:val="22"/>
+          <w:szCs w:val="22"/>
+        </w:rPr>
+        <w:t xml:space="preserve">À memória dos meus pais, Inácio e Creusa, e do meu irmão Rodolfo, que me deram as raízes.</w:t>
+      </w:r>
+    </w:p>
+    <w:p>
+      <w:pPr>
+        <w:spacing w:after="220" w:line="300"/>
+        <w:ind w:left="1418"/>
+        <w:jc w:val="right"/>
+      </w:pPr>
+      <w:r>
+        <w:rPr>
+          <w:rFonts w:ascii="Times New Roman" w:cs="Times New Roman" w:eastAsia="Times New Roman" w:hAnsi="Times New Roman"/>
+          <w:i/>
+          <w:iCs/>
+          <w:sz w:val="22"/>
+          <w:szCs w:val="22"/>
+        </w:rPr>
+        <w:t xml:space="preserve">Aos meus irmãos e cunhadas, Rinaldo e Sônia, Ricardo e Dulce, que seguem comigo na travessia.</w:t>
+      </w:r>
+    </w:p>
+    <w:p>
+      <w:pPr>
+        <w:spacing w:after="220" w:line="300"/>
+        <w:ind w:left="1418"/>
+        <w:jc w:val="right"/>
+      </w:pPr>
+      <w:r>
+        <w:rPr>
+          <w:rFonts w:ascii="Times New Roman" w:cs="Times New Roman" w:eastAsia="Times New Roman" w:hAnsi="Times New Roman"/>
+          <w:i/>
+          <w:iCs/>
+          <w:sz w:val="22"/>
+          <w:szCs w:val="22"/>
+        </w:rPr>
+        <w:t xml:space="preserve">Ao meu filho e nora, Lucas e Geovanna, à minha neta fofura Malu e à minha linda filha Júlia, a minha Lia: a luz que continua.</w:t>
+      </w:r>
+    </w:p>
+    <w:p>
+      <w:pPr>
+        <w:spacing w:after="220" w:line="300"/>
+        <w:ind w:left="1418"/>
+        <w:jc w:val="right"/>
+      </w:pPr>
+      <w:r>
+        <w:rPr>
+          <w:rFonts w:ascii="Times New Roman" w:cs="Times New Roman" w:eastAsia="Times New Roman" w:hAnsi="Times New Roman"/>
+          <w:i/>
+          <w:iCs/>
+          <w:sz w:val="22"/>
+          <w:szCs w:val="22"/>
+        </w:rPr>
+        <w:t xml:space="preserve">À Gisely, minha doce esposa, e às gêmeas Isabella e Fernanda, minhas filhas de coração, cujo apoio fez este momento chegar.</w:t>
       </w:r>
     </w:p>
     <w:p>

</xml_diff>